<commit_message>
Retrieved Product Details and Added WishList Function
</commit_message>
<xml_diff>
--- a/FinalDoc.docx
+++ b/FinalDoc.docx
@@ -205,15 +205,30 @@
           <w:b/>
           <w:sz w:val="28"/>
         </w:rPr>
-        <w:t>Mr. Kamlakar Bhopatkar</w:t>
-      </w:r>
+        <w:t xml:space="preserve">Mr. Kamlakar </w:t>
+      </w:r>
+      <w:proofErr w:type="spellStart"/>
       <w:r>
         <w:rPr>
           <w:b/>
           <w:sz w:val="28"/>
         </w:rPr>
+        <w:t>Bhopatkar</w:t>
+      </w:r>
+      <w:proofErr w:type="spellEnd"/>
+      <w:r>
+        <w:rPr>
+          <w:b/>
+          <w:sz w:val="28"/>
+        </w:rPr>
         <w:tab/>
-        <w:t>Dr. Madhavi Vaidya</w:t>
+      </w:r>
+      <w:r>
+        <w:rPr>
+          <w:b/>
+          <w:sz w:val="28"/>
+        </w:rPr>
+        <w:t xml:space="preserve">Ms. Priya Daniel </w:t>
       </w:r>
     </w:p>
     <w:p>
@@ -234,22 +249,17 @@
           <w:b/>
           <w:sz w:val="28"/>
         </w:rPr>
-        <w:tab/>
-      </w:r>
+        <w:t xml:space="preserve">Mr. Kamlakar </w:t>
+      </w:r>
+      <w:proofErr w:type="spellStart"/>
       <w:r>
         <w:rPr>
           <w:b/>
           <w:sz w:val="28"/>
         </w:rPr>
-        <w:tab/>
-      </w:r>
-      <w:r>
-        <w:rPr>
-          <w:b/>
-          <w:sz w:val="28"/>
-        </w:rPr>
-        <w:t>Mr. Kamlakar Bhopatkar</w:t>
-      </w:r>
+        <w:t>Bhopatkar</w:t>
+      </w:r>
+      <w:proofErr w:type="spellEnd"/>
     </w:p>
     <w:p>
       <w:pPr>
@@ -275,7 +285,23 @@
           <w:b/>
           <w:sz w:val="28"/>
         </w:rPr>
-        <w:t>Vikas Ramtirth Jaiswal</w:t>
+        <w:t xml:space="preserve">Vikas </w:t>
+      </w:r>
+      <w:proofErr w:type="spellStart"/>
+      <w:r>
+        <w:rPr>
+          <w:b/>
+          <w:sz w:val="28"/>
+        </w:rPr>
+        <w:t>Ramtirth</w:t>
+      </w:r>
+      <w:proofErr w:type="spellEnd"/>
+      <w:r>
+        <w:rPr>
+          <w:b/>
+          <w:sz w:val="28"/>
+        </w:rPr>
+        <w:t xml:space="preserve"> Jaiswal</w:t>
       </w:r>
     </w:p>
     <w:p>
@@ -464,7 +490,23 @@
           <w:b/>
           <w:sz w:val="28"/>
         </w:rPr>
-        <w:t xml:space="preserve">Mr. Vikas Ramtirth Jaiswal </w:t>
+        <w:t xml:space="preserve">Mr. Vikas </w:t>
+      </w:r>
+      <w:proofErr w:type="spellStart"/>
+      <w:r>
+        <w:rPr>
+          <w:b/>
+          <w:sz w:val="28"/>
+        </w:rPr>
+        <w:t>Ramtirth</w:t>
+      </w:r>
+      <w:proofErr w:type="spellEnd"/>
+      <w:r>
+        <w:rPr>
+          <w:b/>
+          <w:sz w:val="28"/>
+        </w:rPr>
+        <w:t xml:space="preserve"> Jaiswal </w:t>
       </w:r>
       <w:r>
         <w:rPr>
@@ -624,8 +666,17 @@
                 <w:b/>
                 <w:sz w:val="28"/>
               </w:rPr>
-              <w:t>Mr. Kamlakar Bhopatkar</w:t>
-            </w:r>
+              <w:t xml:space="preserve">Mr. Kamlakar </w:t>
+            </w:r>
+            <w:proofErr w:type="spellStart"/>
+            <w:r>
+              <w:rPr>
+                <w:b/>
+                <w:sz w:val="28"/>
+              </w:rPr>
+              <w:t>Bhopatkar</w:t>
+            </w:r>
+            <w:proofErr w:type="spellEnd"/>
           </w:p>
           <w:p>
             <w:pPr>
@@ -661,8 +712,17 @@
                 <w:b/>
                 <w:sz w:val="28"/>
               </w:rPr>
-              <w:t>Mr. Kamlakar Bhopatkar</w:t>
-            </w:r>
+              <w:t xml:space="preserve">Mr. Kamlakar </w:t>
+            </w:r>
+            <w:proofErr w:type="spellStart"/>
+            <w:r>
+              <w:rPr>
+                <w:b/>
+                <w:sz w:val="28"/>
+              </w:rPr>
+              <w:t>Bhopatkar</w:t>
+            </w:r>
+            <w:proofErr w:type="spellEnd"/>
           </w:p>
           <w:p>
             <w:pPr>
@@ -674,7 +734,7 @@
                 <w:b/>
                 <w:sz w:val="28"/>
               </w:rPr>
-              <w:t>Dr. Madhavi Vaidya</w:t>
+              <w:t>Ms. Priya Daniel</w:t>
             </w:r>
           </w:p>
         </w:tc>
@@ -847,7 +907,25 @@
           <w:sz w:val="26"/>
           <w:szCs w:val="26"/>
         </w:rPr>
-        <w:t>Principal Dr. Anita Kanwar</w:t>
+        <w:t xml:space="preserve">Principal </w:t>
+      </w:r>
+      <w:proofErr w:type="spellStart"/>
+      <w:r>
+        <w:rPr>
+          <w:b/>
+          <w:sz w:val="26"/>
+          <w:szCs w:val="26"/>
+        </w:rPr>
+        <w:t>Dr.</w:t>
+      </w:r>
+      <w:proofErr w:type="spellEnd"/>
+      <w:r>
+        <w:rPr>
+          <w:b/>
+          <w:sz w:val="26"/>
+          <w:szCs w:val="26"/>
+        </w:rPr>
+        <w:t xml:space="preserve"> Anita Kanwar</w:t>
       </w:r>
     </w:p>
     <w:p>
@@ -884,7 +962,41 @@
           <w:sz w:val="26"/>
           <w:szCs w:val="26"/>
         </w:rPr>
-        <w:t xml:space="preserve">Mr. Kamlakar Bhopatkar and Dr. Madhavi Vaidya </w:t>
+        <w:t xml:space="preserve">Mr. Kamlakar </w:t>
+      </w:r>
+      <w:proofErr w:type="spellStart"/>
+      <w:r>
+        <w:rPr>
+          <w:b/>
+          <w:sz w:val="26"/>
+          <w:szCs w:val="26"/>
+        </w:rPr>
+        <w:t>Bhopatkar</w:t>
+      </w:r>
+      <w:proofErr w:type="spellEnd"/>
+      <w:r>
+        <w:rPr>
+          <w:b/>
+          <w:sz w:val="26"/>
+          <w:szCs w:val="26"/>
+        </w:rPr>
+        <w:t xml:space="preserve"> and </w:t>
+      </w:r>
+      <w:r>
+        <w:rPr>
+          <w:b/>
+          <w:sz w:val="26"/>
+          <w:szCs w:val="26"/>
+        </w:rPr>
+        <w:t>Ms. Priya Daniel</w:t>
+      </w:r>
+      <w:r>
+        <w:rPr>
+          <w:b/>
+          <w:sz w:val="26"/>
+          <w:szCs w:val="26"/>
+        </w:rPr>
+        <w:t xml:space="preserve"> </w:t>
       </w:r>
       <w:r>
         <w:rPr>
@@ -2770,17 +2882,118 @@
     <w:p>
       <w:pPr>
         <w:ind w:left="10"/>
-        <w:rPr>
-          <w:szCs w:val="24"/>
-        </w:rPr>
+        <w:jc w:val="both"/>
       </w:pPr>
       <w:r>
         <w:rPr>
           <w:szCs w:val="24"/>
         </w:rPr>
         <w:tab/>
-        <w:t>Automobile garages are one of the best companions for the drivers on roads for vehicle repair purposes. It helps drivers to repair their vehicles depending upon the vehicle type whether it is a 4-Wheeler, 3-Wheeler, 2-Wheeler or an Electric Vehicle. Some Automobile garages not only repair vehicles of different types but also sell various vehicle spares parts and increasing their business. While there are various ways to find automobile garages, Google Maps has emerged as a popular choice among drivers. With its extensive database and user-friendly interface, drivers can easily locate nearby auto garages and make informed decisions based on ratings and reviews. GoMechanic is also a good option for on-road vehicle repair services. As the number of vehicles on road are increasing day-by-day, the requirements for finding relevant automobile garages are also increasing.</w:t>
-      </w:r>
+      </w:r>
+      <w:r>
+        <w:t>The Furniture industry stands as a sector that helps people by enhancing their experience and interaction with their living areas and workspaces. It provides a wide variety of products for residential spaces like living room, drawing room, bedroom, etc. Beyond our homes, commercial sectors like hotels, offices, educational institutions, etc. also uses wide range of furniture products. In this industry, the main focus is to provide end-users with an ergonomic design, durable, customizable furniture product which is space optimized and is available in suitable price range. Offline retail stores</w:t>
+      </w:r>
+      <w:r>
+        <w:t xml:space="preserve"> are designed to showcase furniture</w:t>
+      </w:r>
+      <w:r>
+        <w:t xml:space="preserve"> products</w:t>
+      </w:r>
+      <w:r>
+        <w:t xml:space="preserve"> allowing </w:t>
+      </w:r>
+      <w:r>
+        <w:t>consumers</w:t>
+      </w:r>
+      <w:r>
+        <w:t xml:space="preserve"> to see, touch, and experience the products before making a purchase. The</w:t>
+      </w:r>
+      <w:r>
+        <w:t xml:space="preserve">se stores </w:t>
+      </w:r>
+      <w:r>
+        <w:t xml:space="preserve">are </w:t>
+      </w:r>
+      <w:r>
+        <w:t>designed to</w:t>
+      </w:r>
+      <w:r>
+        <w:t xml:space="preserve"> enhance the overall shopping experience, providing a personalized touch that </w:t>
+      </w:r>
+      <w:r>
+        <w:t>online</w:t>
+      </w:r>
+      <w:r>
+        <w:t xml:space="preserve"> platforms often struggle to replicate.</w:t>
+      </w:r>
+      <w:r>
+        <w:t xml:space="preserve"> Although, the rise of e-commerce has revolutionized the way of selling offline furniture products in retail shop. Online Platforms offers end-users the convenience of browsing, selecting, filtering and purchasing furniture from their homes itself. Product images, videos, detailed descriptions which enhances the experience of end-users making a significant improvement in customer engagement.</w:t>
+      </w:r>
+      <w:r>
+        <w:t xml:space="preserve"> </w:t>
+      </w:r>
+      <w:r>
+        <w:t>T</w:t>
+      </w:r>
+      <w:r>
+        <w:t xml:space="preserve">he challenge arises when users struggle to visualize how the furniture will </w:t>
+      </w:r>
+      <w:r>
+        <w:t xml:space="preserve">look and </w:t>
+      </w:r>
+      <w:r>
+        <w:t xml:space="preserve">fit </w:t>
+      </w:r>
+      <w:r>
+        <w:t>for</w:t>
+      </w:r>
+      <w:r>
+        <w:t xml:space="preserve"> their specific spaces</w:t>
+      </w:r>
+      <w:r>
+        <w:t xml:space="preserve">. Applications like Ikea Place, Amazon, Wayfair, Houzz, etc. are various online platforms that offers </w:t>
+      </w:r>
+      <w:r>
+        <w:t>augmented reality (AR) features</w:t>
+      </w:r>
+      <w:r>
+        <w:t xml:space="preserve"> that</w:t>
+      </w:r>
+      <w:r>
+        <w:t xml:space="preserve"> allow</w:t>
+      </w:r>
+      <w:r>
+        <w:t>s</w:t>
+      </w:r>
+      <w:r>
+        <w:t xml:space="preserve"> users to virtually place furniture in their homes </w:t>
+      </w:r>
+      <w:r>
+        <w:t xml:space="preserve">or other specific places </w:t>
+      </w:r>
+      <w:r>
+        <w:t xml:space="preserve">before </w:t>
+      </w:r>
+      <w:r>
+        <w:t xml:space="preserve">making a </w:t>
+      </w:r>
+      <w:r>
+        <w:t xml:space="preserve">purchase, enhancing the online shopping experience by providing a realistic preview of how </w:t>
+      </w:r>
+      <w:r>
+        <w:t>product</w:t>
+      </w:r>
+      <w:r>
+        <w:t>s will look in real-world settings.</w:t>
+      </w:r>
+    </w:p>
+    <w:p>
+      <w:pPr>
+        <w:ind w:left="10"/>
+        <w:rPr>
+          <w:szCs w:val="24"/>
+        </w:rPr>
+      </w:pPr>
     </w:p>
     <w:p>
       <w:pPr>
@@ -2824,15 +3037,15 @@
         <w:pStyle w:val="ListParagraph"/>
         <w:numPr>
           <w:ilvl w:val="0"/>
-          <w:numId w:val="2"/>
+          <w:numId w:val="19"/>
         </w:numPr>
-        <w:spacing w:line="276" w:lineRule="auto"/>
+        <w:spacing w:after="0" w:line="276" w:lineRule="auto"/>
+        <w:ind w:left="370"/>
+        <w:jc w:val="both"/>
         <w:rPr>
           <w:rFonts w:ascii="Times New Roman" w:hAnsi="Times New Roman" w:cs="Times New Roman"/>
           <w:b/>
           <w:bCs/>
-          <w:sz w:val="24"/>
-          <w:szCs w:val="24"/>
         </w:rPr>
       </w:pPr>
       <w:r>
@@ -2840,88 +3053,137 @@
           <w:rFonts w:ascii="Times New Roman" w:hAnsi="Times New Roman" w:cs="Times New Roman"/>
           <w:b/>
           <w:bCs/>
-          <w:sz w:val="24"/>
-          <w:szCs w:val="24"/>
-        </w:rPr>
-        <w:t>Google Maps:</w:t>
-      </w:r>
-    </w:p>
-    <w:p>
-      <w:pPr>
-        <w:ind w:left="-10" w:firstLine="730"/>
-        <w:rPr>
-          <w:szCs w:val="24"/>
-        </w:rPr>
-      </w:pPr>
-      <w:r>
-        <w:rPr>
-          <w:szCs w:val="24"/>
-        </w:rPr>
-        <w:t xml:space="preserve">Google Maps is an integral part of the modern navigation ecosystem used by almost everyone. The existing system Google Maps is a widely popular mapping service that helps users with directions, navigation, location information and various other points of interest including auto garages. </w:t>
+        </w:rPr>
+        <w:t>IKEA Place:</w:t>
       </w:r>
     </w:p>
     <w:p>
       <w:pPr>
         <w:pStyle w:val="ListParagraph"/>
-        <w:ind w:firstLine="720"/>
+        <w:spacing w:after="0" w:line="276" w:lineRule="auto"/>
+        <w:ind w:left="370" w:firstLine="720"/>
+        <w:jc w:val="both"/>
         <w:rPr>
           <w:rFonts w:ascii="Times New Roman" w:hAnsi="Times New Roman" w:cs="Times New Roman"/>
-          <w:sz w:val="24"/>
-          <w:szCs w:val="24"/>
-        </w:rPr>
-      </w:pPr>
-    </w:p>
-    <w:p>
-      <w:pPr>
-        <w:ind w:left="10" w:firstLine="710"/>
-        <w:rPr>
-          <w:szCs w:val="24"/>
-        </w:rPr>
-      </w:pPr>
-      <w:r>
-        <w:rPr>
-          <w:szCs w:val="24"/>
-        </w:rPr>
-        <w:lastRenderedPageBreak/>
-        <w:t>Google Maps primarily relies on user-generated data and business listings to display auto garages. Auto garage owners can create their garage profile by creating their business email id and registering their garage on the Google Maps. Information like name of the garage, address, contact details, operating hours and images can be added to their Google Maps profile. The Information present on Google Maps can be used by users for searching the relevant auto garage. When a user searches for an auto garage, it displays various nearby auto garages and depending on the user’s desire, he or she can contact that garage or can directly get directions for that particular garage and can get their vehicles repaired. After a successful repair, the vehicle owner can submit a rating and review for the auto garage which will be publicly shared with the other users using Google Maps. Currently, most of the automobile garage owners have their garages registered on the Google Maps service which helps users to find garages in almost every state of India.</w:t>
-      </w:r>
-    </w:p>
-    <w:p>
-      <w:pPr>
-        <w:ind w:left="10" w:firstLine="710"/>
-        <w:rPr>
-          <w:szCs w:val="24"/>
-        </w:rPr>
-      </w:pPr>
-    </w:p>
-    <w:p>
-      <w:pPr>
-        <w:pStyle w:val="ListParagraph"/>
-        <w:ind w:left="10" w:firstLine="710"/>
+        </w:rPr>
+      </w:pPr>
+      <w:r>
         <w:rPr>
           <w:rFonts w:ascii="Times New Roman" w:hAnsi="Times New Roman" w:cs="Times New Roman"/>
-          <w:sz w:val="24"/>
-          <w:szCs w:val="24"/>
-        </w:rPr>
-      </w:pPr>
+        </w:rPr>
+        <w:t>IKEA Place is an innovative augmented reality</w:t>
+      </w:r>
       <w:r>
         <w:rPr>
           <w:rFonts w:ascii="Times New Roman" w:hAnsi="Times New Roman" w:cs="Times New Roman"/>
-          <w:sz w:val="24"/>
-          <w:szCs w:val="24"/>
-        </w:rPr>
-        <w:t>Overall, Google Maps service uses internet and it helps users finding their relevant nearby automobile garages and get their vehicle repaired. It helps users by giving them the contact details and the best routes to reach the garage. Once the vehicle repair is completed, users have the option to submit a rating and review for the auto garage on Google Maps. These reviews provide valuable feedback to other users, helping them make informed decisions when selecting a garage.</w:t>
-      </w:r>
-    </w:p>
-    <w:p>
-      <w:pPr>
-        <w:pStyle w:val="ListParagraph"/>
-        <w:ind w:left="370"/>
-        <w:rPr>
-          <w:b/>
-          <w:bCs/>
-          <w:szCs w:val="24"/>
-        </w:rPr>
+        </w:rPr>
+        <w:t xml:space="preserve"> (AR)</w:t>
+      </w:r>
+      <w:r>
+        <w:rPr>
+          <w:rFonts w:ascii="Times New Roman" w:hAnsi="Times New Roman" w:cs="Times New Roman"/>
+        </w:rPr>
+        <w:t xml:space="preserve"> app by IKEA</w:t>
+      </w:r>
+      <w:r>
+        <w:rPr>
+          <w:rFonts w:ascii="Times New Roman" w:hAnsi="Times New Roman" w:cs="Times New Roman"/>
+        </w:rPr>
+        <w:t xml:space="preserve"> that </w:t>
+      </w:r>
+      <w:r>
+        <w:rPr>
+          <w:rFonts w:ascii="Times New Roman" w:hAnsi="Times New Roman" w:cs="Times New Roman"/>
+        </w:rPr>
+        <w:t>allow</w:t>
+      </w:r>
+      <w:r>
+        <w:rPr>
+          <w:rFonts w:ascii="Times New Roman" w:hAnsi="Times New Roman" w:cs="Times New Roman"/>
+        </w:rPr>
+        <w:t>s</w:t>
+      </w:r>
+      <w:r>
+        <w:rPr>
+          <w:rFonts w:ascii="Times New Roman" w:hAnsi="Times New Roman" w:cs="Times New Roman"/>
+        </w:rPr>
+        <w:t xml:space="preserve"> users to virtually position and visualize furniture in their homes before purchasing. Leveraging AR technology, the app uses a device's camera to create a real-time view of a room, enabling users to select and place virtual IKEA </w:t>
+      </w:r>
+      <w:r>
+        <w:rPr>
+          <w:rFonts w:ascii="Times New Roman" w:hAnsi="Times New Roman" w:cs="Times New Roman"/>
+        </w:rPr>
+        <w:t xml:space="preserve">furniture </w:t>
+      </w:r>
+      <w:r>
+        <w:rPr>
+          <w:rFonts w:ascii="Times New Roman" w:hAnsi="Times New Roman" w:cs="Times New Roman"/>
+        </w:rPr>
+        <w:t>products seamlessly.</w:t>
+      </w:r>
+      <w:r>
+        <w:rPr>
+          <w:rFonts w:ascii="Times New Roman" w:hAnsi="Times New Roman" w:cs="Times New Roman"/>
+        </w:rPr>
+        <w:t xml:space="preserve"> </w:t>
+      </w:r>
+      <w:r>
+        <w:rPr>
+          <w:rFonts w:ascii="Times New Roman" w:hAnsi="Times New Roman" w:cs="Times New Roman"/>
+        </w:rPr>
+        <w:t xml:space="preserve">The app uses lighting, space, </w:t>
+      </w:r>
+      <w:r>
+        <w:rPr>
+          <w:rFonts w:ascii="Times New Roman" w:hAnsi="Times New Roman" w:cs="Times New Roman"/>
+        </w:rPr>
+        <w:t xml:space="preserve">etc. </w:t>
+      </w:r>
+      <w:r>
+        <w:rPr>
+          <w:rFonts w:ascii="Times New Roman" w:hAnsi="Times New Roman" w:cs="Times New Roman"/>
+        </w:rPr>
+        <w:t>to create an accurate image of a product in the user's space. This allows users to see if the product fits their space, style, and purpose.</w:t>
+      </w:r>
+      <w:r>
+        <w:rPr>
+          <w:rFonts w:ascii="Times New Roman" w:hAnsi="Times New Roman" w:cs="Times New Roman"/>
+        </w:rPr>
+        <w:t xml:space="preserve"> </w:t>
+      </w:r>
+      <w:r>
+        <w:rPr>
+          <w:rFonts w:ascii="Times New Roman" w:hAnsi="Times New Roman" w:cs="Times New Roman"/>
+        </w:rPr>
+        <w:t>In addition to digitally placing IKEA products in a room, the app allows people to capture the setting in the app and share as an image or video with friends.</w:t>
+      </w:r>
+      <w:r>
+        <w:t xml:space="preserve"> </w:t>
+      </w:r>
+      <w:r>
+        <w:rPr>
+          <w:rFonts w:ascii="Times New Roman" w:hAnsi="Times New Roman" w:cs="Times New Roman"/>
+        </w:rPr>
+        <w:t>They can also walk around the furniture to see it as if it were there.</w:t>
+      </w:r>
+      <w:r>
+        <w:rPr>
+          <w:rFonts w:ascii="Times New Roman" w:hAnsi="Times New Roman" w:cs="Times New Roman"/>
+        </w:rPr>
+        <w:t xml:space="preserve"> </w:t>
+      </w:r>
+      <w:r>
+        <w:rPr>
+          <w:rFonts w:ascii="Times New Roman" w:hAnsi="Times New Roman" w:cs="Times New Roman"/>
+        </w:rPr>
+        <w:t>IKEA is opening a world of furnishing possibilities to millions of Android users around the world, allowing more people to see how a great piece of furniture might amp up their space. IKEA Place lets users confidently experiment, experience and “place” 3D representations of more than 3,200 IKEA products into their space to ensure that they are just the right size and design. From sofas and lighting to beds and wardrobes. IKEA Place is now available on Android for all AR Core compatible devices.</w:t>
+      </w:r>
+    </w:p>
+    <w:p>
+      <w:pPr>
+        <w:spacing w:after="0" w:line="276" w:lineRule="auto"/>
+        <w:ind w:left="380"/>
+        <w:jc w:val="both"/>
       </w:pPr>
     </w:p>
     <w:p>
@@ -2929,15 +3191,15 @@
         <w:pStyle w:val="ListParagraph"/>
         <w:numPr>
           <w:ilvl w:val="0"/>
-          <w:numId w:val="2"/>
+          <w:numId w:val="19"/>
         </w:numPr>
-        <w:spacing w:line="360" w:lineRule="auto"/>
+        <w:spacing w:after="0" w:line="276" w:lineRule="auto"/>
+        <w:ind w:left="370"/>
+        <w:jc w:val="both"/>
         <w:rPr>
           <w:rFonts w:ascii="Times New Roman" w:hAnsi="Times New Roman" w:cs="Times New Roman"/>
           <w:b/>
           <w:bCs/>
-          <w:sz w:val="24"/>
-          <w:szCs w:val="24"/>
         </w:rPr>
       </w:pPr>
       <w:r>
@@ -2945,10 +3207,79 @@
           <w:rFonts w:ascii="Times New Roman" w:hAnsi="Times New Roman" w:cs="Times New Roman"/>
           <w:b/>
           <w:bCs/>
-          <w:sz w:val="24"/>
-          <w:szCs w:val="24"/>
-        </w:rPr>
-        <w:t xml:space="preserve">GoMechanic: </w:t>
+        </w:rPr>
+        <w:t>Houzz:</w:t>
+      </w:r>
+    </w:p>
+    <w:p>
+      <w:pPr>
+        <w:pStyle w:val="ListParagraph"/>
+        <w:spacing w:after="0" w:line="276" w:lineRule="auto"/>
+        <w:ind w:left="370" w:firstLine="720"/>
+        <w:jc w:val="both"/>
+        <w:rPr>
+          <w:rFonts w:ascii="Times New Roman" w:hAnsi="Times New Roman" w:cs="Times New Roman"/>
+        </w:rPr>
+      </w:pPr>
+      <w:r>
+        <w:rPr>
+          <w:rFonts w:ascii="Times New Roman" w:hAnsi="Times New Roman" w:cs="Times New Roman"/>
+        </w:rPr>
+        <w:t>Houzz is also an American website, online community, and software for architecture, interior design, decorating, landscape design, and home improvement.</w:t>
+      </w:r>
+      <w:r>
+        <w:rPr>
+          <w:rFonts w:ascii="Times New Roman" w:hAnsi="Times New Roman" w:cs="Times New Roman"/>
+        </w:rPr>
+        <w:t xml:space="preserve"> </w:t>
+      </w:r>
+      <w:r>
+        <w:rPr>
+          <w:rFonts w:ascii="Times New Roman" w:hAnsi="Times New Roman" w:cs="Times New Roman"/>
+        </w:rPr>
+        <w:t>The app's commitment to enhancing user experience extends to its 3D visualization capabilities. Users can experiment with different design ideas and product placements, virtually visualizing how these elements would integrate into their own living spaces.</w:t>
+      </w:r>
+      <w:r>
+        <w:rPr>
+          <w:rFonts w:ascii="Times New Roman" w:hAnsi="Times New Roman" w:cs="Times New Roman"/>
+        </w:rPr>
+        <w:t xml:space="preserve"> </w:t>
+      </w:r>
+      <w:r>
+        <w:rPr>
+          <w:rFonts w:ascii="Times New Roman" w:hAnsi="Times New Roman" w:cs="Times New Roman"/>
+        </w:rPr>
+        <w:t>T</w:t>
+      </w:r>
+      <w:r>
+        <w:rPr>
+          <w:rFonts w:ascii="Times New Roman" w:hAnsi="Times New Roman" w:cs="Times New Roman"/>
+        </w:rPr>
+        <w:t>he Houzz app serves as a comprehensive marketplace for home products. Users can discover and purchase furniture, decor items, and other essentials directly through the app, facilitating a seamless transition from design concept to implementation.</w:t>
+      </w:r>
+      <w:r>
+        <w:rPr>
+          <w:rFonts w:ascii="Times New Roman" w:hAnsi="Times New Roman" w:cs="Times New Roman"/>
+        </w:rPr>
+        <w:t xml:space="preserve"> </w:t>
+      </w:r>
+      <w:r>
+        <w:rPr>
+          <w:rFonts w:ascii="Times New Roman" w:hAnsi="Times New Roman" w:cs="Times New Roman"/>
+        </w:rPr>
+        <w:t>One of Houzz's standout features is its ability to connect users with a diverse array of home improvement professionals. Whether seeking an architect, interior designer, or contractor, users can browse through portfolios and hire professionals directly through the platform.</w:t>
+      </w:r>
+      <w:r>
+        <w:rPr>
+          <w:rFonts w:ascii="Times New Roman" w:hAnsi="Times New Roman" w:cs="Times New Roman"/>
+        </w:rPr>
+        <w:t xml:space="preserve"> </w:t>
+      </w:r>
+      <w:r>
+        <w:rPr>
+          <w:rFonts w:ascii="Times New Roman" w:hAnsi="Times New Roman" w:cs="Times New Roman"/>
+        </w:rPr>
+        <w:t>The app's commitment to enhancing user experience extends to its 3D visualization capabilities. Users can experiment with different design ideas and product placements, virtually visualizing how these elements would integrate into their own living spaces.</w:t>
       </w:r>
     </w:p>
     <w:p>
@@ -2961,41 +3292,6 @@
           <w:szCs w:val="24"/>
         </w:rPr>
       </w:pPr>
-      <w:r>
-        <w:rPr>
-          <w:rFonts w:ascii="Times New Roman" w:hAnsi="Times New Roman" w:cs="Times New Roman"/>
-          <w:sz w:val="24"/>
-          <w:szCs w:val="24"/>
-        </w:rPr>
-        <w:t xml:space="preserve">GoMechanic is a service-based application that helps users to get their vehicles repaired by providing </w:t>
-      </w:r>
-      <w:r>
-        <w:rPr>
-          <w:rFonts w:ascii="Times New Roman" w:hAnsi="Times New Roman" w:cs="Times New Roman"/>
-          <w:sz w:val="24"/>
-          <w:szCs w:val="24"/>
-        </w:rPr>
-        <w:t>an</w:t>
-      </w:r>
-      <w:r>
-        <w:rPr>
-          <w:rFonts w:ascii="Times New Roman" w:hAnsi="Times New Roman" w:cs="Times New Roman"/>
-          <w:sz w:val="24"/>
-          <w:szCs w:val="24"/>
-        </w:rPr>
-        <w:t xml:space="preserve"> on-road service. It has their own mechanics and towing services which can be called for service through their application itself as per the requirements. It also provides various vehicle spares parts that user can purchase for their vehicle. Currently, GoMechanic is providing services in almost every state of India. They are also providing their services have in Malaysia also. This widespread availability ensures that users can access their on-road repair services regardless of their location within the country. They also provide various care packages for vehicles which is subscription-based package for the safety of your vehicle. These subscription-based packages provide users with added convenience and peace of mind by including regular maintenance, inspections, and other safety measures for their vehicles. By opting for these care packages, users can ensure the optimal functioning for their vehicles making convenient for them to request assistance.</w:t>
-      </w:r>
-    </w:p>
-    <w:p>
-      <w:pPr>
-        <w:pStyle w:val="ListParagraph"/>
-        <w:ind w:left="0" w:firstLine="370"/>
-        <w:rPr>
-          <w:rFonts w:ascii="Times New Roman" w:hAnsi="Times New Roman" w:cs="Times New Roman"/>
-          <w:sz w:val="24"/>
-          <w:szCs w:val="24"/>
-        </w:rPr>
-      </w:pPr>
     </w:p>
     <w:p>
       <w:pPr>
@@ -3019,19 +3315,18 @@
     </w:p>
     <w:p>
       <w:pPr>
-        <w:ind w:left="0" w:firstLine="0"/>
-        <w:rPr>
-          <w:b/>
-          <w:bCs/>
-          <w:sz w:val="28"/>
-          <w:szCs w:val="28"/>
-        </w:rPr>
-      </w:pPr>
-      <w:r>
-        <w:rPr>
-          <w:szCs w:val="24"/>
-        </w:rPr>
-        <w:t>Addressing these limitations is crucial to provide users with a more enhanced and efficient system like "Garage Finder Pro"</w:t>
+        <w:spacing w:after="0"/>
+        <w:ind w:left="10"/>
+        <w:jc w:val="both"/>
+        <w:rPr>
+          <w:szCs w:val="24"/>
+        </w:rPr>
+      </w:pPr>
+      <w:r>
+        <w:rPr>
+          <w:szCs w:val="24"/>
+        </w:rPr>
+        <w:t>Addressing these limitations is crucial to provide users with a more enhanced and efficient system like "Real Furniture"</w:t>
       </w:r>
     </w:p>
     <w:p>
@@ -3039,21 +3334,21 @@
         <w:pStyle w:val="ListParagraph"/>
         <w:numPr>
           <w:ilvl w:val="0"/>
-          <w:numId w:val="2"/>
+          <w:numId w:val="19"/>
         </w:numPr>
+        <w:ind w:left="360"/>
+        <w:jc w:val="both"/>
         <w:rPr>
           <w:rFonts w:ascii="Times New Roman" w:hAnsi="Times New Roman" w:cs="Times New Roman"/>
-          <w:sz w:val="24"/>
           <w:szCs w:val="24"/>
         </w:rPr>
       </w:pPr>
       <w:r>
         <w:rPr>
           <w:rFonts w:ascii="Times New Roman" w:hAnsi="Times New Roman" w:cs="Times New Roman"/>
-          <w:sz w:val="24"/>
-          <w:szCs w:val="24"/>
-        </w:rPr>
-        <w:t>Lack of specific information about the repair capabilities of each garage.</w:t>
+          <w:szCs w:val="24"/>
+        </w:rPr>
+        <w:t>Lack of specific product information like availability, reviews and furniture dimensions.</w:t>
       </w:r>
     </w:p>
     <w:p>
@@ -3061,21 +3356,21 @@
         <w:pStyle w:val="ListParagraph"/>
         <w:numPr>
           <w:ilvl w:val="0"/>
-          <w:numId w:val="2"/>
+          <w:numId w:val="19"/>
         </w:numPr>
+        <w:ind w:left="360"/>
+        <w:jc w:val="both"/>
         <w:rPr>
           <w:rFonts w:ascii="Times New Roman" w:hAnsi="Times New Roman" w:cs="Times New Roman"/>
-          <w:sz w:val="24"/>
           <w:szCs w:val="24"/>
         </w:rPr>
       </w:pPr>
       <w:r>
         <w:rPr>
           <w:rFonts w:ascii="Times New Roman" w:hAnsi="Times New Roman" w:cs="Times New Roman"/>
-          <w:sz w:val="24"/>
-          <w:szCs w:val="24"/>
-        </w:rPr>
-        <w:t>Incomplete garage profiles with limited details about services offered and pricing information.</w:t>
+          <w:szCs w:val="24"/>
+        </w:rPr>
+        <w:t>Limited to specific brand products and thereby providing less options for users.</w:t>
       </w:r>
     </w:p>
     <w:p>
@@ -3083,21 +3378,21 @@
         <w:pStyle w:val="ListParagraph"/>
         <w:numPr>
           <w:ilvl w:val="0"/>
-          <w:numId w:val="2"/>
+          <w:numId w:val="19"/>
         </w:numPr>
+        <w:ind w:left="360"/>
+        <w:jc w:val="both"/>
         <w:rPr>
           <w:rFonts w:ascii="Times New Roman" w:hAnsi="Times New Roman" w:cs="Times New Roman"/>
-          <w:sz w:val="24"/>
           <w:szCs w:val="24"/>
         </w:rPr>
       </w:pPr>
       <w:r>
         <w:rPr>
           <w:rFonts w:ascii="Times New Roman" w:hAnsi="Times New Roman" w:cs="Times New Roman"/>
-          <w:sz w:val="24"/>
-          <w:szCs w:val="24"/>
-        </w:rPr>
-        <w:t>Difficulty in finding garages for specific vehicle types (4-wheelers, 3-wheelers, 2-wheelers, electric vehicles).</w:t>
+          <w:szCs w:val="24"/>
+        </w:rPr>
+        <w:t>Only few products have AR view or a 3-Dimensional view of product.</w:t>
       </w:r>
     </w:p>
     <w:p>
@@ -3105,22 +3400,21 @@
         <w:pStyle w:val="ListParagraph"/>
         <w:numPr>
           <w:ilvl w:val="0"/>
-          <w:numId w:val="2"/>
+          <w:numId w:val="19"/>
         </w:numPr>
+        <w:ind w:left="360"/>
+        <w:jc w:val="both"/>
         <w:rPr>
           <w:rFonts w:ascii="Times New Roman" w:hAnsi="Times New Roman" w:cs="Times New Roman"/>
-          <w:sz w:val="24"/>
           <w:szCs w:val="24"/>
         </w:rPr>
       </w:pPr>
       <w:r>
         <w:rPr>
           <w:rFonts w:ascii="Times New Roman" w:hAnsi="Times New Roman" w:cs="Times New Roman"/>
-          <w:sz w:val="24"/>
-          <w:szCs w:val="24"/>
-        </w:rPr>
-        <w:lastRenderedPageBreak/>
-        <w:t>Insufficient information about the expertise of mechanics and availability of parts or equipment.</w:t>
+          <w:szCs w:val="24"/>
+        </w:rPr>
+        <w:t>Difficulty in tracking progress of delivery after the purchase of product.</w:t>
       </w:r>
     </w:p>
     <w:p>
@@ -3128,21 +3422,35 @@
         <w:pStyle w:val="ListParagraph"/>
         <w:numPr>
           <w:ilvl w:val="0"/>
-          <w:numId w:val="2"/>
+          <w:numId w:val="19"/>
         </w:numPr>
+        <w:ind w:left="360"/>
+        <w:jc w:val="both"/>
         <w:rPr>
           <w:rFonts w:ascii="Times New Roman" w:hAnsi="Times New Roman" w:cs="Times New Roman"/>
-          <w:sz w:val="24"/>
           <w:szCs w:val="24"/>
         </w:rPr>
       </w:pPr>
       <w:r>
         <w:rPr>
           <w:rFonts w:ascii="Times New Roman" w:hAnsi="Times New Roman" w:cs="Times New Roman"/>
-          <w:sz w:val="24"/>
-          <w:szCs w:val="24"/>
-        </w:rPr>
-        <w:t>Challenges in assessing the suitability and quality of a garage based on available information.</w:t>
+          <w:szCs w:val="24"/>
+        </w:rPr>
+        <w:t xml:space="preserve">Insufficient information about </w:t>
+      </w:r>
+      <w:r>
+        <w:rPr>
+          <w:rFonts w:ascii="Times New Roman" w:hAnsi="Times New Roman" w:cs="Times New Roman"/>
+          <w:szCs w:val="24"/>
+        </w:rPr>
+        <w:t>materials used, eco-friendly practices, and certifications</w:t>
+      </w:r>
+      <w:r>
+        <w:rPr>
+          <w:rFonts w:ascii="Times New Roman" w:hAnsi="Times New Roman" w:cs="Times New Roman"/>
+          <w:szCs w:val="24"/>
+        </w:rPr>
+        <w:t xml:space="preserve"> can lead to a smaller number of users.</w:t>
       </w:r>
     </w:p>
     <w:p>
@@ -3150,21 +3458,63 @@
         <w:pStyle w:val="ListParagraph"/>
         <w:numPr>
           <w:ilvl w:val="0"/>
-          <w:numId w:val="2"/>
+          <w:numId w:val="19"/>
         </w:numPr>
+        <w:ind w:left="360"/>
+        <w:jc w:val="both"/>
         <w:rPr>
           <w:rFonts w:ascii="Times New Roman" w:hAnsi="Times New Roman" w:cs="Times New Roman"/>
-          <w:sz w:val="24"/>
           <w:szCs w:val="24"/>
         </w:rPr>
       </w:pPr>
       <w:r>
         <w:rPr>
           <w:rFonts w:ascii="Times New Roman" w:hAnsi="Times New Roman" w:cs="Times New Roman"/>
-          <w:sz w:val="24"/>
-          <w:szCs w:val="24"/>
-        </w:rPr>
-        <w:t>Limited insights and analytics for both garage owners and users.</w:t>
+          <w:szCs w:val="24"/>
+        </w:rPr>
+        <w:t>No available features for users to</w:t>
+      </w:r>
+      <w:r>
+        <w:rPr>
+          <w:rFonts w:ascii="Times New Roman" w:hAnsi="Times New Roman" w:cs="Times New Roman"/>
+          <w:szCs w:val="24"/>
+        </w:rPr>
+        <w:t xml:space="preserve"> share their favo</w:t>
+      </w:r>
+      <w:r>
+        <w:rPr>
+          <w:rFonts w:ascii="Times New Roman" w:hAnsi="Times New Roman" w:cs="Times New Roman"/>
+          <w:szCs w:val="24"/>
+        </w:rPr>
+        <w:t>u</w:t>
+      </w:r>
+      <w:r>
+        <w:rPr>
+          <w:rFonts w:ascii="Times New Roman" w:hAnsi="Times New Roman" w:cs="Times New Roman"/>
+          <w:szCs w:val="24"/>
+        </w:rPr>
+        <w:t xml:space="preserve">rite furniture items, </w:t>
+      </w:r>
+      <w:r>
+        <w:rPr>
+          <w:rFonts w:ascii="Times New Roman" w:hAnsi="Times New Roman" w:cs="Times New Roman"/>
+          <w:szCs w:val="24"/>
+        </w:rPr>
+        <w:t>products</w:t>
+      </w:r>
+      <w:r>
+        <w:rPr>
+          <w:rFonts w:ascii="Times New Roman" w:hAnsi="Times New Roman" w:cs="Times New Roman"/>
+          <w:szCs w:val="24"/>
+        </w:rPr>
+        <w:t>, or reviews on social media platforms</w:t>
+      </w:r>
+      <w:r>
+        <w:rPr>
+          <w:rFonts w:ascii="Times New Roman" w:hAnsi="Times New Roman" w:cs="Times New Roman"/>
+          <w:szCs w:val="24"/>
+        </w:rPr>
+        <w:t>.</w:t>
       </w:r>
     </w:p>
     <w:p>
@@ -3172,21 +3522,22 @@
         <w:pStyle w:val="ListParagraph"/>
         <w:numPr>
           <w:ilvl w:val="0"/>
-          <w:numId w:val="2"/>
+          <w:numId w:val="19"/>
         </w:numPr>
+        <w:ind w:left="360"/>
+        <w:jc w:val="both"/>
         <w:rPr>
           <w:rFonts w:ascii="Times New Roman" w:hAnsi="Times New Roman" w:cs="Times New Roman"/>
-          <w:sz w:val="24"/>
           <w:szCs w:val="24"/>
         </w:rPr>
       </w:pPr>
       <w:r>
         <w:rPr>
           <w:rFonts w:ascii="Times New Roman" w:hAnsi="Times New Roman" w:cs="Times New Roman"/>
-          <w:sz w:val="24"/>
-          <w:szCs w:val="24"/>
-        </w:rPr>
-        <w:t>Inefficiency and inconvenience in tracking the progress and status of job cards.</w:t>
+          <w:szCs w:val="24"/>
+        </w:rPr>
+        <w:lastRenderedPageBreak/>
+        <w:t>The current system may lack a robust mechanism for collecting user feedback on the overall shopping experience.</w:t>
       </w:r>
     </w:p>
     <w:p>
@@ -3218,38 +3569,86 @@
     </w:p>
     <w:p>
       <w:pPr>
-        <w:ind w:left="0" w:firstLine="720"/>
-        <w:rPr>
-          <w:szCs w:val="24"/>
-        </w:rPr>
-      </w:pPr>
-      <w:r>
-        <w:rPr>
-          <w:szCs w:val="24"/>
-        </w:rPr>
-        <w:t>"Garage Finder Pro" is an innovative app designed to overcome the limitations of current systems and provide best user experience for finding and choosing auto garages. This app focuses on connecting users with garages that have the specific capabilities to repair their vehicle type whether it is a 4-wheeler, 3-wheeler, 2-wheeler or an electric vehicle. The app provides different garage profiles allowing users to view services offered, operating hours, towing service and customer reviews and ratings. This empowers users to make informed decisions ensuring they find the best auto garage for their needs</w:t>
-      </w:r>
-      <w:r>
-        <w:rPr>
-          <w:szCs w:val="24"/>
-        </w:rPr>
-        <w:t>.</w:t>
-      </w:r>
-      <w:r>
-        <w:rPr>
-          <w:szCs w:val="24"/>
-        </w:rPr>
-        <w:t xml:space="preserve"> Users can also access detailed job cards that provide information about the requested or accepted work, estimated costs, and job card status. This transparency allows users to track the progress of their vehicle repairs easily. Additionally, the app offers valuable analytics and insights to garage owners, including metrics such as the number of customers, job cards assigned, in progress, completed, pending and cancelled.</w:t>
-      </w:r>
-    </w:p>
-    <w:p>
-      <w:pPr>
-        <w:ind w:left="10"/>
-        <w:rPr>
-          <w:szCs w:val="24"/>
-        </w:rPr>
-      </w:pPr>
-    </w:p>
+        <w:ind w:left="10" w:firstLine="710"/>
+        <w:jc w:val="both"/>
+      </w:pPr>
+      <w:r>
+        <w:t xml:space="preserve">Real Furniture </w:t>
+      </w:r>
+      <w:r>
+        <w:t xml:space="preserve">is an android application </w:t>
+      </w:r>
+      <w:r>
+        <w:t>th</w:t>
+      </w:r>
+      <w:r>
+        <w:t>at helps users in efficient</w:t>
+      </w:r>
+      <w:r>
+        <w:t xml:space="preserve"> furniture shopping through its innovative augmented reality (AR)</w:t>
+      </w:r>
+      <w:r>
+        <w:t xml:space="preserve"> and</w:t>
+      </w:r>
+      <w:r>
+        <w:t xml:space="preserve"> </w:t>
+      </w:r>
+      <w:r>
+        <w:t>3-Dimensional visualization of products.</w:t>
+      </w:r>
+      <w:r>
+        <w:t xml:space="preserve"> </w:t>
+      </w:r>
+      <w:r>
+        <w:t xml:space="preserve">It </w:t>
+      </w:r>
+      <w:r>
+        <w:t>provid</w:t>
+      </w:r>
+      <w:r>
+        <w:t>es</w:t>
+      </w:r>
+      <w:r>
+        <w:t xml:space="preserve"> users with a unique and immersive experience. The platform's AR capabilities allow customers to virtually place furniture items in their own living spaces, aiding in visualizing styles and sizes accurately.</w:t>
+      </w:r>
+      <w:r>
+        <w:t xml:space="preserve"> </w:t>
+      </w:r>
+      <w:r>
+        <w:t xml:space="preserve">Detailed product information, including customer reviews and dimensions, enhances transparency and aids informed decision-making. The commitment to offering AR views for every product ensures a comprehensive and interactive exploration of items in three dimensions, minimizing uncertainties for users. With </w:t>
+      </w:r>
+      <w:r>
+        <w:t>colour-</w:t>
+      </w:r>
+      <w:r>
+        <w:t xml:space="preserve">customization tools, real-time </w:t>
+      </w:r>
+      <w:r>
+        <w:t xml:space="preserve">delivery </w:t>
+      </w:r>
+      <w:r>
+        <w:t>tracking</w:t>
+      </w:r>
+      <w:r>
+        <w:t xml:space="preserve"> and efficient</w:t>
+      </w:r>
+      <w:r>
+        <w:t xml:space="preserve"> customer support</w:t>
+      </w:r>
+      <w:r>
+        <w:t xml:space="preserve">, </w:t>
+      </w:r>
+      <w:r>
+        <w:t>Real Furniture prioritizes user satisfaction</w:t>
+      </w:r>
+      <w:r>
+        <w:t xml:space="preserve"> and re-innovating the way of </w:t>
+      </w:r>
+      <w:r>
+        <w:t>home furnishing.</w:t>
+      </w:r>
+    </w:p>
+    <w:p/>
     <w:p>
       <w:pPr>
         <w:pStyle w:val="ListParagraph"/>
@@ -3257,6 +3656,7 @@
           <w:ilvl w:val="0"/>
           <w:numId w:val="4"/>
         </w:numPr>
+        <w:spacing w:line="256" w:lineRule="auto"/>
         <w:rPr>
           <w:rFonts w:ascii="Times New Roman" w:hAnsi="Times New Roman" w:cs="Times New Roman"/>
           <w:b/>
@@ -3283,22 +3683,19 @@
           <w:ilvl w:val="0"/>
           <w:numId w:val="7"/>
         </w:numPr>
-        <w:ind w:left="360"/>
+        <w:spacing w:line="256" w:lineRule="auto"/>
+        <w:jc w:val="both"/>
         <w:rPr>
           <w:rFonts w:ascii="Times New Roman" w:hAnsi="Times New Roman" w:cs="Times New Roman"/>
           <w:b/>
           <w:bCs/>
-          <w:sz w:val="24"/>
-          <w:szCs w:val="24"/>
         </w:rPr>
       </w:pPr>
       <w:r>
         <w:rPr>
           <w:rFonts w:ascii="Times New Roman" w:hAnsi="Times New Roman" w:cs="Times New Roman"/>
-          <w:sz w:val="24"/>
-          <w:szCs w:val="24"/>
-        </w:rPr>
-        <w:t xml:space="preserve">User launches the "Garage Finder Pro" app. </w:t>
+        </w:rPr>
+        <w:t xml:space="preserve">User launches the "Real Furniture" app. </w:t>
       </w:r>
     </w:p>
     <w:p>
@@ -3308,20 +3705,17 @@
           <w:ilvl w:val="0"/>
           <w:numId w:val="6"/>
         </w:numPr>
-        <w:ind w:left="360"/>
+        <w:spacing w:line="256" w:lineRule="auto"/>
+        <w:jc w:val="both"/>
         <w:rPr>
           <w:rFonts w:ascii="Times New Roman" w:hAnsi="Times New Roman" w:cs="Times New Roman"/>
           <w:b/>
           <w:bCs/>
-          <w:sz w:val="24"/>
-          <w:szCs w:val="24"/>
         </w:rPr>
       </w:pPr>
       <w:r>
         <w:rPr>
           <w:rFonts w:ascii="Times New Roman" w:hAnsi="Times New Roman" w:cs="Times New Roman"/>
-          <w:sz w:val="24"/>
-          <w:szCs w:val="24"/>
         </w:rPr>
         <w:t>The user is presented with the option to register or sign in if they already have an account.</w:t>
       </w:r>
@@ -3333,38 +3727,19 @@
           <w:ilvl w:val="0"/>
           <w:numId w:val="6"/>
         </w:numPr>
-        <w:ind w:left="360"/>
+        <w:spacing w:line="256" w:lineRule="auto"/>
+        <w:jc w:val="both"/>
         <w:rPr>
           <w:rFonts w:ascii="Times New Roman" w:hAnsi="Times New Roman" w:cs="Times New Roman"/>
           <w:b/>
           <w:bCs/>
-          <w:sz w:val="24"/>
-          <w:szCs w:val="24"/>
         </w:rPr>
       </w:pPr>
       <w:r>
         <w:rPr>
           <w:rFonts w:ascii="Times New Roman" w:hAnsi="Times New Roman" w:cs="Times New Roman"/>
-          <w:sz w:val="24"/>
-          <w:szCs w:val="24"/>
-        </w:rPr>
-        <w:t>Details like user-type (user or garageowner) and mobile number are taken from use</w:t>
-      </w:r>
-      <w:r>
-        <w:rPr>
-          <w:rFonts w:ascii="Times New Roman" w:hAnsi="Times New Roman" w:cs="Times New Roman"/>
-          <w:sz w:val="24"/>
-          <w:szCs w:val="24"/>
-        </w:rPr>
-        <w:t>r</w:t>
-      </w:r>
-      <w:r>
-        <w:rPr>
-          <w:rFonts w:ascii="Times New Roman" w:hAnsi="Times New Roman" w:cs="Times New Roman"/>
-          <w:sz w:val="24"/>
-          <w:szCs w:val="24"/>
-        </w:rPr>
-        <w:t>.</w:t>
+        </w:rPr>
+        <w:t>User must provide valid credentials to explore the application and make a purchase.</w:t>
       </w:r>
     </w:p>
     <w:p>
@@ -3374,22 +3749,33 @@
           <w:ilvl w:val="0"/>
           <w:numId w:val="6"/>
         </w:numPr>
-        <w:ind w:left="360"/>
+        <w:spacing w:line="256" w:lineRule="auto"/>
+        <w:jc w:val="both"/>
         <w:rPr>
           <w:rFonts w:ascii="Times New Roman" w:hAnsi="Times New Roman" w:cs="Times New Roman"/>
           <w:b/>
           <w:bCs/>
-          <w:sz w:val="24"/>
-          <w:szCs w:val="24"/>
         </w:rPr>
       </w:pPr>
       <w:r>
         <w:rPr>
           <w:rFonts w:ascii="Times New Roman" w:hAnsi="Times New Roman" w:cs="Times New Roman"/>
-          <w:sz w:val="24"/>
-          <w:szCs w:val="24"/>
-        </w:rPr>
-        <w:t>The garage owner will also be required to provide more information like services offered, operating hours, towing service availability, etc.</w:t>
+        </w:rPr>
+        <w:t xml:space="preserve">The details of the user will get stored in the </w:t>
+      </w:r>
+      <w:proofErr w:type="spellStart"/>
+      <w:r>
+        <w:rPr>
+          <w:rFonts w:ascii="Times New Roman" w:hAnsi="Times New Roman" w:cs="Times New Roman"/>
+        </w:rPr>
+        <w:t>firestore</w:t>
+      </w:r>
+      <w:proofErr w:type="spellEnd"/>
+      <w:r>
+        <w:rPr>
+          <w:rFonts w:ascii="Times New Roman" w:hAnsi="Times New Roman" w:cs="Times New Roman"/>
+        </w:rPr>
+        <w:t>.</w:t>
       </w:r>
     </w:p>
     <w:p>
@@ -3399,79 +3785,38 @@
           <w:ilvl w:val="0"/>
           <w:numId w:val="6"/>
         </w:numPr>
-        <w:ind w:left="360"/>
+        <w:spacing w:line="256" w:lineRule="auto"/>
+        <w:jc w:val="both"/>
         <w:rPr>
           <w:rFonts w:ascii="Times New Roman" w:hAnsi="Times New Roman" w:cs="Times New Roman"/>
           <w:b/>
           <w:bCs/>
-          <w:sz w:val="24"/>
-          <w:szCs w:val="24"/>
         </w:rPr>
       </w:pPr>
       <w:r>
         <w:rPr>
           <w:rFonts w:ascii="Times New Roman" w:hAnsi="Times New Roman" w:cs="Times New Roman"/>
-          <w:sz w:val="24"/>
-          <w:szCs w:val="24"/>
-        </w:rPr>
-        <w:t>Garage owners can also upload images of their garage to showcase their facilities and location for the user to reach to their garage.</w:t>
-      </w:r>
-    </w:p>
-    <w:p>
-      <w:pPr>
-        <w:pStyle w:val="ListParagraph"/>
-        <w:numPr>
-          <w:ilvl w:val="0"/>
-          <w:numId w:val="6"/>
-        </w:numPr>
-        <w:ind w:left="360"/>
-        <w:rPr>
-          <w:rFonts w:ascii="Times New Roman" w:hAnsi="Times New Roman" w:cs="Times New Roman"/>
-          <w:b/>
-          <w:bCs/>
-          <w:sz w:val="24"/>
-          <w:szCs w:val="24"/>
-        </w:rPr>
-      </w:pPr>
-      <w:r>
-        <w:rPr>
-          <w:rFonts w:ascii="Times New Roman" w:hAnsi="Times New Roman" w:cs="Times New Roman"/>
-          <w:sz w:val="24"/>
-          <w:szCs w:val="24"/>
-        </w:rPr>
-        <w:t>The details of the user will get stored in the firestore.</w:t>
-      </w:r>
-    </w:p>
-    <w:p>
-      <w:pPr>
-        <w:pStyle w:val="ListParagraph"/>
-        <w:numPr>
-          <w:ilvl w:val="0"/>
-          <w:numId w:val="6"/>
-        </w:numPr>
-        <w:ind w:left="360"/>
-        <w:rPr>
-          <w:rFonts w:ascii="Times New Roman" w:hAnsi="Times New Roman" w:cs="Times New Roman"/>
-          <w:b/>
-          <w:bCs/>
-          <w:sz w:val="24"/>
-          <w:szCs w:val="24"/>
-        </w:rPr>
-      </w:pPr>
-      <w:r>
-        <w:rPr>
-          <w:rFonts w:ascii="Times New Roman" w:hAnsi="Times New Roman" w:cs="Times New Roman"/>
-          <w:sz w:val="24"/>
-          <w:szCs w:val="24"/>
         </w:rPr>
         <w:t>After successful registration or sign-in, the user is directed to the home screen.</w:t>
       </w:r>
     </w:p>
     <w:p>
       <w:pPr>
-        <w:rPr>
-          <w:sz w:val="28"/>
-          <w:szCs w:val="28"/>
+        <w:spacing w:line="256" w:lineRule="auto"/>
+        <w:rPr>
+          <w:b/>
+          <w:bCs/>
+          <w:szCs w:val="24"/>
+        </w:rPr>
+      </w:pPr>
+    </w:p>
+    <w:p>
+      <w:pPr>
+        <w:spacing w:line="256" w:lineRule="auto"/>
+        <w:rPr>
+          <w:b/>
+          <w:bCs/>
+          <w:szCs w:val="24"/>
         </w:rPr>
       </w:pPr>
     </w:p>
@@ -3482,6 +3827,7 @@
           <w:ilvl w:val="0"/>
           <w:numId w:val="4"/>
         </w:numPr>
+        <w:spacing w:line="256" w:lineRule="auto"/>
         <w:rPr>
           <w:rFonts w:ascii="Times New Roman" w:hAnsi="Times New Roman" w:cs="Times New Roman"/>
           <w:b/>
@@ -3498,7 +3844,7 @@
           <w:sz w:val="24"/>
           <w:szCs w:val="24"/>
         </w:rPr>
-        <w:t>Searching and Selecting Garages:</w:t>
+        <w:t>Augmented Reality:</w:t>
       </w:r>
     </w:p>
     <w:p>
@@ -3506,21 +3852,25 @@
         <w:pStyle w:val="ListParagraph"/>
         <w:numPr>
           <w:ilvl w:val="0"/>
-          <w:numId w:val="8"/>
+          <w:numId w:val="22"/>
         </w:numPr>
+        <w:spacing w:line="256" w:lineRule="auto"/>
+        <w:jc w:val="both"/>
         <w:rPr>
           <w:rFonts w:ascii="Times New Roman" w:hAnsi="Times New Roman" w:cs="Times New Roman"/>
-          <w:sz w:val="24"/>
-          <w:szCs w:val="24"/>
         </w:rPr>
       </w:pPr>
       <w:r>
         <w:rPr>
           <w:rFonts w:ascii="Times New Roman" w:hAnsi="Times New Roman" w:cs="Times New Roman"/>
-          <w:sz w:val="24"/>
-          <w:szCs w:val="24"/>
-        </w:rPr>
-        <w:t>On the home screen, the user will see a search bar and filters to refine their search.</w:t>
+        </w:rPr>
+        <w:t>A</w:t>
+      </w:r>
+      <w:r>
+        <w:rPr>
+          <w:rFonts w:ascii="Times New Roman" w:hAnsi="Times New Roman" w:cs="Times New Roman"/>
+        </w:rPr>
+        <w:t xml:space="preserve"> robust AR system allowing users to virtually place furniture items in their own living spaces.</w:t>
       </w:r>
     </w:p>
     <w:p>
@@ -3528,21 +3878,19 @@
         <w:pStyle w:val="ListParagraph"/>
         <w:numPr>
           <w:ilvl w:val="0"/>
-          <w:numId w:val="8"/>
+          <w:numId w:val="22"/>
         </w:numPr>
+        <w:spacing w:line="256" w:lineRule="auto"/>
+        <w:jc w:val="both"/>
         <w:rPr>
           <w:rFonts w:ascii="Times New Roman" w:hAnsi="Times New Roman" w:cs="Times New Roman"/>
-          <w:sz w:val="24"/>
-          <w:szCs w:val="24"/>
         </w:rPr>
       </w:pPr>
       <w:r>
         <w:rPr>
           <w:rFonts w:ascii="Times New Roman" w:hAnsi="Times New Roman" w:cs="Times New Roman"/>
-          <w:sz w:val="24"/>
-          <w:szCs w:val="24"/>
-        </w:rPr>
-        <w:t>The user enters their location or enables location services for automatic detection.</w:t>
+        </w:rPr>
+        <w:t>3-Dimensional Models that allows users to rotate, zoom and view from any angle for a detailed view of furniture product.</w:t>
       </w:r>
     </w:p>
     <w:p>
@@ -3550,82 +3898,27 @@
         <w:pStyle w:val="ListParagraph"/>
         <w:numPr>
           <w:ilvl w:val="0"/>
-          <w:numId w:val="8"/>
+          <w:numId w:val="22"/>
         </w:numPr>
+        <w:spacing w:line="256" w:lineRule="auto"/>
+        <w:jc w:val="both"/>
         <w:rPr>
           <w:rFonts w:ascii="Times New Roman" w:hAnsi="Times New Roman" w:cs="Times New Roman"/>
-          <w:sz w:val="24"/>
-          <w:szCs w:val="24"/>
         </w:rPr>
       </w:pPr>
       <w:r>
         <w:rPr>
           <w:rFonts w:ascii="Times New Roman" w:hAnsi="Times New Roman" w:cs="Times New Roman"/>
-          <w:sz w:val="24"/>
-          <w:szCs w:val="24"/>
-        </w:rPr>
-        <w:t>Based on the entered location the app displays a list of nearby garages.</w:t>
-      </w:r>
-    </w:p>
-    <w:p>
-      <w:pPr>
-        <w:pStyle w:val="ListParagraph"/>
-        <w:numPr>
-          <w:ilvl w:val="0"/>
-          <w:numId w:val="8"/>
-        </w:numPr>
-        <w:rPr>
-          <w:rFonts w:ascii="Times New Roman" w:hAnsi="Times New Roman" w:cs="Times New Roman"/>
-          <w:sz w:val="24"/>
-          <w:szCs w:val="24"/>
-        </w:rPr>
-      </w:pPr>
-      <w:r>
-        <w:rPr>
-          <w:rFonts w:ascii="Times New Roman" w:hAnsi="Times New Roman" w:cs="Times New Roman"/>
-          <w:sz w:val="24"/>
-          <w:szCs w:val="24"/>
-        </w:rPr>
-        <w:t>The user can apply filters such as vehicle type (4-wheeler, 3-wheeler, 2-wheeler, electric), services offered, operating hours, minimum service cost, etc.</w:t>
-      </w:r>
-    </w:p>
-    <w:p>
-      <w:pPr>
-        <w:pStyle w:val="ListParagraph"/>
-        <w:numPr>
-          <w:ilvl w:val="0"/>
-          <w:numId w:val="8"/>
-        </w:numPr>
-        <w:rPr>
-          <w:rFonts w:ascii="Times New Roman" w:hAnsi="Times New Roman" w:cs="Times New Roman"/>
-          <w:sz w:val="24"/>
-          <w:szCs w:val="24"/>
-        </w:rPr>
-      </w:pPr>
-      <w:r>
-        <w:rPr>
-          <w:rFonts w:ascii="Times New Roman" w:hAnsi="Times New Roman" w:cs="Times New Roman"/>
-          <w:sz w:val="24"/>
-          <w:szCs w:val="24"/>
-        </w:rPr>
-        <w:t>The user selects a garage from the search results to view its profile.</w:t>
-      </w:r>
-    </w:p>
-    <w:p>
-      <w:pPr>
-        <w:ind w:left="10"/>
-        <w:rPr>
-          <w:sz w:val="28"/>
-          <w:szCs w:val="28"/>
-        </w:rPr>
-      </w:pPr>
-    </w:p>
-    <w:p>
-      <w:pPr>
-        <w:ind w:left="10"/>
-        <w:rPr>
-          <w:sz w:val="28"/>
-          <w:szCs w:val="28"/>
+        </w:rPr>
+        <w:t>Enhance the AR experience by incorporating realistic material and texture visualization for furniture items.</w:t>
+      </w:r>
+    </w:p>
+    <w:p>
+      <w:pPr>
+        <w:spacing w:line="256" w:lineRule="auto"/>
+        <w:rPr>
+          <w:b/>
+          <w:bCs/>
         </w:rPr>
       </w:pPr>
     </w:p>
@@ -3636,6 +3929,7 @@
           <w:ilvl w:val="0"/>
           <w:numId w:val="4"/>
         </w:numPr>
+        <w:spacing w:line="256" w:lineRule="auto"/>
         <w:rPr>
           <w:rFonts w:ascii="Times New Roman" w:hAnsi="Times New Roman" w:cs="Times New Roman"/>
           <w:b/>
@@ -3652,8 +3946,7 @@
           <w:sz w:val="24"/>
           <w:szCs w:val="24"/>
         </w:rPr>
-        <w:lastRenderedPageBreak/>
-        <w:t>Viewing Garage Profile:</w:t>
+        <w:t>Cart and Wishlist:</w:t>
       </w:r>
     </w:p>
     <w:p>
@@ -3661,21 +3954,25 @@
         <w:pStyle w:val="ListParagraph"/>
         <w:numPr>
           <w:ilvl w:val="0"/>
-          <w:numId w:val="9"/>
+          <w:numId w:val="23"/>
         </w:numPr>
+        <w:spacing w:line="256" w:lineRule="auto"/>
+        <w:jc w:val="both"/>
         <w:rPr>
           <w:rFonts w:ascii="Times New Roman" w:hAnsi="Times New Roman" w:cs="Times New Roman"/>
-          <w:sz w:val="24"/>
-          <w:szCs w:val="24"/>
         </w:rPr>
       </w:pPr>
       <w:r>
         <w:rPr>
           <w:rFonts w:ascii="Times New Roman" w:hAnsi="Times New Roman" w:cs="Times New Roman"/>
-          <w:sz w:val="24"/>
-          <w:szCs w:val="24"/>
-        </w:rPr>
-        <w:t>The user is directed to the selected garage's profile page.</w:t>
+        </w:rPr>
+        <w:t>A</w:t>
+      </w:r>
+      <w:r>
+        <w:rPr>
+          <w:rFonts w:ascii="Times New Roman" w:hAnsi="Times New Roman" w:cs="Times New Roman"/>
+        </w:rPr>
+        <w:t xml:space="preserve"> user-friendly interface that allows seamless addition of selected furniture items to the shopping cart.</w:t>
       </w:r>
     </w:p>
     <w:p>
@@ -3683,21 +3980,51 @@
         <w:pStyle w:val="ListParagraph"/>
         <w:numPr>
           <w:ilvl w:val="0"/>
-          <w:numId w:val="9"/>
+          <w:numId w:val="23"/>
         </w:numPr>
+        <w:spacing w:line="256" w:lineRule="auto"/>
+        <w:jc w:val="both"/>
         <w:rPr>
           <w:rFonts w:ascii="Times New Roman" w:hAnsi="Times New Roman" w:cs="Times New Roman"/>
-          <w:sz w:val="24"/>
-          <w:szCs w:val="24"/>
         </w:rPr>
       </w:pPr>
       <w:r>
         <w:rPr>
           <w:rFonts w:ascii="Times New Roman" w:hAnsi="Times New Roman" w:cs="Times New Roman"/>
-          <w:sz w:val="24"/>
-          <w:szCs w:val="24"/>
-        </w:rPr>
-        <w:t>The profile page displays details about the garage, including services offered, operating hours, towing service availability, directions and customer reviews and ratings.</w:t>
+        </w:rPr>
+        <w:t xml:space="preserve">Giving </w:t>
+      </w:r>
+      <w:proofErr w:type="gramStart"/>
+      <w:r>
+        <w:rPr>
+          <w:rFonts w:ascii="Times New Roman" w:hAnsi="Times New Roman" w:cs="Times New Roman"/>
+        </w:rPr>
+        <w:t>a</w:t>
+      </w:r>
+      <w:proofErr w:type="gramEnd"/>
+      <w:r>
+        <w:rPr>
+          <w:rFonts w:ascii="Times New Roman" w:hAnsi="Times New Roman" w:cs="Times New Roman"/>
+        </w:rPr>
+        <w:t xml:space="preserve"> </w:t>
+      </w:r>
+      <w:r>
+        <w:rPr>
+          <w:rFonts w:ascii="Times New Roman" w:hAnsi="Times New Roman" w:cs="Times New Roman"/>
+        </w:rPr>
+        <w:t xml:space="preserve">ability </w:t>
+      </w:r>
+      <w:r>
+        <w:rPr>
+          <w:rFonts w:ascii="Times New Roman" w:hAnsi="Times New Roman" w:cs="Times New Roman"/>
+        </w:rPr>
+        <w:t>to</w:t>
+      </w:r>
+      <w:r>
+        <w:rPr>
+          <w:rFonts w:ascii="Times New Roman" w:hAnsi="Times New Roman" w:cs="Times New Roman"/>
+        </w:rPr>
+        <w:t xml:space="preserve"> users to save their current cart sessions, allowing them to revisit and complete purchases at a later time.</w:t>
       </w:r>
     </w:p>
     <w:p>
@@ -3705,56 +4032,70 @@
         <w:pStyle w:val="ListParagraph"/>
         <w:numPr>
           <w:ilvl w:val="0"/>
-          <w:numId w:val="9"/>
+          <w:numId w:val="23"/>
         </w:numPr>
+        <w:spacing w:line="256" w:lineRule="auto"/>
+        <w:jc w:val="both"/>
         <w:rPr>
           <w:rFonts w:ascii="Times New Roman" w:hAnsi="Times New Roman" w:cs="Times New Roman"/>
-          <w:sz w:val="24"/>
-          <w:szCs w:val="24"/>
         </w:rPr>
       </w:pPr>
       <w:r>
         <w:rPr>
           <w:rFonts w:ascii="Times New Roman" w:hAnsi="Times New Roman" w:cs="Times New Roman"/>
-          <w:sz w:val="24"/>
-          <w:szCs w:val="24"/>
-        </w:rPr>
-        <w:t>The user can scroll through customer reviews to get an idea of the garage's reputation.</w:t>
-      </w:r>
-    </w:p>
-    <w:p>
-      <w:pPr>
-        <w:pStyle w:val="ListParagraph"/>
-        <w:numPr>
-          <w:ilvl w:val="0"/>
-          <w:numId w:val="9"/>
-        </w:numPr>
+        </w:rPr>
+        <w:t xml:space="preserve">Enable users to create </w:t>
+      </w:r>
+      <w:proofErr w:type="spellStart"/>
+      <w:r>
         <w:rPr>
           <w:rFonts w:ascii="Times New Roman" w:hAnsi="Times New Roman" w:cs="Times New Roman"/>
-          <w:sz w:val="24"/>
-          <w:szCs w:val="24"/>
-        </w:rPr>
-      </w:pPr>
+        </w:rPr>
+        <w:t>wishlist</w:t>
+      </w:r>
+      <w:proofErr w:type="spellEnd"/>
       <w:r>
         <w:rPr>
           <w:rFonts w:ascii="Times New Roman" w:hAnsi="Times New Roman" w:cs="Times New Roman"/>
-          <w:sz w:val="24"/>
-          <w:szCs w:val="24"/>
-        </w:rPr>
-        <w:t>If the user wants to proceed with this garage, they can proceed to the next step. Otherwise, they can go back and select a different garage.</w:t>
+        </w:rPr>
+        <w:t xml:space="preserve"> based on their preferences</w:t>
       </w:r>
       <w:r>
         <w:rPr>
           <w:rFonts w:ascii="Times New Roman" w:hAnsi="Times New Roman" w:cs="Times New Roman"/>
-          <w:sz w:val="24"/>
-          <w:szCs w:val="24"/>
-        </w:rPr>
-        <w:tab/>
-      </w:r>
-    </w:p>
-    <w:p>
-      <w:pPr>
-        <w:ind w:left="10"/>
+        </w:rPr>
+        <w:t xml:space="preserve"> and allow them</w:t>
+      </w:r>
+      <w:r>
+        <w:rPr>
+          <w:rFonts w:ascii="Times New Roman" w:hAnsi="Times New Roman" w:cs="Times New Roman"/>
+        </w:rPr>
+        <w:t xml:space="preserve"> to easily transfer items from their </w:t>
+      </w:r>
+      <w:proofErr w:type="spellStart"/>
+      <w:r>
+        <w:rPr>
+          <w:rFonts w:ascii="Times New Roman" w:hAnsi="Times New Roman" w:cs="Times New Roman"/>
+        </w:rPr>
+        <w:t>wishlist</w:t>
+      </w:r>
+      <w:proofErr w:type="spellEnd"/>
+      <w:r>
+        <w:rPr>
+          <w:rFonts w:ascii="Times New Roman" w:hAnsi="Times New Roman" w:cs="Times New Roman"/>
+        </w:rPr>
+        <w:t xml:space="preserve"> to the cart</w:t>
+      </w:r>
+      <w:r>
+        <w:rPr>
+          <w:rFonts w:ascii="Times New Roman" w:hAnsi="Times New Roman" w:cs="Times New Roman"/>
+        </w:rPr>
+        <w:t>.</w:t>
+      </w:r>
+    </w:p>
+    <w:p>
+      <w:pPr>
+        <w:spacing w:line="256" w:lineRule="auto"/>
       </w:pPr>
     </w:p>
     <w:p>
@@ -3764,6 +4105,7 @@
           <w:ilvl w:val="0"/>
           <w:numId w:val="4"/>
         </w:numPr>
+        <w:spacing w:line="256" w:lineRule="auto"/>
         <w:rPr>
           <w:rFonts w:ascii="Times New Roman" w:hAnsi="Times New Roman" w:cs="Times New Roman"/>
           <w:b/>
@@ -3780,82 +4122,79 @@
           <w:sz w:val="24"/>
           <w:szCs w:val="24"/>
         </w:rPr>
-        <w:t>Confirming Services and Towing Requirements:</w:t>
+        <w:t>Delivery Tracking:</w:t>
       </w:r>
     </w:p>
     <w:p>
       <w:pPr>
         <w:pStyle w:val="ListParagraph"/>
         <w:numPr>
-          <w:ilvl w:val="0"/>
-          <w:numId w:val="10"/>
+          <w:ilvl w:val="1"/>
+          <w:numId w:val="24"/>
         </w:numPr>
+        <w:spacing w:line="256" w:lineRule="auto"/>
+        <w:jc w:val="both"/>
         <w:rPr>
           <w:rFonts w:ascii="Times New Roman" w:hAnsi="Times New Roman" w:cs="Times New Roman"/>
-          <w:sz w:val="24"/>
-          <w:szCs w:val="24"/>
         </w:rPr>
       </w:pPr>
       <w:r>
         <w:rPr>
           <w:rFonts w:ascii="Times New Roman" w:hAnsi="Times New Roman" w:cs="Times New Roman"/>
-          <w:sz w:val="24"/>
-          <w:szCs w:val="24"/>
-        </w:rPr>
-        <w:t>The user selects the desired services they require from the garage's profile page.</w:t>
+        </w:rPr>
+        <w:t>After confirming the product to purchase, the user can proceed to payment options available or can also go for cash or pay on delivery options.</w:t>
       </w:r>
     </w:p>
     <w:p>
       <w:pPr>
         <w:pStyle w:val="ListParagraph"/>
         <w:numPr>
-          <w:ilvl w:val="0"/>
-          <w:numId w:val="10"/>
+          <w:ilvl w:val="1"/>
+          <w:numId w:val="24"/>
         </w:numPr>
+        <w:spacing w:line="256" w:lineRule="auto"/>
+        <w:jc w:val="both"/>
         <w:rPr>
           <w:rFonts w:ascii="Times New Roman" w:hAnsi="Times New Roman" w:cs="Times New Roman"/>
-          <w:sz w:val="24"/>
-          <w:szCs w:val="24"/>
         </w:rPr>
       </w:pPr>
       <w:r>
         <w:rPr>
           <w:rFonts w:ascii="Times New Roman" w:hAnsi="Times New Roman" w:cs="Times New Roman"/>
-          <w:sz w:val="24"/>
-          <w:szCs w:val="24"/>
-        </w:rPr>
-        <w:t>If towing service is required, the user can select the option accordingly.</w:t>
-      </w:r>
-    </w:p>
-    <w:p>
-      <w:pPr>
-        <w:pStyle w:val="ListParagraph"/>
-        <w:numPr>
-          <w:ilvl w:val="0"/>
-          <w:numId w:val="10"/>
-        </w:numPr>
+        </w:rPr>
+        <w:t xml:space="preserve">The user can easily track the progress of their </w:t>
+      </w:r>
+      <w:r>
         <w:rPr>
           <w:rFonts w:ascii="Times New Roman" w:hAnsi="Times New Roman" w:cs="Times New Roman"/>
-          <w:sz w:val="24"/>
-          <w:szCs w:val="24"/>
-        </w:rPr>
-      </w:pPr>
+        </w:rPr>
+        <w:t xml:space="preserve">delivery </w:t>
+      </w:r>
       <w:r>
         <w:rPr>
           <w:rFonts w:ascii="Times New Roman" w:hAnsi="Times New Roman" w:cs="Times New Roman"/>
-          <w:sz w:val="24"/>
-          <w:szCs w:val="24"/>
-        </w:rPr>
-        <w:t>The location of the vehicle is automatically detected and is available to the towing service man.</w:t>
-      </w:r>
-    </w:p>
-    <w:p>
-      <w:pPr>
-        <w:pStyle w:val="ListParagraph"/>
-        <w:ind w:left="360"/>
+        </w:rPr>
+        <w:t xml:space="preserve">by accessing the </w:t>
+      </w:r>
+      <w:r>
         <w:rPr>
           <w:rFonts w:ascii="Times New Roman" w:hAnsi="Times New Roman" w:cs="Times New Roman"/>
-          <w:sz w:val="24"/>
+        </w:rPr>
+        <w:t xml:space="preserve">ordered products list </w:t>
+      </w:r>
+      <w:r>
+        <w:rPr>
+          <w:rFonts w:ascii="Times New Roman" w:hAnsi="Times New Roman" w:cs="Times New Roman"/>
+        </w:rPr>
+        <w:t>and viewing its status.</w:t>
+      </w:r>
+    </w:p>
+    <w:p>
+      <w:pPr>
+        <w:spacing w:line="256" w:lineRule="auto"/>
+        <w:rPr>
+          <w:b/>
+          <w:bCs/>
           <w:szCs w:val="24"/>
         </w:rPr>
       </w:pPr>
@@ -3867,6 +4206,7 @@
           <w:ilvl w:val="0"/>
           <w:numId w:val="4"/>
         </w:numPr>
+        <w:spacing w:line="256" w:lineRule="auto"/>
         <w:rPr>
           <w:rFonts w:ascii="Times New Roman" w:hAnsi="Times New Roman" w:cs="Times New Roman"/>
           <w:b/>
@@ -3891,37 +4231,36 @@
         <w:pStyle w:val="ListParagraph"/>
         <w:numPr>
           <w:ilvl w:val="1"/>
-          <w:numId w:val="11"/>
+          <w:numId w:val="21"/>
         </w:numPr>
+        <w:spacing w:line="256" w:lineRule="auto"/>
+        <w:ind w:left="644"/>
+        <w:jc w:val="both"/>
         <w:rPr>
           <w:rFonts w:ascii="Times New Roman" w:hAnsi="Times New Roman" w:cs="Times New Roman"/>
-          <w:sz w:val="24"/>
-          <w:szCs w:val="24"/>
+          <w:b/>
+          <w:bCs/>
         </w:rPr>
       </w:pPr>
       <w:r>
         <w:rPr>
           <w:rFonts w:ascii="Times New Roman" w:hAnsi="Times New Roman" w:cs="Times New Roman"/>
-          <w:sz w:val="24"/>
-          <w:szCs w:val="24"/>
-        </w:rPr>
-        <w:t xml:space="preserve">The app sends notifications to both user and garageowner for various events, including new changes in job card status, customer </w:t>
-      </w:r>
+        </w:rPr>
+        <w:t xml:space="preserve">The app sends </w:t>
+      </w:r>
+      <w:proofErr w:type="spellStart"/>
       <w:r>
         <w:rPr>
           <w:rFonts w:ascii="Times New Roman" w:hAnsi="Times New Roman" w:cs="Times New Roman"/>
-          <w:sz w:val="24"/>
-          <w:szCs w:val="24"/>
-        </w:rPr>
-        <w:t>payments</w:t>
-      </w:r>
+        </w:rPr>
+        <w:t>realtime</w:t>
+      </w:r>
+      <w:proofErr w:type="spellEnd"/>
       <w:r>
         <w:rPr>
           <w:rFonts w:ascii="Times New Roman" w:hAnsi="Times New Roman" w:cs="Times New Roman"/>
-          <w:sz w:val="24"/>
-          <w:szCs w:val="24"/>
-        </w:rPr>
-        <w:t>, and new reviews.</w:t>
+        </w:rPr>
+        <w:t>-notifications to users regarding various event, new product launches, offers, delivery tracking, feedback, etc.</w:t>
       </w:r>
     </w:p>
     <w:p>
@@ -3929,79 +4268,39 @@
         <w:pStyle w:val="ListParagraph"/>
         <w:numPr>
           <w:ilvl w:val="1"/>
-          <w:numId w:val="11"/>
+          <w:numId w:val="21"/>
         </w:numPr>
+        <w:spacing w:line="256" w:lineRule="auto"/>
+        <w:ind w:left="644"/>
+        <w:jc w:val="both"/>
         <w:rPr>
           <w:rFonts w:ascii="Times New Roman" w:hAnsi="Times New Roman" w:cs="Times New Roman"/>
-          <w:sz w:val="24"/>
-          <w:szCs w:val="24"/>
         </w:rPr>
       </w:pPr>
       <w:r>
         <w:rPr>
           <w:rFonts w:ascii="Times New Roman" w:hAnsi="Times New Roman" w:cs="Times New Roman"/>
-          <w:sz w:val="24"/>
-          <w:szCs w:val="24"/>
-        </w:rPr>
-        <w:t>The garageowner will also receive notifications for required towing services, and the user will receive notifications for the same when the garageowner accepts the request.</w:t>
-      </w:r>
-    </w:p>
-    <w:p>
-      <w:pPr>
-        <w:pStyle w:val="ListParagraph"/>
-        <w:numPr>
-          <w:ilvl w:val="1"/>
-          <w:numId w:val="11"/>
-        </w:numPr>
+        </w:rPr>
+        <w:t xml:space="preserve">Provide users with notifications when </w:t>
+      </w:r>
+      <w:proofErr w:type="spellStart"/>
+      <w:r>
         <w:rPr>
           <w:rFonts w:ascii="Times New Roman" w:hAnsi="Times New Roman" w:cs="Times New Roman"/>
-          <w:sz w:val="24"/>
-          <w:szCs w:val="24"/>
-        </w:rPr>
-      </w:pPr>
+        </w:rPr>
+        <w:t>wishlist</w:t>
+      </w:r>
+      <w:proofErr w:type="spellEnd"/>
       <w:r>
         <w:rPr>
           <w:rFonts w:ascii="Times New Roman" w:hAnsi="Times New Roman" w:cs="Times New Roman"/>
-          <w:sz w:val="24"/>
-          <w:szCs w:val="24"/>
-        </w:rPr>
-        <w:t xml:space="preserve">The app provides notifications to keep garage owners informed about upcoming </w:t>
-      </w:r>
-      <w:r>
-        <w:rPr>
-          <w:rFonts w:ascii="Times New Roman" w:hAnsi="Times New Roman" w:cs="Times New Roman"/>
-          <w:sz w:val="24"/>
-          <w:szCs w:val="24"/>
-        </w:rPr>
-        <w:t>requests</w:t>
-      </w:r>
-      <w:r>
-        <w:rPr>
-          <w:rFonts w:ascii="Times New Roman" w:hAnsi="Times New Roman" w:cs="Times New Roman"/>
-          <w:sz w:val="24"/>
-          <w:szCs w:val="24"/>
-        </w:rPr>
-        <w:t>.</w:t>
-      </w:r>
-    </w:p>
-    <w:p>
-      <w:pPr>
-        <w:pStyle w:val="NoSpacing"/>
-        <w:rPr>
-          <w:rFonts w:ascii="Times New Roman" w:hAnsi="Times New Roman" w:cs="Times New Roman"/>
-          <w:sz w:val="24"/>
-          <w:szCs w:val="24"/>
-        </w:rPr>
-      </w:pPr>
-    </w:p>
-    <w:p>
-      <w:pPr>
-        <w:pStyle w:val="NoSpacing"/>
-        <w:rPr>
-          <w:rFonts w:ascii="Times New Roman" w:hAnsi="Times New Roman" w:cs="Times New Roman"/>
-          <w:sz w:val="24"/>
-          <w:szCs w:val="24"/>
-        </w:rPr>
+        </w:rPr>
+        <w:t xml:space="preserve"> items are on sale, back in stock, or have changed in price.</w:t>
+      </w:r>
+    </w:p>
+    <w:p>
+      <w:pPr>
+        <w:spacing w:line="256" w:lineRule="auto"/>
       </w:pPr>
     </w:p>
     <w:p>
@@ -4011,371 +4310,172 @@
           <w:ilvl w:val="0"/>
           <w:numId w:val="4"/>
         </w:numPr>
+        <w:spacing w:line="256" w:lineRule="auto"/>
         <w:rPr>
           <w:rFonts w:ascii="Times New Roman" w:hAnsi="Times New Roman" w:cs="Times New Roman"/>
+        </w:rPr>
+      </w:pPr>
+      <w:r>
+        <w:rPr>
+          <w:rFonts w:ascii="Times New Roman" w:hAnsi="Times New Roman" w:cs="Times New Roman"/>
           <w:b/>
           <w:bCs/>
           <w:sz w:val="24"/>
           <w:szCs w:val="24"/>
         </w:rPr>
-      </w:pPr>
-      <w:r>
-        <w:rPr>
-          <w:rFonts w:ascii="Times New Roman" w:hAnsi="Times New Roman" w:cs="Times New Roman"/>
-          <w:b/>
-          <w:bCs/>
-          <w:sz w:val="24"/>
-          <w:szCs w:val="24"/>
-        </w:rPr>
-        <w:t>Tracking Repair:</w:t>
+        <w:t>Ratings and Reviews:</w:t>
       </w:r>
     </w:p>
     <w:p>
       <w:pPr>
         <w:pStyle w:val="ListParagraph"/>
         <w:numPr>
-          <w:ilvl w:val="0"/>
-          <w:numId w:val="12"/>
+          <w:ilvl w:val="2"/>
+          <w:numId w:val="26"/>
         </w:numPr>
+        <w:spacing w:line="256" w:lineRule="auto"/>
+        <w:jc w:val="both"/>
         <w:rPr>
           <w:rFonts w:ascii="Times New Roman" w:hAnsi="Times New Roman" w:cs="Times New Roman"/>
-          <w:sz w:val="24"/>
-          <w:szCs w:val="24"/>
         </w:rPr>
       </w:pPr>
       <w:r>
         <w:rPr>
           <w:rFonts w:ascii="Times New Roman" w:hAnsi="Times New Roman" w:cs="Times New Roman"/>
-          <w:sz w:val="24"/>
-          <w:szCs w:val="24"/>
-        </w:rPr>
-        <w:t xml:space="preserve">After confirming the services and towing requirements, the user can proceed to </w:t>
+        </w:rPr>
+        <w:t>A</w:t>
       </w:r>
       <w:r>
         <w:rPr>
           <w:rFonts w:ascii="Times New Roman" w:hAnsi="Times New Roman" w:cs="Times New Roman"/>
-          <w:sz w:val="24"/>
-          <w:szCs w:val="24"/>
-        </w:rPr>
-        <w:t>navigate to garage using garage’s location provided in app.</w:t>
+        </w:rPr>
+        <w:t xml:space="preserve">fter the </w:t>
+      </w:r>
+      <w:r>
+        <w:rPr>
+          <w:rFonts w:ascii="Times New Roman" w:hAnsi="Times New Roman" w:cs="Times New Roman"/>
+        </w:rPr>
+        <w:t>purchase</w:t>
+      </w:r>
+      <w:r>
+        <w:rPr>
+          <w:rFonts w:ascii="Times New Roman" w:hAnsi="Times New Roman" w:cs="Times New Roman"/>
+        </w:rPr>
+        <w:t xml:space="preserve"> is completed</w:t>
+      </w:r>
+      <w:r>
+        <w:rPr>
+          <w:rFonts w:ascii="Times New Roman" w:hAnsi="Times New Roman" w:cs="Times New Roman"/>
+        </w:rPr>
+        <w:t xml:space="preserve"> and the product is delivered</w:t>
+      </w:r>
+      <w:r>
+        <w:rPr>
+          <w:rFonts w:ascii="Times New Roman" w:hAnsi="Times New Roman" w:cs="Times New Roman"/>
+        </w:rPr>
+        <w:t>, the user receives a notification about the status.</w:t>
       </w:r>
     </w:p>
     <w:p>
       <w:pPr>
         <w:pStyle w:val="ListParagraph"/>
         <w:numPr>
-          <w:ilvl w:val="0"/>
-          <w:numId w:val="12"/>
+          <w:ilvl w:val="2"/>
+          <w:numId w:val="26"/>
         </w:numPr>
+        <w:spacing w:line="256" w:lineRule="auto"/>
+        <w:jc w:val="both"/>
         <w:rPr>
           <w:rFonts w:ascii="Times New Roman" w:hAnsi="Times New Roman" w:cs="Times New Roman"/>
-          <w:sz w:val="24"/>
-          <w:szCs w:val="24"/>
         </w:rPr>
       </w:pPr>
       <w:r>
         <w:rPr>
           <w:rFonts w:ascii="Times New Roman" w:hAnsi="Times New Roman" w:cs="Times New Roman"/>
-          <w:sz w:val="24"/>
-          <w:szCs w:val="24"/>
-        </w:rPr>
-        <w:t>The user can easily track the progress of their vehicle repairs by accessing the job card and viewing its status (in progress, completed, pending, cancelled).</w:t>
-      </w:r>
-    </w:p>
-    <w:p>
-      <w:pPr>
-        <w:pStyle w:val="ListParagraph"/>
-        <w:ind w:left="0"/>
+        </w:rPr>
+        <w:t xml:space="preserve">The user can provide a review and rating for the </w:t>
+      </w:r>
+      <w:r>
         <w:rPr>
           <w:rFonts w:ascii="Times New Roman" w:hAnsi="Times New Roman" w:cs="Times New Roman"/>
-          <w:sz w:val="24"/>
-          <w:szCs w:val="24"/>
-        </w:rPr>
-      </w:pPr>
+        </w:rPr>
+        <w:t>product</w:t>
+      </w:r>
+      <w:r>
+        <w:rPr>
+          <w:rFonts w:ascii="Times New Roman" w:hAnsi="Times New Roman" w:cs="Times New Roman"/>
+        </w:rPr>
+        <w:t xml:space="preserve"> based on their experience.</w:t>
+      </w:r>
     </w:p>
     <w:p>
       <w:pPr>
         <w:pStyle w:val="ListParagraph"/>
         <w:numPr>
-          <w:ilvl w:val="0"/>
-          <w:numId w:val="4"/>
+          <w:ilvl w:val="2"/>
+          <w:numId w:val="26"/>
         </w:numPr>
+        <w:spacing w:line="256" w:lineRule="auto"/>
+        <w:jc w:val="both"/>
         <w:rPr>
           <w:rFonts w:ascii="Times New Roman" w:hAnsi="Times New Roman" w:cs="Times New Roman"/>
-          <w:b/>
-          <w:bCs/>
-          <w:sz w:val="24"/>
-          <w:szCs w:val="24"/>
         </w:rPr>
       </w:pPr>
       <w:r>
         <w:rPr>
           <w:rFonts w:ascii="Times New Roman" w:hAnsi="Times New Roman" w:cs="Times New Roman"/>
-          <w:b/>
-          <w:bCs/>
-          <w:sz w:val="24"/>
-          <w:szCs w:val="24"/>
-        </w:rPr>
-        <w:t>Job Cards:</w:t>
-      </w:r>
-    </w:p>
-    <w:p>
-      <w:pPr>
-        <w:pStyle w:val="ListParagraph"/>
-        <w:numPr>
-          <w:ilvl w:val="1"/>
-          <w:numId w:val="13"/>
-        </w:numPr>
+        </w:rPr>
+        <w:t xml:space="preserve">The review is submitted and added to the </w:t>
+      </w:r>
+      <w:r>
         <w:rPr>
           <w:rFonts w:ascii="Times New Roman" w:hAnsi="Times New Roman" w:cs="Times New Roman"/>
-          <w:sz w:val="24"/>
-          <w:szCs w:val="24"/>
-        </w:rPr>
-      </w:pPr>
+        </w:rPr>
+        <w:t xml:space="preserve">product’s review section </w:t>
+      </w:r>
       <w:r>
         <w:rPr>
           <w:rFonts w:ascii="Times New Roman" w:hAnsi="Times New Roman" w:cs="Times New Roman"/>
-          <w:sz w:val="24"/>
-          <w:szCs w:val="24"/>
-        </w:rPr>
-        <w:t>Garage owners can view all the job cards and can filter them according to their statuses (pending, in progress, cancelled, completed).</w:t>
-      </w:r>
-    </w:p>
-    <w:p>
-      <w:pPr>
-        <w:pStyle w:val="ListParagraph"/>
-        <w:numPr>
-          <w:ilvl w:val="1"/>
-          <w:numId w:val="13"/>
-        </w:numPr>
-        <w:rPr>
-          <w:rFonts w:ascii="Times New Roman" w:hAnsi="Times New Roman" w:cs="Times New Roman"/>
-          <w:sz w:val="24"/>
-          <w:szCs w:val="24"/>
-        </w:rPr>
-      </w:pPr>
-      <w:r>
-        <w:rPr>
-          <w:rFonts w:ascii="Times New Roman" w:hAnsi="Times New Roman" w:cs="Times New Roman"/>
-          <w:sz w:val="24"/>
-          <w:szCs w:val="24"/>
-        </w:rPr>
-        <w:t>The job card will contain the information about the user, vehicle, requested services and cost, status, etc.</w:t>
-      </w:r>
-    </w:p>
-    <w:p>
-      <w:pPr>
-        <w:pStyle w:val="ListParagraph"/>
-        <w:rPr>
-          <w:rFonts w:ascii="Times New Roman" w:hAnsi="Times New Roman" w:cs="Times New Roman"/>
-          <w:sz w:val="24"/>
-          <w:szCs w:val="24"/>
-        </w:rPr>
-      </w:pPr>
-    </w:p>
-    <w:p>
-      <w:pPr>
-        <w:pStyle w:val="ListParagraph"/>
-        <w:numPr>
-          <w:ilvl w:val="0"/>
-          <w:numId w:val="4"/>
-        </w:numPr>
-        <w:rPr>
-          <w:rFonts w:ascii="Times New Roman" w:hAnsi="Times New Roman" w:cs="Times New Roman"/>
-          <w:b/>
-          <w:bCs/>
-          <w:sz w:val="24"/>
-          <w:szCs w:val="24"/>
-        </w:rPr>
-      </w:pPr>
-      <w:r>
-        <w:rPr>
-          <w:rFonts w:ascii="Times New Roman" w:hAnsi="Times New Roman" w:cs="Times New Roman"/>
-          <w:b/>
-          <w:bCs/>
-          <w:sz w:val="24"/>
-          <w:szCs w:val="24"/>
-        </w:rPr>
-        <w:t xml:space="preserve">Analytics and Insights: </w:t>
-      </w:r>
-    </w:p>
-    <w:p>
-      <w:pPr>
-        <w:pStyle w:val="ListParagraph"/>
-        <w:numPr>
-          <w:ilvl w:val="1"/>
-          <w:numId w:val="14"/>
-        </w:numPr>
-        <w:rPr>
-          <w:rFonts w:ascii="Times New Roman" w:hAnsi="Times New Roman" w:cs="Times New Roman"/>
-          <w:sz w:val="24"/>
-          <w:szCs w:val="24"/>
-        </w:rPr>
-      </w:pPr>
-      <w:r>
-        <w:rPr>
-          <w:rFonts w:ascii="Times New Roman" w:hAnsi="Times New Roman" w:cs="Times New Roman"/>
-          <w:sz w:val="24"/>
-          <w:szCs w:val="24"/>
-        </w:rPr>
-        <w:t>Garage owners can view valuable insights of their garage which will help them to enhance their services.</w:t>
-      </w:r>
-    </w:p>
-    <w:p>
-      <w:pPr>
-        <w:pStyle w:val="ListParagraph"/>
-        <w:numPr>
-          <w:ilvl w:val="1"/>
-          <w:numId w:val="14"/>
-        </w:numPr>
-        <w:rPr>
-          <w:rFonts w:ascii="Times New Roman" w:hAnsi="Times New Roman" w:cs="Times New Roman"/>
-          <w:sz w:val="24"/>
-          <w:szCs w:val="24"/>
-        </w:rPr>
-      </w:pPr>
-      <w:r>
-        <w:rPr>
-          <w:rFonts w:ascii="Times New Roman" w:hAnsi="Times New Roman" w:cs="Times New Roman"/>
-          <w:sz w:val="24"/>
-          <w:szCs w:val="24"/>
-        </w:rPr>
-        <w:t>Garage owners can get insights about the number of the number of job cards (in progress, completed, pending).</w:t>
-      </w:r>
-    </w:p>
-    <w:p>
-      <w:pPr>
-        <w:pStyle w:val="ListParagraph"/>
-        <w:ind w:left="360"/>
-        <w:rPr>
-          <w:rFonts w:ascii="Times New Roman" w:hAnsi="Times New Roman" w:cs="Times New Roman"/>
-          <w:sz w:val="24"/>
-          <w:szCs w:val="24"/>
-        </w:rPr>
-      </w:pPr>
-    </w:p>
-    <w:p>
-      <w:pPr>
-        <w:pStyle w:val="ListParagraph"/>
-        <w:numPr>
-          <w:ilvl w:val="0"/>
-          <w:numId w:val="4"/>
-        </w:numPr>
-        <w:rPr>
-          <w:rFonts w:ascii="Times New Roman" w:hAnsi="Times New Roman" w:cs="Times New Roman"/>
-          <w:b/>
-          <w:bCs/>
-          <w:sz w:val="24"/>
-          <w:szCs w:val="24"/>
-        </w:rPr>
-      </w:pPr>
-      <w:r>
-        <w:rPr>
-          <w:rFonts w:ascii="Times New Roman" w:hAnsi="Times New Roman" w:cs="Times New Roman"/>
-          <w:b/>
-          <w:bCs/>
-          <w:sz w:val="24"/>
-          <w:szCs w:val="24"/>
-        </w:rPr>
-        <w:t xml:space="preserve">Sharing Reviews: </w:t>
-      </w:r>
-    </w:p>
-    <w:p>
-      <w:pPr>
-        <w:pStyle w:val="ListParagraph"/>
-        <w:numPr>
-          <w:ilvl w:val="1"/>
-          <w:numId w:val="15"/>
-        </w:numPr>
-        <w:rPr>
-          <w:rFonts w:ascii="Times New Roman" w:hAnsi="Times New Roman" w:cs="Times New Roman"/>
-          <w:sz w:val="24"/>
-          <w:szCs w:val="24"/>
-        </w:rPr>
-      </w:pPr>
-      <w:r>
-        <w:rPr>
-          <w:rFonts w:ascii="Times New Roman" w:hAnsi="Times New Roman" w:cs="Times New Roman"/>
-          <w:sz w:val="24"/>
-          <w:szCs w:val="24"/>
-        </w:rPr>
-        <w:t>After the repair is completed, the user receives a notification about the status.</w:t>
-      </w:r>
-    </w:p>
-    <w:p>
-      <w:pPr>
-        <w:pStyle w:val="ListParagraph"/>
-        <w:numPr>
-          <w:ilvl w:val="1"/>
-          <w:numId w:val="15"/>
-        </w:numPr>
-        <w:rPr>
-          <w:rFonts w:ascii="Times New Roman" w:hAnsi="Times New Roman" w:cs="Times New Roman"/>
-          <w:sz w:val="24"/>
-          <w:szCs w:val="24"/>
-        </w:rPr>
-      </w:pPr>
-      <w:r>
-        <w:rPr>
-          <w:rFonts w:ascii="Times New Roman" w:hAnsi="Times New Roman" w:cs="Times New Roman"/>
-          <w:sz w:val="24"/>
-          <w:szCs w:val="24"/>
-        </w:rPr>
-        <w:t>The user can provide a review and rating for the garage based on their experience.</w:t>
-      </w:r>
-    </w:p>
-    <w:p>
-      <w:pPr>
-        <w:pStyle w:val="ListParagraph"/>
-        <w:numPr>
-          <w:ilvl w:val="1"/>
-          <w:numId w:val="15"/>
-        </w:numPr>
-        <w:rPr>
-          <w:rFonts w:ascii="Times New Roman" w:hAnsi="Times New Roman" w:cs="Times New Roman"/>
-          <w:sz w:val="24"/>
-          <w:szCs w:val="24"/>
-        </w:rPr>
-      </w:pPr>
-      <w:r>
-        <w:rPr>
-          <w:rFonts w:ascii="Times New Roman" w:hAnsi="Times New Roman" w:cs="Times New Roman"/>
-          <w:sz w:val="24"/>
-          <w:szCs w:val="24"/>
-        </w:rPr>
-        <w:t>The review is submitted and added to the garage's profile for other users to see.</w:t>
-      </w:r>
-    </w:p>
-    <w:p>
-      <w:pPr>
+        </w:rPr>
+        <w:t>for other users to see.</w:t>
+      </w:r>
+    </w:p>
+    <w:p>
+      <w:pPr>
+        <w:spacing w:line="276" w:lineRule="auto"/>
+        <w:rPr>
+          <w:sz w:val="28"/>
+          <w:szCs w:val="28"/>
+        </w:rPr>
+      </w:pPr>
+    </w:p>
+    <w:p>
+      <w:pPr>
+        <w:spacing w:after="0"/>
         <w:ind w:left="10"/>
         <w:rPr>
           <w:b/>
           <w:bCs/>
-          <w:szCs w:val="24"/>
-        </w:rPr>
-      </w:pPr>
-      <w:r>
-        <w:rPr>
-          <w:b/>
-          <w:bCs/>
-          <w:szCs w:val="24"/>
-        </w:rPr>
-        <w:lastRenderedPageBreak/>
+          <w:sz w:val="28"/>
+          <w:szCs w:val="28"/>
+        </w:rPr>
+      </w:pPr>
+      <w:r>
+        <w:rPr>
+          <w:b/>
+          <w:bCs/>
+          <w:sz w:val="28"/>
+          <w:szCs w:val="28"/>
+        </w:rPr>
         <w:t>Advantages of Proposed System:</w:t>
       </w:r>
     </w:p>
     <w:p>
       <w:pPr>
+        <w:spacing w:after="0"/>
         <w:ind w:left="20"/>
-        <w:rPr>
-          <w:szCs w:val="24"/>
-        </w:rPr>
-      </w:pPr>
-      <w:r>
-        <w:rPr>
-          <w:szCs w:val="24"/>
-        </w:rPr>
+      </w:pPr>
+      <w:r>
         <w:t>Some of the Advantages of the Proposed System:</w:t>
       </w:r>
     </w:p>
@@ -4386,20 +4486,18 @@
           <w:ilvl w:val="0"/>
           <w:numId w:val="16"/>
         </w:numPr>
+        <w:spacing w:line="256" w:lineRule="auto"/>
         <w:ind w:left="360"/>
+        <w:jc w:val="both"/>
         <w:rPr>
           <w:rFonts w:ascii="Times New Roman" w:hAnsi="Times New Roman" w:cs="Times New Roman"/>
-          <w:sz w:val="24"/>
-          <w:szCs w:val="24"/>
         </w:rPr>
       </w:pPr>
       <w:r>
         <w:rPr>
           <w:rFonts w:ascii="Times New Roman" w:hAnsi="Times New Roman" w:cs="Times New Roman"/>
-          <w:sz w:val="24"/>
-          <w:szCs w:val="24"/>
-        </w:rPr>
-        <w:t>Specific capability-based garage search.</w:t>
+        </w:rPr>
+        <w:t>View product in both 3D and AR view in workspaces.</w:t>
       </w:r>
     </w:p>
     <w:p>
@@ -4409,20 +4507,36 @@
           <w:ilvl w:val="0"/>
           <w:numId w:val="16"/>
         </w:numPr>
+        <w:spacing w:line="256" w:lineRule="auto"/>
         <w:ind w:left="360"/>
+        <w:jc w:val="both"/>
         <w:rPr>
           <w:rFonts w:ascii="Times New Roman" w:hAnsi="Times New Roman" w:cs="Times New Roman"/>
-          <w:sz w:val="24"/>
-          <w:szCs w:val="24"/>
         </w:rPr>
       </w:pPr>
       <w:r>
         <w:rPr>
           <w:rFonts w:ascii="Times New Roman" w:hAnsi="Times New Roman" w:cs="Times New Roman"/>
-          <w:sz w:val="24"/>
-          <w:szCs w:val="24"/>
-        </w:rPr>
-        <w:t>Garage profiles with detailed information.</w:t>
+        </w:rPr>
+        <w:t>Products are available</w:t>
+      </w:r>
+      <w:r>
+        <w:rPr>
+          <w:rFonts w:ascii="Times New Roman" w:hAnsi="Times New Roman" w:cs="Times New Roman"/>
+        </w:rPr>
+        <w:t xml:space="preserve"> with detailed information</w:t>
+      </w:r>
+      <w:r>
+        <w:rPr>
+          <w:rFonts w:ascii="Times New Roman" w:hAnsi="Times New Roman" w:cs="Times New Roman"/>
+        </w:rPr>
+        <w:t xml:space="preserve"> like dimensions, colours, etc</w:t>
+      </w:r>
+      <w:r>
+        <w:rPr>
+          <w:rFonts w:ascii="Times New Roman" w:hAnsi="Times New Roman" w:cs="Times New Roman"/>
+        </w:rPr>
+        <w:t>.</w:t>
       </w:r>
     </w:p>
     <w:p>
@@ -4432,20 +4546,24 @@
           <w:ilvl w:val="0"/>
           <w:numId w:val="16"/>
         </w:numPr>
+        <w:spacing w:line="256" w:lineRule="auto"/>
         <w:ind w:left="360"/>
+        <w:jc w:val="both"/>
         <w:rPr>
           <w:rFonts w:ascii="Times New Roman" w:hAnsi="Times New Roman" w:cs="Times New Roman"/>
-          <w:sz w:val="24"/>
-          <w:szCs w:val="24"/>
         </w:rPr>
       </w:pPr>
       <w:r>
         <w:rPr>
           <w:rFonts w:ascii="Times New Roman" w:hAnsi="Times New Roman" w:cs="Times New Roman"/>
-          <w:sz w:val="24"/>
-          <w:szCs w:val="24"/>
-        </w:rPr>
-        <w:t>Convenient job card management.</w:t>
+        </w:rPr>
+        <w:t xml:space="preserve">Convenient </w:t>
+      </w:r>
+      <w:r>
+        <w:rPr>
+          <w:rFonts w:ascii="Times New Roman" w:hAnsi="Times New Roman" w:cs="Times New Roman"/>
+        </w:rPr>
+        <w:t>customer support and real-time notifications.</w:t>
       </w:r>
     </w:p>
     <w:p>
@@ -4455,20 +4573,18 @@
           <w:ilvl w:val="0"/>
           <w:numId w:val="16"/>
         </w:numPr>
+        <w:spacing w:line="256" w:lineRule="auto"/>
         <w:ind w:left="360"/>
+        <w:jc w:val="both"/>
         <w:rPr>
           <w:rFonts w:ascii="Times New Roman" w:hAnsi="Times New Roman" w:cs="Times New Roman"/>
-          <w:sz w:val="24"/>
-          <w:szCs w:val="24"/>
         </w:rPr>
       </w:pPr>
       <w:r>
         <w:rPr>
           <w:rFonts w:ascii="Times New Roman" w:hAnsi="Times New Roman" w:cs="Times New Roman"/>
-          <w:sz w:val="24"/>
-          <w:szCs w:val="24"/>
-        </w:rPr>
-        <w:t>Detailed analytics and insights for garage owners.</w:t>
+        </w:rPr>
+        <w:t>Integration of third-party APIs and libraries, enhances user experience.</w:t>
       </w:r>
     </w:p>
     <w:p>
@@ -4478,82 +4594,118 @@
           <w:ilvl w:val="0"/>
           <w:numId w:val="16"/>
         </w:numPr>
+        <w:spacing w:line="256" w:lineRule="auto"/>
         <w:ind w:left="360"/>
+        <w:jc w:val="both"/>
         <w:rPr>
           <w:rFonts w:ascii="Times New Roman" w:hAnsi="Times New Roman" w:cs="Times New Roman"/>
-          <w:sz w:val="24"/>
-          <w:szCs w:val="24"/>
         </w:rPr>
       </w:pPr>
       <w:r>
         <w:rPr>
           <w:rFonts w:ascii="Times New Roman" w:hAnsi="Times New Roman" w:cs="Times New Roman"/>
-          <w:sz w:val="24"/>
-          <w:szCs w:val="24"/>
-        </w:rPr>
-        <w:t>Integration of third-party APIs and libraries, enhances user experience.</w:t>
-      </w:r>
-    </w:p>
-    <w:p>
-      <w:pPr>
-        <w:pStyle w:val="ListParagraph"/>
+        </w:rPr>
+        <w:t>Enhanced user trust and confidence results in retaining customers.</w:t>
+      </w:r>
+    </w:p>
+    <w:p>
+      <w:pPr>
+        <w:spacing w:line="276" w:lineRule="auto"/>
+      </w:pPr>
+    </w:p>
+    <w:p>
+      <w:pPr>
+        <w:spacing w:after="0" w:line="276" w:lineRule="auto"/>
+        <w:ind w:left="10"/>
+        <w:rPr>
+          <w:b/>
+          <w:bCs/>
+          <w:sz w:val="28"/>
+          <w:szCs w:val="28"/>
+        </w:rPr>
+      </w:pPr>
+      <w:r>
+        <w:rPr>
+          <w:b/>
+          <w:bCs/>
+          <w:sz w:val="28"/>
+          <w:szCs w:val="28"/>
+        </w:rPr>
+        <w:t>Technologies required for developing the proposed system:</w:t>
+      </w:r>
+    </w:p>
+    <w:p>
+      <w:pPr>
+        <w:pStyle w:val="NoSpacing"/>
         <w:numPr>
           <w:ilvl w:val="0"/>
-          <w:numId w:val="16"/>
+          <w:numId w:val="20"/>
         </w:numPr>
-        <w:ind w:left="360"/>
+        <w:ind w:left="0"/>
+        <w:jc w:val="both"/>
         <w:rPr>
           <w:rFonts w:ascii="Times New Roman" w:hAnsi="Times New Roman" w:cs="Times New Roman"/>
-          <w:sz w:val="24"/>
-          <w:szCs w:val="24"/>
         </w:rPr>
       </w:pPr>
       <w:r>
         <w:rPr>
           <w:rFonts w:ascii="Times New Roman" w:hAnsi="Times New Roman" w:cs="Times New Roman"/>
-          <w:sz w:val="24"/>
-          <w:szCs w:val="24"/>
-        </w:rPr>
-        <w:t>Enhanced user trust and confidence results in retaining customers.</w:t>
-      </w:r>
-    </w:p>
-    <w:p>
-      <w:pPr>
-        <w:rPr>
-          <w:szCs w:val="24"/>
-        </w:rPr>
-      </w:pPr>
-    </w:p>
-    <w:p>
-      <w:pPr>
-        <w:ind w:left="10"/>
-        <w:rPr>
-          <w:b/>
-          <w:bCs/>
-          <w:szCs w:val="24"/>
-        </w:rPr>
-      </w:pPr>
-      <w:r>
-        <w:rPr>
-          <w:b/>
-          <w:bCs/>
-          <w:szCs w:val="24"/>
-        </w:rPr>
-        <w:t>Technologies required for developing the proposed system:</w:t>
-      </w:r>
-    </w:p>
-    <w:p>
-      <w:pPr>
-        <w:pStyle w:val="ListParagraph"/>
+          <w:b/>
+          <w:bCs/>
+        </w:rPr>
+        <w:t>Android Studio (Kotlin):</w:t>
+      </w:r>
+      <w:r>
+        <w:rPr>
+          <w:rFonts w:ascii="Times New Roman" w:hAnsi="Times New Roman" w:cs="Times New Roman"/>
+        </w:rPr>
+        <w:t xml:space="preserve"> Android Studio is the official Integrated Development</w:t>
+      </w:r>
+      <w:r>
+        <w:rPr>
+          <w:rFonts w:ascii="Times New Roman" w:hAnsi="Times New Roman" w:cs="Times New Roman"/>
+        </w:rPr>
+        <w:t xml:space="preserve"> </w:t>
+      </w:r>
+      <w:r>
+        <w:rPr>
+          <w:rFonts w:ascii="Times New Roman" w:hAnsi="Times New Roman" w:cs="Times New Roman"/>
+        </w:rPr>
+        <w:t>Environment (IDE) for Google’s Android operating system. Whereas, Kotlin is a High-level programming language. It is one of the official languages of google supported for</w:t>
+      </w:r>
+      <w:r>
+        <w:rPr>
+          <w:rFonts w:ascii="Times New Roman" w:hAnsi="Times New Roman" w:cs="Times New Roman"/>
+        </w:rPr>
+        <w:t xml:space="preserve"> </w:t>
+      </w:r>
+      <w:r>
+        <w:rPr>
+          <w:rFonts w:ascii="Times New Roman" w:hAnsi="Times New Roman" w:cs="Times New Roman"/>
+        </w:rPr>
+        <w:t xml:space="preserve">android application development. </w:t>
+      </w:r>
+    </w:p>
+    <w:p>
+      <w:pPr>
+        <w:pStyle w:val="NoSpacing"/>
+        <w:jc w:val="both"/>
+        <w:rPr>
+          <w:rFonts w:ascii="Times New Roman" w:hAnsi="Times New Roman" w:cs="Times New Roman"/>
+        </w:rPr>
+      </w:pPr>
+    </w:p>
+    <w:p>
+      <w:pPr>
+        <w:pStyle w:val="NoSpacing"/>
         <w:numPr>
           <w:ilvl w:val="0"/>
-          <w:numId w:val="17"/>
+          <w:numId w:val="20"/>
         </w:numPr>
-        <w:spacing w:after="0"/>
+        <w:ind w:left="0"/>
+        <w:jc w:val="both"/>
         <w:rPr>
           <w:rFonts w:ascii="Times New Roman" w:hAnsi="Times New Roman" w:cs="Times New Roman"/>
-          <w:sz w:val="24"/>
-          <w:szCs w:val="24"/>
         </w:rPr>
       </w:pPr>
       <w:r>
@@ -4561,62 +4713,55 @@
           <w:rFonts w:ascii="Times New Roman" w:hAnsi="Times New Roman" w:cs="Times New Roman"/>
           <w:b/>
           <w:bCs/>
-          <w:sz w:val="24"/>
-          <w:szCs w:val="24"/>
-        </w:rPr>
-        <w:t>Android Studio (Kotlin):</w:t>
+        </w:rPr>
+        <w:t>Firebase:</w:t>
       </w:r>
       <w:r>
         <w:rPr>
           <w:rFonts w:ascii="Times New Roman" w:hAnsi="Times New Roman" w:cs="Times New Roman"/>
-          <w:sz w:val="24"/>
-          <w:szCs w:val="24"/>
-        </w:rPr>
-        <w:t xml:space="preserve"> Android Studio is the official Integrated Development Environment (IDE) for Google’s Android operating system. Whereas, Kotlin is a High-level programming language. It is one of the official languages of google supported for android application development.</w:t>
-      </w:r>
-    </w:p>
-    <w:p>
-      <w:pPr>
-        <w:pStyle w:val="NoSpacing"/>
+        </w:rPr>
+        <w:t xml:space="preserve"> Firebase is a comprehensive mobile and web development platform offered by</w:t>
+      </w:r>
+      <w:r>
         <w:rPr>
           <w:rFonts w:ascii="Times New Roman" w:hAnsi="Times New Roman" w:cs="Times New Roman"/>
-          <w:sz w:val="24"/>
-          <w:szCs w:val="24"/>
-        </w:rPr>
-      </w:pPr>
-    </w:p>
-    <w:p>
-      <w:pPr>
-        <w:pStyle w:val="ListParagraph"/>
-        <w:numPr>
-          <w:ilvl w:val="0"/>
-          <w:numId w:val="17"/>
-        </w:numPr>
+        </w:rPr>
+        <w:t xml:space="preserve"> </w:t>
+      </w:r>
+      <w:r>
         <w:rPr>
           <w:rFonts w:ascii="Times New Roman" w:hAnsi="Times New Roman" w:cs="Times New Roman"/>
-          <w:sz w:val="24"/>
-          <w:szCs w:val="24"/>
-        </w:rPr>
-      </w:pPr>
+        </w:rPr>
+        <w:t>Google. It provides a range of backend services including database management, user</w:t>
+      </w:r>
       <w:r>
         <w:rPr>
           <w:rFonts w:ascii="Times New Roman" w:hAnsi="Times New Roman" w:cs="Times New Roman"/>
-          <w:b/>
-          <w:bCs/>
-          <w:sz w:val="24"/>
-          <w:szCs w:val="24"/>
-        </w:rPr>
-        <w:t>Firebase</w:t>
+        </w:rPr>
+        <w:t xml:space="preserve"> </w:t>
       </w:r>
       <w:r>
         <w:rPr>
           <w:rFonts w:ascii="Times New Roman" w:hAnsi="Times New Roman" w:cs="Times New Roman"/>
-          <w:sz w:val="24"/>
-          <w:szCs w:val="24"/>
-        </w:rPr>
-        <w:t>: Firebase is a comprehensive mobile and web development platform offered by Google. It provides a range of backend services including database management, user authentication, cloud storage, and hosting. Firebase simplifies the development process by offering ready-to-use tools and infrastructure for building high-quality applications.</w:t>
-      </w:r>
-    </w:p>
+        </w:rPr>
+        <w:t>authentication, cloud storage, and hosting. Firebase simplifies the development process</w:t>
+      </w:r>
+      <w:r>
+        <w:rPr>
+          <w:rFonts w:ascii="Times New Roman" w:hAnsi="Times New Roman" w:cs="Times New Roman"/>
+        </w:rPr>
+        <w:t xml:space="preserve"> </w:t>
+      </w:r>
+      <w:r>
+        <w:rPr>
+          <w:rFonts w:ascii="Times New Roman" w:hAnsi="Times New Roman" w:cs="Times New Roman"/>
+        </w:rPr>
+        <w:t>by offering ready-to-use tools and infrastructure for building high-quality applications.</w:t>
+      </w:r>
+    </w:p>
+    <w:p/>
+    <w:p/>
+    <w:p/>
     <w:p>
       <w:pPr>
         <w:ind w:left="0" w:firstLine="0"/>
@@ -4810,7 +4955,6 @@
         <w:jc w:val="center"/>
       </w:pPr>
       <w:r>
-        <w:lastRenderedPageBreak/>
         <w:t>System Analysis</w:t>
       </w:r>
     </w:p>
@@ -4908,7 +5052,15 @@
         <w:ind w:left="10" w:right="13"/>
       </w:pPr>
       <w:r>
-        <w:t>Actors in a use case diagram represent entities playing specific roles in a system, typically reflecting real-world user roles. They interact with use cases and should include stakeholders relevant to the system's functionality, with no need to depict entities that don't impact the modeled functions. Actors are symbolized as stick figures outside the system's boundary.</w:t>
+        <w:t xml:space="preserve">Actors in a use case diagram represent entities playing specific roles in a system, typically reflecting real-world user roles. They interact with use cases and should include stakeholders relevant to the system's functionality, with no need to depict entities that don't impact the </w:t>
+      </w:r>
+      <w:proofErr w:type="spellStart"/>
+      <w:r>
+        <w:t>modeled</w:t>
+      </w:r>
+      <w:proofErr w:type="spellEnd"/>
+      <w:r>
+        <w:t xml:space="preserve"> functions. Actors are symbolized as stick figures outside the system's boundary.</w:t>
       </w:r>
     </w:p>
     <w:p>
@@ -4996,7 +5148,11 @@
         <w:ind w:left="10" w:right="13"/>
       </w:pPr>
       <w:r>
-        <w:t>The system boundary, depicted as a rectangle in a use case diagram, defines the system's scope by encapsulating all its use cases. It distinguishes the system's internal operations from its interactions with the external environment, aiding in effective system communication and design.</w:t>
+        <w:t xml:space="preserve">The system boundary, depicted as a rectangle in a use case diagram, defines the system's scope by encapsulating all its use cases. It distinguishes the system's internal operations from </w:t>
+      </w:r>
+      <w:r>
+        <w:lastRenderedPageBreak/>
+        <w:t>its interactions with the external environment, aiding in effective system communication and design.</w:t>
       </w:r>
     </w:p>
     <w:p>
@@ -5087,11 +5243,7 @@
         <w:t>behaviour</w:t>
       </w:r>
       <w:r>
-        <w:t xml:space="preserve"> of the extension use case can be inserted into the extended use case under specific conditions. This relationship is useful for depicting optional functionalities that come after a particular use case. It's represented by a dashed arrow from the optional use case to the base use case, with </w:t>
-      </w:r>
-      <w:r>
-        <w:lastRenderedPageBreak/>
-        <w:t>the label "«extend»," making it clear that the extended use case can be enhanced or extended with additional features when certain conditions are met.</w:t>
+        <w:t xml:space="preserve"> of the extension use case can be inserted into the extended use case under specific conditions. This relationship is useful for depicting optional functionalities that come after a particular use case. It's represented by a dashed arrow from the optional use case to the base use case, with the label "«extend»," making it clear that the extended use case can be enhanced or extended with additional features when certain conditions are met.</w:t>
       </w:r>
     </w:p>
     <w:p>
@@ -5254,8 +5406,13 @@
         <w:ind w:right="13" w:hanging="360"/>
       </w:pPr>
       <w:r>
-        <w:t>Creating Jobcard</w:t>
-      </w:r>
+        <w:t xml:space="preserve">Creating </w:t>
+      </w:r>
+      <w:proofErr w:type="spellStart"/>
+      <w:r>
+        <w:t>Jobcard</w:t>
+      </w:r>
+      <w:proofErr w:type="spellEnd"/>
     </w:p>
     <w:p>
       <w:pPr>
@@ -5266,8 +5423,13 @@
         <w:ind w:right="13" w:hanging="360"/>
       </w:pPr>
       <w:r>
-        <w:t>Updating Jobcard</w:t>
-      </w:r>
+        <w:t xml:space="preserve">Updating </w:t>
+      </w:r>
+      <w:proofErr w:type="spellStart"/>
+      <w:r>
+        <w:t>Jobcard</w:t>
+      </w:r>
+      <w:proofErr w:type="spellEnd"/>
     </w:p>
     <w:p>
       <w:pPr>
@@ -5278,8 +5440,13 @@
         <w:ind w:right="13" w:hanging="360"/>
       </w:pPr>
       <w:r>
-        <w:t>Reviewing Jobcard</w:t>
-      </w:r>
+        <w:t xml:space="preserve">Reviewing </w:t>
+      </w:r>
+      <w:proofErr w:type="spellStart"/>
+      <w:r>
+        <w:t>Jobcard</w:t>
+      </w:r>
+      <w:proofErr w:type="spellEnd"/>
     </w:p>
     <w:p>
       <w:pPr>
@@ -5290,7 +5457,15 @@
         <w:ind w:right="13" w:hanging="360"/>
       </w:pPr>
       <w:r>
-        <w:t>Making Jobcard Payment</w:t>
+        <w:t xml:space="preserve">Making </w:t>
+      </w:r>
+      <w:proofErr w:type="spellStart"/>
+      <w:r>
+        <w:t>Jobcard</w:t>
+      </w:r>
+      <w:proofErr w:type="spellEnd"/>
+      <w:r>
+        <w:t xml:space="preserve"> Payment</w:t>
       </w:r>
     </w:p>
     <w:p>
@@ -5467,6 +5642,7 @@
           <w:noProof/>
           <w:szCs w:val="24"/>
         </w:rPr>
+        <w:lastRenderedPageBreak/>
         <w:drawing>
           <wp:anchor distT="0" distB="0" distL="114300" distR="114300" simplePos="0" relativeHeight="251661312" behindDoc="0" locked="0" layoutInCell="1" allowOverlap="1" wp14:anchorId="5456AF1E" wp14:editId="2403EC7E">
             <wp:simplePos x="0" y="0"/>
@@ -5626,7 +5802,6 @@
           <w:szCs w:val="36"/>
           <w:u w:val="single"/>
         </w:rPr>
-        <w:lastRenderedPageBreak/>
         <w:t>Activity Diagram</w:t>
       </w:r>
     </w:p>
@@ -5637,7 +5812,19 @@
         <w:ind w:left="10" w:firstLine="710"/>
       </w:pPr>
       <w:r>
-        <w:t xml:space="preserve">Activity diagrams, akin to flowcharts, depict the sequence of actions or control flow within a system, commonly used in business process modeling and describing use case steps. They feature sequential and concurrent activities, with a defined start (initial state) and end (final state). These diagrams employ symbols for activities, flows, decisions, guards, merge points, time events, and more, enabling comprehensive visualization of intricate processes and system </w:t>
+        <w:t xml:space="preserve">Activity diagrams, akin to flowcharts, depict the sequence of actions or control flow within a system, commonly used in business process </w:t>
+      </w:r>
+      <w:proofErr w:type="spellStart"/>
+      <w:r>
+        <w:t>modeling</w:t>
+      </w:r>
+      <w:proofErr w:type="spellEnd"/>
+      <w:r>
+        <w:t xml:space="preserve"> and describing use case steps. They feature sequential and concurrent activities, with a defined start (initial state) and end (final state). These diagrams employ symbols for activities, flows, decisions, guards, merge </w:t>
+      </w:r>
+      <w:r>
+        <w:lastRenderedPageBreak/>
+        <w:t xml:space="preserve">points, time events, and more, enabling comprehensive visualization of intricate processes and system </w:t>
       </w:r>
       <w:r>
         <w:t>behaviours</w:t>
@@ -5888,6 +6075,7 @@
           <w:szCs w:val="24"/>
         </w:rPr>
       </w:pPr>
+      <w:proofErr w:type="spellStart"/>
       <w:r>
         <w:rPr>
           <w:b/>
@@ -5897,6 +6085,7 @@
         </w:rPr>
         <w:t>Swimlanes</w:t>
       </w:r>
+      <w:proofErr w:type="spellEnd"/>
       <w:r>
         <w:rPr>
           <w:b/>
@@ -6191,7 +6380,21 @@
         <w:rPr>
           <w:szCs w:val="24"/>
         </w:rPr>
-        <w:t>In a traditional SQL database, ERD diagrams are used to represent the structure of the data with entities (tables) and their relationships. However, in NoSQL databases, which include document-oriented databases like Firebase Firestore, graph databases, and key-value stores, the data structure is quite different.</w:t>
+        <w:t xml:space="preserve">In a traditional SQL database, ERD diagrams are used to represent the structure of the data with entities (tables) and their relationships. However, in NoSQL databases, which include document-oriented databases like Firebase </w:t>
+      </w:r>
+      <w:proofErr w:type="spellStart"/>
+      <w:r>
+        <w:rPr>
+          <w:szCs w:val="24"/>
+        </w:rPr>
+        <w:t>Firestore</w:t>
+      </w:r>
+      <w:proofErr w:type="spellEnd"/>
+      <w:r>
+        <w:rPr>
+          <w:szCs w:val="24"/>
+        </w:rPr>
+        <w:t>, graph databases, and key-value stores, the data structure is quite different.</w:t>
       </w:r>
       <w:r>
         <w:rPr>
@@ -6254,7 +6457,21 @@
         <w:rPr>
           <w:szCs w:val="24"/>
         </w:rPr>
-        <w:t>In NoSQL databases, entities are typically organized as collections in document-based databases. These collections serve as containers for related data, similar to how tables represent entities in SQL databases. This flexible schema approach allows for the storage of diverse data structures within each collection, offering adaptability in data modeling.</w:t>
+        <w:t xml:space="preserve">In NoSQL databases, entities are typically organized as collections in document-based databases. These collections serve as containers for related data, similar to how tables represent entities in SQL databases. This flexible schema approach allows for the storage of diverse data structures within each collection, offering adaptability in data </w:t>
+      </w:r>
+      <w:proofErr w:type="spellStart"/>
+      <w:r>
+        <w:rPr>
+          <w:szCs w:val="24"/>
+        </w:rPr>
+        <w:t>modeling</w:t>
+      </w:r>
+      <w:proofErr w:type="spellEnd"/>
+      <w:r>
+        <w:rPr>
+          <w:szCs w:val="24"/>
+        </w:rPr>
+        <w:t>.</w:t>
       </w:r>
     </w:p>
     <w:p>
@@ -6515,7 +6732,21 @@
         <w:rPr>
           <w:szCs w:val="24"/>
         </w:rPr>
-        <w:t>A class diagram is a fundamental concept in object-oriented modeling and design, often used in software engineering to represent the structure and relationships of classes within a system. Given your background in Android development using Kotlin and Google Firebase, class diagrams can be a useful tool for visualizing the architecture of your Android applications.</w:t>
+        <w:t xml:space="preserve">A class diagram is a fundamental concept in object-oriented </w:t>
+      </w:r>
+      <w:proofErr w:type="spellStart"/>
+      <w:r>
+        <w:rPr>
+          <w:szCs w:val="24"/>
+        </w:rPr>
+        <w:t>modeling</w:t>
+      </w:r>
+      <w:proofErr w:type="spellEnd"/>
+      <w:r>
+        <w:rPr>
+          <w:szCs w:val="24"/>
+        </w:rPr>
+        <w:t xml:space="preserve"> and design, often used in software engineering to represent the structure and relationships of classes within a system. Given your background in Android development using Kotlin and Google Firebase, class diagrams can be a useful tool for visualizing the architecture of your Android applications.</w:t>
       </w:r>
     </w:p>
     <w:p>
@@ -6715,7 +6946,21 @@
         <w:rPr>
           <w:szCs w:val="24"/>
         </w:rPr>
-        <w:t>In object-oriented programming and UML (Unified Modeling Language), there are several types of associations that represent different kinds of relationships between classes. Here are some common types of associations:</w:t>
+        <w:t xml:space="preserve">In object-oriented programming and UML (Unified </w:t>
+      </w:r>
+      <w:proofErr w:type="spellStart"/>
+      <w:r>
+        <w:rPr>
+          <w:szCs w:val="24"/>
+        </w:rPr>
+        <w:t>Modeling</w:t>
+      </w:r>
+      <w:proofErr w:type="spellEnd"/>
+      <w:r>
+        <w:rPr>
+          <w:szCs w:val="24"/>
+        </w:rPr>
+        <w:t xml:space="preserve"> Language), there are several types of associations that represent different kinds of relationships between classes. Here are some common types of associations:</w:t>
       </w:r>
     </w:p>
     <w:p>
@@ -7171,7 +7416,21 @@
         <w:rPr>
           <w:szCs w:val="24"/>
         </w:rPr>
-        <w:t>A sequence diagram is a UML (Unified Modeling Language) diagram that provides a detailed view of how various components or objects in a software system interact with each other.</w:t>
+        <w:t xml:space="preserve">A sequence diagram is a UML (Unified </w:t>
+      </w:r>
+      <w:proofErr w:type="spellStart"/>
+      <w:r>
+        <w:rPr>
+          <w:szCs w:val="24"/>
+        </w:rPr>
+        <w:t>Modeling</w:t>
+      </w:r>
+      <w:proofErr w:type="spellEnd"/>
+      <w:r>
+        <w:rPr>
+          <w:szCs w:val="24"/>
+        </w:rPr>
+        <w:t xml:space="preserve"> Language) diagram that provides a detailed view of how various components or objects in a software system interact with each other.</w:t>
       </w:r>
     </w:p>
     <w:p>
@@ -7706,6 +7965,7 @@
                 <w:szCs w:val="20"/>
               </w:rPr>
             </w:pPr>
+            <w:proofErr w:type="spellStart"/>
             <w:r>
               <w:rPr>
                 <w:sz w:val="20"/>
@@ -7713,6 +7973,7 @@
               </w:rPr>
               <w:t>TestCaseID</w:t>
             </w:r>
+            <w:proofErr w:type="spellEnd"/>
           </w:p>
         </w:tc>
         <w:tc>
@@ -8017,7 +8278,23 @@
                 <w:sz w:val="20"/>
                 <w:szCs w:val="20"/>
               </w:rPr>
-              <w:t xml:space="preserve">1. User Type    2. Name            3. Email              4. Password      5. Re-Password  6. Accept T&amp;Cs  </w:t>
+              <w:t>1. User Type    2. Name            3. Email              4. Password      5. Re-</w:t>
+            </w:r>
+            <w:proofErr w:type="gramStart"/>
+            <w:r>
+              <w:rPr>
+                <w:sz w:val="20"/>
+                <w:szCs w:val="20"/>
+              </w:rPr>
+              <w:t>Password  6</w:t>
+            </w:r>
+            <w:proofErr w:type="gramEnd"/>
+            <w:r>
+              <w:rPr>
+                <w:sz w:val="20"/>
+                <w:szCs w:val="20"/>
+              </w:rPr>
+              <w:t xml:space="preserve">. Accept T&amp;Cs  </w:t>
             </w:r>
           </w:p>
         </w:tc>
@@ -9765,7 +10042,23 @@
                 <w:szCs w:val="20"/>
               </w:rPr>
               <w:lastRenderedPageBreak/>
-              <w:t>1. Turn off wifi/data connection</w:t>
+              <w:t xml:space="preserve">1. Turn off </w:t>
+            </w:r>
+            <w:proofErr w:type="spellStart"/>
+            <w:r>
+              <w:rPr>
+                <w:sz w:val="20"/>
+                <w:szCs w:val="20"/>
+              </w:rPr>
+              <w:t>wifi</w:t>
+            </w:r>
+            <w:proofErr w:type="spellEnd"/>
+            <w:r>
+              <w:rPr>
+                <w:sz w:val="20"/>
+                <w:szCs w:val="20"/>
+              </w:rPr>
+              <w:t>/data connection</w:t>
             </w:r>
           </w:p>
         </w:tc>
@@ -10777,7 +11070,23 @@
                 <w:sz w:val="20"/>
                 <w:szCs w:val="20"/>
               </w:rPr>
-              <w:t>1. Open Profile Page 2. Click on Edit Profile  3. Add details and upload profile Image</w:t>
+              <w:t xml:space="preserve">1. Open Profile Page 2. Click on Edit </w:t>
+            </w:r>
+            <w:proofErr w:type="gramStart"/>
+            <w:r>
+              <w:rPr>
+                <w:sz w:val="20"/>
+                <w:szCs w:val="20"/>
+              </w:rPr>
+              <w:t>Profile  3</w:t>
+            </w:r>
+            <w:proofErr w:type="gramEnd"/>
+            <w:r>
+              <w:rPr>
+                <w:sz w:val="20"/>
+                <w:szCs w:val="20"/>
+              </w:rPr>
+              <w:t>. Add details and upload profile Image</w:t>
             </w:r>
           </w:p>
         </w:tc>
@@ -10798,7 +11107,23 @@
                 <w:sz w:val="20"/>
                 <w:szCs w:val="20"/>
               </w:rPr>
-              <w:t>1. Garage Name           2. Operating hours               3. Towing Service         4. Minimum service cost  5. Profile Image</w:t>
+              <w:t xml:space="preserve">1. Garage Name           2. Operating hours               3. Towing Service         4. Minimum service </w:t>
+            </w:r>
+            <w:proofErr w:type="gramStart"/>
+            <w:r>
+              <w:rPr>
+                <w:sz w:val="20"/>
+                <w:szCs w:val="20"/>
+              </w:rPr>
+              <w:t>cost  5</w:t>
+            </w:r>
+            <w:proofErr w:type="gramEnd"/>
+            <w:r>
+              <w:rPr>
+                <w:sz w:val="20"/>
+                <w:szCs w:val="20"/>
+              </w:rPr>
+              <w:t>. Profile Image</w:t>
             </w:r>
           </w:p>
         </w:tc>
@@ -11402,7 +11727,23 @@
                 <w:sz w:val="20"/>
                 <w:szCs w:val="20"/>
               </w:rPr>
-              <w:t>Displays All the current Jobcards under Garage and Earnings Insight</w:t>
+              <w:t xml:space="preserve">Displays All the current </w:t>
+            </w:r>
+            <w:proofErr w:type="spellStart"/>
+            <w:r>
+              <w:rPr>
+                <w:sz w:val="20"/>
+                <w:szCs w:val="20"/>
+              </w:rPr>
+              <w:t>Jobcards</w:t>
+            </w:r>
+            <w:proofErr w:type="spellEnd"/>
+            <w:r>
+              <w:rPr>
+                <w:sz w:val="20"/>
+                <w:szCs w:val="20"/>
+              </w:rPr>
+              <w:t xml:space="preserve"> under Garage and Earnings Insight</w:t>
             </w:r>
           </w:p>
         </w:tc>
@@ -11423,7 +11764,23 @@
                 <w:sz w:val="20"/>
                 <w:szCs w:val="20"/>
               </w:rPr>
-              <w:t>Displays All the current Jobcards under Garage and Earnings insight</w:t>
+              <w:t xml:space="preserve">Displays All the current </w:t>
+            </w:r>
+            <w:proofErr w:type="spellStart"/>
+            <w:r>
+              <w:rPr>
+                <w:sz w:val="20"/>
+                <w:szCs w:val="20"/>
+              </w:rPr>
+              <w:t>Jobcards</w:t>
+            </w:r>
+            <w:proofErr w:type="spellEnd"/>
+            <w:r>
+              <w:rPr>
+                <w:sz w:val="20"/>
+                <w:szCs w:val="20"/>
+              </w:rPr>
+              <w:t xml:space="preserve"> under Garage and Earnings insight</w:t>
             </w:r>
           </w:p>
         </w:tc>
@@ -12365,7 +12722,23 @@
                 <w:sz w:val="20"/>
                 <w:szCs w:val="20"/>
               </w:rPr>
-              <w:t>1. Open garage Search page  2. Click on Request Service         3. Fill Details and Request Submit</w:t>
+              <w:t xml:space="preserve">1. Open garage Search </w:t>
+            </w:r>
+            <w:proofErr w:type="gramStart"/>
+            <w:r>
+              <w:rPr>
+                <w:sz w:val="20"/>
+                <w:szCs w:val="20"/>
+              </w:rPr>
+              <w:t>page  2</w:t>
+            </w:r>
+            <w:proofErr w:type="gramEnd"/>
+            <w:r>
+              <w:rPr>
+                <w:sz w:val="20"/>
+                <w:szCs w:val="20"/>
+              </w:rPr>
+              <w:t>. Click on Request Service         3. Fill Details and Request Submit</w:t>
             </w:r>
           </w:p>
         </w:tc>
@@ -12775,7 +13148,23 @@
                 <w:sz w:val="20"/>
                 <w:szCs w:val="20"/>
               </w:rPr>
-              <w:t>Open garage request process panel and update the jobcard status</w:t>
+              <w:t xml:space="preserve">Open garage request process panel and update the </w:t>
+            </w:r>
+            <w:proofErr w:type="spellStart"/>
+            <w:r>
+              <w:rPr>
+                <w:sz w:val="20"/>
+                <w:szCs w:val="20"/>
+              </w:rPr>
+              <w:t>jobcard</w:t>
+            </w:r>
+            <w:proofErr w:type="spellEnd"/>
+            <w:r>
+              <w:rPr>
+                <w:sz w:val="20"/>
+                <w:szCs w:val="20"/>
+              </w:rPr>
+              <w:t xml:space="preserve"> status</w:t>
             </w:r>
           </w:p>
         </w:tc>
@@ -12796,7 +13185,39 @@
                 <w:sz w:val="20"/>
                 <w:szCs w:val="20"/>
               </w:rPr>
-              <w:t>1. Open Garage Request Process panel            2. Go to relevant jobcard and click on view more            3. Select status type from dropdown  4. Click on Update job card</w:t>
+              <w:t xml:space="preserve">1. Open Garage Request Process panel            2. Go to relevant </w:t>
+            </w:r>
+            <w:proofErr w:type="spellStart"/>
+            <w:r>
+              <w:rPr>
+                <w:sz w:val="20"/>
+                <w:szCs w:val="20"/>
+              </w:rPr>
+              <w:t>jobcard</w:t>
+            </w:r>
+            <w:proofErr w:type="spellEnd"/>
+            <w:r>
+              <w:rPr>
+                <w:sz w:val="20"/>
+                <w:szCs w:val="20"/>
+              </w:rPr>
+              <w:t xml:space="preserve"> and click on view more            3. Select status type from </w:t>
+            </w:r>
+            <w:proofErr w:type="gramStart"/>
+            <w:r>
+              <w:rPr>
+                <w:sz w:val="20"/>
+                <w:szCs w:val="20"/>
+              </w:rPr>
+              <w:t>dropdown  4</w:t>
+            </w:r>
+            <w:proofErr w:type="gramEnd"/>
+            <w:r>
+              <w:rPr>
+                <w:sz w:val="20"/>
+                <w:szCs w:val="20"/>
+              </w:rPr>
+              <w:t>. Click on Update job card</w:t>
             </w:r>
           </w:p>
         </w:tc>
@@ -12817,8 +13238,49 @@
                 <w:sz w:val="20"/>
                 <w:szCs w:val="20"/>
               </w:rPr>
-              <w:t>1. Click on View More 2.Select relevant jobcard update 3. Click update jobcard</w:t>
-            </w:r>
+              <w:t xml:space="preserve">1. Click on View More </w:t>
+            </w:r>
+            <w:proofErr w:type="gramStart"/>
+            <w:r>
+              <w:rPr>
+                <w:sz w:val="20"/>
+                <w:szCs w:val="20"/>
+              </w:rPr>
+              <w:t>2.Select</w:t>
+            </w:r>
+            <w:proofErr w:type="gramEnd"/>
+            <w:r>
+              <w:rPr>
+                <w:sz w:val="20"/>
+                <w:szCs w:val="20"/>
+              </w:rPr>
+              <w:t xml:space="preserve"> relevant </w:t>
+            </w:r>
+            <w:proofErr w:type="spellStart"/>
+            <w:r>
+              <w:rPr>
+                <w:sz w:val="20"/>
+                <w:szCs w:val="20"/>
+              </w:rPr>
+              <w:t>jobcard</w:t>
+            </w:r>
+            <w:proofErr w:type="spellEnd"/>
+            <w:r>
+              <w:rPr>
+                <w:sz w:val="20"/>
+                <w:szCs w:val="20"/>
+              </w:rPr>
+              <w:t xml:space="preserve"> update 3. Click update </w:t>
+            </w:r>
+            <w:proofErr w:type="spellStart"/>
+            <w:r>
+              <w:rPr>
+                <w:sz w:val="20"/>
+                <w:szCs w:val="20"/>
+              </w:rPr>
+              <w:t>jobcard</w:t>
+            </w:r>
+            <w:proofErr w:type="spellEnd"/>
           </w:p>
         </w:tc>
         <w:tc>
@@ -12969,7 +13431,23 @@
                 <w:sz w:val="20"/>
                 <w:szCs w:val="20"/>
               </w:rPr>
-              <w:t>Open user request process panel and check completed jobcards and make payments</w:t>
+              <w:t xml:space="preserve">Open user request process panel and check completed </w:t>
+            </w:r>
+            <w:proofErr w:type="spellStart"/>
+            <w:r>
+              <w:rPr>
+                <w:sz w:val="20"/>
+                <w:szCs w:val="20"/>
+              </w:rPr>
+              <w:t>jobcards</w:t>
+            </w:r>
+            <w:proofErr w:type="spellEnd"/>
+            <w:r>
+              <w:rPr>
+                <w:sz w:val="20"/>
+                <w:szCs w:val="20"/>
+              </w:rPr>
+              <w:t xml:space="preserve"> and make payments</w:t>
             </w:r>
           </w:p>
         </w:tc>
@@ -12990,7 +13468,23 @@
                 <w:sz w:val="20"/>
                 <w:szCs w:val="20"/>
               </w:rPr>
-              <w:t xml:space="preserve">1. Open user request process panel            2. Select Completed Jobcards from dropdown   3. Select a relevant job card and view more   4. Make Payments Accordingly  </w:t>
+              <w:t xml:space="preserve">1. Open user request process panel            2. Select Completed </w:t>
+            </w:r>
+            <w:proofErr w:type="spellStart"/>
+            <w:r>
+              <w:rPr>
+                <w:sz w:val="20"/>
+                <w:szCs w:val="20"/>
+              </w:rPr>
+              <w:t>Jobcards</w:t>
+            </w:r>
+            <w:proofErr w:type="spellEnd"/>
+            <w:r>
+              <w:rPr>
+                <w:sz w:val="20"/>
+                <w:szCs w:val="20"/>
+              </w:rPr>
+              <w:t xml:space="preserve"> from dropdown   3. Select a relevant job card and view more   4. Make Payments Accordingly  </w:t>
             </w:r>
           </w:p>
         </w:tc>
@@ -13011,7 +13505,39 @@
                 <w:sz w:val="20"/>
                 <w:szCs w:val="20"/>
               </w:rPr>
-              <w:t>1. Click on View More 2.Select relevant jobcard Completed       3. Click on Make Payment</w:t>
+              <w:t xml:space="preserve">1. Click on View More </w:t>
+            </w:r>
+            <w:proofErr w:type="gramStart"/>
+            <w:r>
+              <w:rPr>
+                <w:sz w:val="20"/>
+                <w:szCs w:val="20"/>
+              </w:rPr>
+              <w:t>2.Select</w:t>
+            </w:r>
+            <w:proofErr w:type="gramEnd"/>
+            <w:r>
+              <w:rPr>
+                <w:sz w:val="20"/>
+                <w:szCs w:val="20"/>
+              </w:rPr>
+              <w:t xml:space="preserve"> relevant </w:t>
+            </w:r>
+            <w:proofErr w:type="spellStart"/>
+            <w:r>
+              <w:rPr>
+                <w:sz w:val="20"/>
+                <w:szCs w:val="20"/>
+              </w:rPr>
+              <w:t>jobcard</w:t>
+            </w:r>
+            <w:proofErr w:type="spellEnd"/>
+            <w:r>
+              <w:rPr>
+                <w:sz w:val="20"/>
+                <w:szCs w:val="20"/>
+              </w:rPr>
+              <w:t xml:space="preserve"> Completed       3. Click on Make Payment</w:t>
             </w:r>
           </w:p>
         </w:tc>
@@ -13163,7 +13689,23 @@
                 <w:sz w:val="20"/>
                 <w:szCs w:val="20"/>
               </w:rPr>
-              <w:t>Open user request process panel and check completed jobcards and click on leave a review</w:t>
+              <w:t xml:space="preserve">Open user request process panel and check completed </w:t>
+            </w:r>
+            <w:proofErr w:type="spellStart"/>
+            <w:r>
+              <w:rPr>
+                <w:sz w:val="20"/>
+                <w:szCs w:val="20"/>
+              </w:rPr>
+              <w:t>jobcards</w:t>
+            </w:r>
+            <w:proofErr w:type="spellEnd"/>
+            <w:r>
+              <w:rPr>
+                <w:sz w:val="20"/>
+                <w:szCs w:val="20"/>
+              </w:rPr>
+              <w:t xml:space="preserve"> and click on leave a review</w:t>
             </w:r>
           </w:p>
         </w:tc>
@@ -13184,7 +13726,23 @@
                 <w:sz w:val="20"/>
                 <w:szCs w:val="20"/>
               </w:rPr>
-              <w:t xml:space="preserve">1. Open user request process panel            2. Select Completed Jobcards from dropdown   3. Select a relevant job card and view more   4. Make Ratings and Reviews Accordingly  </w:t>
+              <w:t xml:space="preserve">1. Open user request process panel            2. Select Completed </w:t>
+            </w:r>
+            <w:proofErr w:type="spellStart"/>
+            <w:r>
+              <w:rPr>
+                <w:sz w:val="20"/>
+                <w:szCs w:val="20"/>
+              </w:rPr>
+              <w:t>Jobcards</w:t>
+            </w:r>
+            <w:proofErr w:type="spellEnd"/>
+            <w:r>
+              <w:rPr>
+                <w:sz w:val="20"/>
+                <w:szCs w:val="20"/>
+              </w:rPr>
+              <w:t xml:space="preserve"> from dropdown   3. Select a relevant job card and view more   4. Make Ratings and Reviews Accordingly  </w:t>
             </w:r>
           </w:p>
         </w:tc>
@@ -13205,8 +13763,17 @@
                 <w:sz w:val="20"/>
                 <w:szCs w:val="20"/>
               </w:rPr>
-              <w:t>1. Rating           2.Review</w:t>
-            </w:r>
+              <w:t xml:space="preserve">1. Rating           </w:t>
+            </w:r>
+            <w:proofErr w:type="gramStart"/>
+            <w:r>
+              <w:rPr>
+                <w:sz w:val="20"/>
+                <w:szCs w:val="20"/>
+              </w:rPr>
+              <w:t>2.Review</w:t>
+            </w:r>
+            <w:proofErr w:type="gramEnd"/>
           </w:p>
         </w:tc>
         <w:tc>
@@ -13435,7 +14002,23 @@
                 <w:sz w:val="20"/>
                 <w:szCs w:val="20"/>
               </w:rPr>
-              <w:t xml:space="preserve">1. Sign in as a Garage Owner       2. Open Profile Page            3. Click edit Banner image icon  4. Select Camera or gallery          5. Click on OK and banner gets updated      </w:t>
+              <w:t xml:space="preserve">1. Sign in as a Garage Owner       2. Open Profile Page            3. Click edit Banner image </w:t>
+            </w:r>
+            <w:proofErr w:type="gramStart"/>
+            <w:r>
+              <w:rPr>
+                <w:sz w:val="20"/>
+                <w:szCs w:val="20"/>
+              </w:rPr>
+              <w:t>icon  4</w:t>
+            </w:r>
+            <w:proofErr w:type="gramEnd"/>
+            <w:r>
+              <w:rPr>
+                <w:sz w:val="20"/>
+                <w:szCs w:val="20"/>
+              </w:rPr>
+              <w:t xml:space="preserve">. Select Camera or gallery          5. Click on OK and banner gets updated      </w:t>
             </w:r>
           </w:p>
         </w:tc>
@@ -13643,7 +14226,23 @@
                 <w:sz w:val="20"/>
                 <w:szCs w:val="20"/>
               </w:rPr>
-              <w:t xml:space="preserve">1. Sign in as a Garage Owner       2. Open Profile Page            3. Click edit showcase image icon  4. Select Max 7 Images from gallery         5. Click on OK and showcase images gets updated      </w:t>
+              <w:t xml:space="preserve">1. Sign in as a Garage Owner       2. Open Profile Page            3. Click edit showcase image </w:t>
+            </w:r>
+            <w:proofErr w:type="gramStart"/>
+            <w:r>
+              <w:rPr>
+                <w:sz w:val="20"/>
+                <w:szCs w:val="20"/>
+              </w:rPr>
+              <w:t>icon  4</w:t>
+            </w:r>
+            <w:proofErr w:type="gramEnd"/>
+            <w:r>
+              <w:rPr>
+                <w:sz w:val="20"/>
+                <w:szCs w:val="20"/>
+              </w:rPr>
+              <w:t xml:space="preserve">. Select Max 7 Images from gallery         5. Click on OK and showcase images gets updated      </w:t>
             </w:r>
           </w:p>
         </w:tc>
@@ -13837,7 +14436,23 @@
                 <w:sz w:val="20"/>
                 <w:szCs w:val="20"/>
               </w:rPr>
-              <w:t>1. Sign in as a Garage Owner         2. Open Profile Page 3. Click on edit Specialization                   4. Add your Top 5 Specialization using dropdowns  5. Click on Update Specialization button</w:t>
+              <w:t xml:space="preserve">1. Sign in as a Garage Owner         2. Open Profile Page 3. Click on edit Specialization                   4. Add your Top 5 Specialization using </w:t>
+            </w:r>
+            <w:proofErr w:type="gramStart"/>
+            <w:r>
+              <w:rPr>
+                <w:sz w:val="20"/>
+                <w:szCs w:val="20"/>
+              </w:rPr>
+              <w:t>dropdowns  5</w:t>
+            </w:r>
+            <w:proofErr w:type="gramEnd"/>
+            <w:r>
+              <w:rPr>
+                <w:sz w:val="20"/>
+                <w:szCs w:val="20"/>
+              </w:rPr>
+              <w:t>. Click on Update Specialization button</w:t>
             </w:r>
           </w:p>
         </w:tc>
@@ -14917,7 +15532,21 @@
         <w:rPr>
           <w:szCs w:val="24"/>
         </w:rPr>
-        <w:t>A component diagram is a type of UML (Unified Modeling Language) diagram used in software engineering to visualize the high-level structure and organization of a software system or application. While it may not be directly related to your Android development and Firebase expertise, understanding component diagrams can still be valuable in the context of software design and architecture.</w:t>
+        <w:t xml:space="preserve">A component diagram is a type of UML (Unified </w:t>
+      </w:r>
+      <w:proofErr w:type="spellStart"/>
+      <w:r>
+        <w:rPr>
+          <w:szCs w:val="24"/>
+        </w:rPr>
+        <w:t>Modeling</w:t>
+      </w:r>
+      <w:proofErr w:type="spellEnd"/>
+      <w:r>
+        <w:rPr>
+          <w:szCs w:val="24"/>
+        </w:rPr>
+        <w:t xml:space="preserve"> Language) diagram used in software engineering to visualize the high-level structure and organization of a software system or application. While it may not be directly related to your Android development and Firebase expertise, understanding component diagrams can still be valuable in the context of software design and architecture.</w:t>
       </w:r>
     </w:p>
     <w:p>
@@ -15070,7 +15699,21 @@
         <w:rPr>
           <w:szCs w:val="24"/>
         </w:rPr>
-        <w:t>Represent the database as a separate component within your component diagram. This component should have a name that clearly identifies it as the database, such as "Database" or the name of the specific database system you are using, like "MySQL," "Firebase Firestore"</w:t>
+        <w:t xml:space="preserve">Represent the database as a separate component within your component diagram. This component should have a name that clearly identifies it as the database, such as "Database" or the name of the specific database system you are using, like "MySQL," "Firebase </w:t>
+      </w:r>
+      <w:proofErr w:type="spellStart"/>
+      <w:r>
+        <w:rPr>
+          <w:szCs w:val="24"/>
+        </w:rPr>
+        <w:t>Firestore</w:t>
+      </w:r>
+      <w:proofErr w:type="spellEnd"/>
+      <w:r>
+        <w:rPr>
+          <w:szCs w:val="24"/>
+        </w:rPr>
+        <w:t>"</w:t>
       </w:r>
       <w:r>
         <w:rPr>
@@ -15346,7 +15989,21 @@
         <w:rPr>
           <w:szCs w:val="24"/>
         </w:rPr>
-        <w:t xml:space="preserve">A deployment diagram is a type of diagram in the Unified Modeling Language (UML) that is used to visualize and describe the architecture of a system as it is deployed in a real-world environment. </w:t>
+        <w:t xml:space="preserve">A deployment diagram is a type of diagram in the Unified </w:t>
+      </w:r>
+      <w:proofErr w:type="spellStart"/>
+      <w:r>
+        <w:rPr>
+          <w:szCs w:val="24"/>
+        </w:rPr>
+        <w:t>Modeling</w:t>
+      </w:r>
+      <w:proofErr w:type="spellEnd"/>
+      <w:r>
+        <w:rPr>
+          <w:szCs w:val="24"/>
+        </w:rPr>
+        <w:t xml:space="preserve"> Language (UML) that is used to visualize and describe the architecture of a system as it is deployed in a real-world environment. </w:t>
       </w:r>
       <w:r>
         <w:rPr>
@@ -18291,7 +18948,21 @@
         <w:rPr>
           <w:szCs w:val="24"/>
         </w:rPr>
-        <w:t xml:space="preserve"> Firebase's Firestore database to query and filter results based on criteria like location, ratings, and services offered.</w:t>
+        <w:t xml:space="preserve"> Firebase's </w:t>
+      </w:r>
+      <w:proofErr w:type="spellStart"/>
+      <w:r>
+        <w:rPr>
+          <w:szCs w:val="24"/>
+        </w:rPr>
+        <w:t>Firestore</w:t>
+      </w:r>
+      <w:proofErr w:type="spellEnd"/>
+      <w:r>
+        <w:rPr>
+          <w:szCs w:val="24"/>
+        </w:rPr>
+        <w:t xml:space="preserve"> database to query and filter results based on criteria like location, ratings, and services offered.</w:t>
       </w:r>
     </w:p>
     <w:p>
@@ -18921,6 +19592,119 @@
 <file path=word/numbering.xml><?xml version="1.0" encoding="utf-8"?>
 <w:numbering xmlns:wpc="http://schemas.microsoft.com/office/word/2010/wordprocessingCanvas" xmlns:cx="http://schemas.microsoft.com/office/drawing/2014/chartex" xmlns:cx1="http://schemas.microsoft.com/office/drawing/2015/9/8/chartex" xmlns:cx2="http://schemas.microsoft.com/office/drawing/2015/10/21/chartex" xmlns:cx3="http://schemas.microsoft.com/office/drawing/2016/5/9/chartex" xmlns:cx4="http://schemas.microsoft.com/office/drawing/2016/5/10/chartex" xmlns:cx5="http://schemas.microsoft.com/office/drawing/2016/5/11/chartex" xmlns:cx6="http://schemas.microsoft.com/office/drawing/2016/5/12/chartex" xmlns:cx7="http://schemas.microsoft.com/office/drawing/2016/5/13/chartex" xmlns:cx8="http://schemas.microsoft.com/office/drawing/2016/5/14/chartex" xmlns:mc="http://schemas.openxmlformats.org/markup-compatibility/2006" xmlns:aink="http://schemas.microsoft.com/office/drawing/2016/ink" xmlns:am3d="http://schemas.microsoft.com/office/drawing/2017/model3d" xmlns:o="urn:schemas-microsoft-com:office:office" xmlns:oel="http://schemas.microsoft.com/office/2019/extlst" xmlns:r="http://schemas.openxmlformats.org/officeDocument/2006/relationships" xmlns:m="http://schemas.openxmlformats.org/officeDocument/2006/math" xmlns:v="urn:schemas-microsoft-com:vml" xmlns:wp14="http://schemas.microsoft.com/office/word/2010/wordprocessingDrawing" xmlns:wp="http://schemas.openxmlformats.org/drawingml/2006/wordprocessingDrawing" xmlns:w10="urn:schemas-microsoft-com:office:word" xmlns:w="http://schemas.openxmlformats.org/wordprocessingml/2006/main" xmlns:w14="http://schemas.microsoft.com/office/word/2010/wordml" xmlns:w15="http://schemas.microsoft.com/office/word/2012/wordml" xmlns:w16cex="http://schemas.microsoft.com/office/word/2018/wordml/cex" xmlns:w16cid="http://schemas.microsoft.com/office/word/2016/wordml/cid" xmlns:w16="http://schemas.microsoft.com/office/word/2018/wordml" xmlns:w16sdtdh="http://schemas.microsoft.com/office/word/2020/wordml/sdtdatahash" xmlns:w16se="http://schemas.microsoft.com/office/word/2015/wordml/symex" xmlns:wpg="http://schemas.microsoft.com/office/word/2010/wordprocessingGroup" xmlns:wpi="http://schemas.microsoft.com/office/word/2010/wordprocessingInk" xmlns:wne="http://schemas.microsoft.com/office/word/2006/wordml" xmlns:wps="http://schemas.microsoft.com/office/word/2010/wordprocessingShape" mc:Ignorable="w14 w15 w16se w16cid w16 w16cex w16sdtdh wp14">
   <w:abstractNum w:abstractNumId="0" w15:restartNumberingAfterBreak="0">
+    <w:nsid w:val="00BA0660"/>
+    <w:multiLevelType w:val="hybridMultilevel"/>
+    <w:tmpl w:val="8A44C8C4"/>
+    <w:lvl w:ilvl="0" w:tplc="40090001">
+      <w:start w:val="1"/>
+      <w:numFmt w:val="bullet"/>
+      <w:lvlText w:val=""/>
+      <w:lvlJc w:val="left"/>
+      <w:pPr>
+        <w:ind w:left="720" w:hanging="360"/>
+      </w:pPr>
+      <w:rPr>
+        <w:rFonts w:ascii="Symbol" w:hAnsi="Symbol" w:hint="default"/>
+      </w:rPr>
+    </w:lvl>
+    <w:lvl w:ilvl="1" w:tplc="40090003" w:tentative="1">
+      <w:start w:val="1"/>
+      <w:numFmt w:val="bullet"/>
+      <w:lvlText w:val="o"/>
+      <w:lvlJc w:val="left"/>
+      <w:pPr>
+        <w:ind w:left="1440" w:hanging="360"/>
+      </w:pPr>
+      <w:rPr>
+        <w:rFonts w:ascii="Courier New" w:hAnsi="Courier New" w:cs="Courier New" w:hint="default"/>
+      </w:rPr>
+    </w:lvl>
+    <w:lvl w:ilvl="2" w:tplc="40090005" w:tentative="1">
+      <w:start w:val="1"/>
+      <w:numFmt w:val="bullet"/>
+      <w:lvlText w:val=""/>
+      <w:lvlJc w:val="left"/>
+      <w:pPr>
+        <w:ind w:left="2160" w:hanging="360"/>
+      </w:pPr>
+      <w:rPr>
+        <w:rFonts w:ascii="Wingdings" w:hAnsi="Wingdings" w:hint="default"/>
+      </w:rPr>
+    </w:lvl>
+    <w:lvl w:ilvl="3" w:tplc="40090001" w:tentative="1">
+      <w:start w:val="1"/>
+      <w:numFmt w:val="bullet"/>
+      <w:lvlText w:val=""/>
+      <w:lvlJc w:val="left"/>
+      <w:pPr>
+        <w:ind w:left="2880" w:hanging="360"/>
+      </w:pPr>
+      <w:rPr>
+        <w:rFonts w:ascii="Symbol" w:hAnsi="Symbol" w:hint="default"/>
+      </w:rPr>
+    </w:lvl>
+    <w:lvl w:ilvl="4" w:tplc="40090003" w:tentative="1">
+      <w:start w:val="1"/>
+      <w:numFmt w:val="bullet"/>
+      <w:lvlText w:val="o"/>
+      <w:lvlJc w:val="left"/>
+      <w:pPr>
+        <w:ind w:left="3600" w:hanging="360"/>
+      </w:pPr>
+      <w:rPr>
+        <w:rFonts w:ascii="Courier New" w:hAnsi="Courier New" w:cs="Courier New" w:hint="default"/>
+      </w:rPr>
+    </w:lvl>
+    <w:lvl w:ilvl="5" w:tplc="40090005" w:tentative="1">
+      <w:start w:val="1"/>
+      <w:numFmt w:val="bullet"/>
+      <w:lvlText w:val=""/>
+      <w:lvlJc w:val="left"/>
+      <w:pPr>
+        <w:ind w:left="4320" w:hanging="360"/>
+      </w:pPr>
+      <w:rPr>
+        <w:rFonts w:ascii="Wingdings" w:hAnsi="Wingdings" w:hint="default"/>
+      </w:rPr>
+    </w:lvl>
+    <w:lvl w:ilvl="6" w:tplc="40090001" w:tentative="1">
+      <w:start w:val="1"/>
+      <w:numFmt w:val="bullet"/>
+      <w:lvlText w:val=""/>
+      <w:lvlJc w:val="left"/>
+      <w:pPr>
+        <w:ind w:left="5040" w:hanging="360"/>
+      </w:pPr>
+      <w:rPr>
+        <w:rFonts w:ascii="Symbol" w:hAnsi="Symbol" w:hint="default"/>
+      </w:rPr>
+    </w:lvl>
+    <w:lvl w:ilvl="7" w:tplc="40090003" w:tentative="1">
+      <w:start w:val="1"/>
+      <w:numFmt w:val="bullet"/>
+      <w:lvlText w:val="o"/>
+      <w:lvlJc w:val="left"/>
+      <w:pPr>
+        <w:ind w:left="5760" w:hanging="360"/>
+      </w:pPr>
+      <w:rPr>
+        <w:rFonts w:ascii="Courier New" w:hAnsi="Courier New" w:cs="Courier New" w:hint="default"/>
+      </w:rPr>
+    </w:lvl>
+    <w:lvl w:ilvl="8" w:tplc="40090005" w:tentative="1">
+      <w:start w:val="1"/>
+      <w:numFmt w:val="bullet"/>
+      <w:lvlText w:val=""/>
+      <w:lvlJc w:val="left"/>
+      <w:pPr>
+        <w:ind w:left="6480" w:hanging="360"/>
+      </w:pPr>
+      <w:rPr>
+        <w:rFonts w:ascii="Wingdings" w:hAnsi="Wingdings" w:hint="default"/>
+      </w:rPr>
+    </w:lvl>
+  </w:abstractNum>
+  <w:abstractNum w:abstractNumId="1" w15:restartNumberingAfterBreak="0">
     <w:nsid w:val="17B820CA"/>
     <w:multiLevelType w:val="hybridMultilevel"/>
     <w:tmpl w:val="59709D34"/>
@@ -19033,7 +19817,7 @@
       </w:rPr>
     </w:lvl>
   </w:abstractNum>
-  <w:abstractNum w:abstractNumId="1" w15:restartNumberingAfterBreak="0">
+  <w:abstractNum w:abstractNumId="2" w15:restartNumberingAfterBreak="0">
     <w:nsid w:val="19D94A52"/>
     <w:multiLevelType w:val="hybridMultilevel"/>
     <w:tmpl w:val="572ED0EC"/>
@@ -19122,7 +19906,101 @@
       </w:pPr>
     </w:lvl>
   </w:abstractNum>
-  <w:abstractNum w:abstractNumId="2" w15:restartNumberingAfterBreak="0">
+  <w:abstractNum w:abstractNumId="3" w15:restartNumberingAfterBreak="0">
+    <w:nsid w:val="19DB2A76"/>
+    <w:multiLevelType w:val="hybridMultilevel"/>
+    <w:tmpl w:val="7F2C25F8"/>
+    <w:lvl w:ilvl="0" w:tplc="FFFFFFFF">
+      <w:start w:val="1"/>
+      <w:numFmt w:val="decimal"/>
+      <w:lvlText w:val="%1."/>
+      <w:lvlJc w:val="left"/>
+      <w:pPr>
+        <w:ind w:left="360" w:hanging="360"/>
+      </w:pPr>
+      <w:rPr>
+        <w:rFonts w:hint="default"/>
+        <w:sz w:val="24"/>
+        <w:szCs w:val="24"/>
+      </w:rPr>
+    </w:lvl>
+    <w:lvl w:ilvl="1" w:tplc="40090001">
+      <w:start w:val="1"/>
+      <w:numFmt w:val="bullet"/>
+      <w:lvlText w:val=""/>
+      <w:lvlJc w:val="left"/>
+      <w:pPr>
+        <w:ind w:left="360" w:hanging="360"/>
+      </w:pPr>
+      <w:rPr>
+        <w:rFonts w:ascii="Symbol" w:hAnsi="Symbol" w:hint="default"/>
+      </w:rPr>
+    </w:lvl>
+    <w:lvl w:ilvl="2" w:tplc="FFFFFFFF">
+      <w:start w:val="1"/>
+      <w:numFmt w:val="lowerRoman"/>
+      <w:lvlText w:val="%3."/>
+      <w:lvlJc w:val="right"/>
+      <w:pPr>
+        <w:ind w:left="1800" w:hanging="180"/>
+      </w:pPr>
+    </w:lvl>
+    <w:lvl w:ilvl="3" w:tplc="FFFFFFFF" w:tentative="1">
+      <w:start w:val="1"/>
+      <w:numFmt w:val="decimal"/>
+      <w:lvlText w:val="%4."/>
+      <w:lvlJc w:val="left"/>
+      <w:pPr>
+        <w:ind w:left="2520" w:hanging="360"/>
+      </w:pPr>
+    </w:lvl>
+    <w:lvl w:ilvl="4" w:tplc="FFFFFFFF" w:tentative="1">
+      <w:start w:val="1"/>
+      <w:numFmt w:val="lowerLetter"/>
+      <w:lvlText w:val="%5."/>
+      <w:lvlJc w:val="left"/>
+      <w:pPr>
+        <w:ind w:left="3240" w:hanging="360"/>
+      </w:pPr>
+    </w:lvl>
+    <w:lvl w:ilvl="5" w:tplc="FFFFFFFF" w:tentative="1">
+      <w:start w:val="1"/>
+      <w:numFmt w:val="lowerRoman"/>
+      <w:lvlText w:val="%6."/>
+      <w:lvlJc w:val="right"/>
+      <w:pPr>
+        <w:ind w:left="3960" w:hanging="180"/>
+      </w:pPr>
+    </w:lvl>
+    <w:lvl w:ilvl="6" w:tplc="FFFFFFFF" w:tentative="1">
+      <w:start w:val="1"/>
+      <w:numFmt w:val="decimal"/>
+      <w:lvlText w:val="%7."/>
+      <w:lvlJc w:val="left"/>
+      <w:pPr>
+        <w:ind w:left="4680" w:hanging="360"/>
+      </w:pPr>
+    </w:lvl>
+    <w:lvl w:ilvl="7" w:tplc="FFFFFFFF" w:tentative="1">
+      <w:start w:val="1"/>
+      <w:numFmt w:val="lowerLetter"/>
+      <w:lvlText w:val="%8."/>
+      <w:lvlJc w:val="left"/>
+      <w:pPr>
+        <w:ind w:left="5400" w:hanging="360"/>
+      </w:pPr>
+    </w:lvl>
+    <w:lvl w:ilvl="8" w:tplc="FFFFFFFF" w:tentative="1">
+      <w:start w:val="1"/>
+      <w:numFmt w:val="lowerRoman"/>
+      <w:lvlText w:val="%9."/>
+      <w:lvlJc w:val="right"/>
+      <w:pPr>
+        <w:ind w:left="6120" w:hanging="180"/>
+      </w:pPr>
+    </w:lvl>
+  </w:abstractNum>
+  <w:abstractNum w:abstractNumId="4" w15:restartNumberingAfterBreak="0">
     <w:nsid w:val="1F3C6787"/>
     <w:multiLevelType w:val="hybridMultilevel"/>
     <w:tmpl w:val="8648F1F6"/>
@@ -19239,7 +20117,122 @@
       </w:rPr>
     </w:lvl>
   </w:abstractNum>
-  <w:abstractNum w:abstractNumId="3" w15:restartNumberingAfterBreak="0">
+  <w:abstractNum w:abstractNumId="5" w15:restartNumberingAfterBreak="0">
+    <w:nsid w:val="26996464"/>
+    <w:multiLevelType w:val="hybridMultilevel"/>
+    <w:tmpl w:val="64A228C0"/>
+    <w:lvl w:ilvl="0" w:tplc="D5BE6922">
+      <w:start w:val="1"/>
+      <w:numFmt w:val="bullet"/>
+      <w:lvlText w:val=""/>
+      <w:lvlJc w:val="left"/>
+      <w:pPr>
+        <w:ind w:left="720" w:hanging="360"/>
+      </w:pPr>
+      <w:rPr>
+        <w:rFonts w:ascii="Symbol" w:hAnsi="Symbol" w:hint="default"/>
+        <w:sz w:val="22"/>
+        <w:szCs w:val="22"/>
+      </w:rPr>
+    </w:lvl>
+    <w:lvl w:ilvl="1" w:tplc="40090003" w:tentative="1">
+      <w:start w:val="1"/>
+      <w:numFmt w:val="bullet"/>
+      <w:lvlText w:val="o"/>
+      <w:lvlJc w:val="left"/>
+      <w:pPr>
+        <w:ind w:left="1440" w:hanging="360"/>
+      </w:pPr>
+      <w:rPr>
+        <w:rFonts w:ascii="Courier New" w:hAnsi="Courier New" w:cs="Courier New" w:hint="default"/>
+      </w:rPr>
+    </w:lvl>
+    <w:lvl w:ilvl="2" w:tplc="40090005" w:tentative="1">
+      <w:start w:val="1"/>
+      <w:numFmt w:val="bullet"/>
+      <w:lvlText w:val=""/>
+      <w:lvlJc w:val="left"/>
+      <w:pPr>
+        <w:ind w:left="2160" w:hanging="360"/>
+      </w:pPr>
+      <w:rPr>
+        <w:rFonts w:ascii="Wingdings" w:hAnsi="Wingdings" w:hint="default"/>
+      </w:rPr>
+    </w:lvl>
+    <w:lvl w:ilvl="3" w:tplc="40090001" w:tentative="1">
+      <w:start w:val="1"/>
+      <w:numFmt w:val="bullet"/>
+      <w:lvlText w:val=""/>
+      <w:lvlJc w:val="left"/>
+      <w:pPr>
+        <w:ind w:left="2880" w:hanging="360"/>
+      </w:pPr>
+      <w:rPr>
+        <w:rFonts w:ascii="Symbol" w:hAnsi="Symbol" w:hint="default"/>
+      </w:rPr>
+    </w:lvl>
+    <w:lvl w:ilvl="4" w:tplc="40090003" w:tentative="1">
+      <w:start w:val="1"/>
+      <w:numFmt w:val="bullet"/>
+      <w:lvlText w:val="o"/>
+      <w:lvlJc w:val="left"/>
+      <w:pPr>
+        <w:ind w:left="3600" w:hanging="360"/>
+      </w:pPr>
+      <w:rPr>
+        <w:rFonts w:ascii="Courier New" w:hAnsi="Courier New" w:cs="Courier New" w:hint="default"/>
+      </w:rPr>
+    </w:lvl>
+    <w:lvl w:ilvl="5" w:tplc="40090005" w:tentative="1">
+      <w:start w:val="1"/>
+      <w:numFmt w:val="bullet"/>
+      <w:lvlText w:val=""/>
+      <w:lvlJc w:val="left"/>
+      <w:pPr>
+        <w:ind w:left="4320" w:hanging="360"/>
+      </w:pPr>
+      <w:rPr>
+        <w:rFonts w:ascii="Wingdings" w:hAnsi="Wingdings" w:hint="default"/>
+      </w:rPr>
+    </w:lvl>
+    <w:lvl w:ilvl="6" w:tplc="40090001" w:tentative="1">
+      <w:start w:val="1"/>
+      <w:numFmt w:val="bullet"/>
+      <w:lvlText w:val=""/>
+      <w:lvlJc w:val="left"/>
+      <w:pPr>
+        <w:ind w:left="5040" w:hanging="360"/>
+      </w:pPr>
+      <w:rPr>
+        <w:rFonts w:ascii="Symbol" w:hAnsi="Symbol" w:hint="default"/>
+      </w:rPr>
+    </w:lvl>
+    <w:lvl w:ilvl="7" w:tplc="40090003" w:tentative="1">
+      <w:start w:val="1"/>
+      <w:numFmt w:val="bullet"/>
+      <w:lvlText w:val="o"/>
+      <w:lvlJc w:val="left"/>
+      <w:pPr>
+        <w:ind w:left="5760" w:hanging="360"/>
+      </w:pPr>
+      <w:rPr>
+        <w:rFonts w:ascii="Courier New" w:hAnsi="Courier New" w:cs="Courier New" w:hint="default"/>
+      </w:rPr>
+    </w:lvl>
+    <w:lvl w:ilvl="8" w:tplc="40090005" w:tentative="1">
+      <w:start w:val="1"/>
+      <w:numFmt w:val="bullet"/>
+      <w:lvlText w:val=""/>
+      <w:lvlJc w:val="left"/>
+      <w:pPr>
+        <w:ind w:left="6480" w:hanging="360"/>
+      </w:pPr>
+      <w:rPr>
+        <w:rFonts w:ascii="Wingdings" w:hAnsi="Wingdings" w:hint="default"/>
+      </w:rPr>
+    </w:lvl>
+  </w:abstractNum>
+  <w:abstractNum w:abstractNumId="6" w15:restartNumberingAfterBreak="0">
     <w:nsid w:val="2AF656A4"/>
     <w:multiLevelType w:val="hybridMultilevel"/>
     <w:tmpl w:val="AE9E6BFC"/>
@@ -19331,7 +20324,7 @@
       </w:pPr>
     </w:lvl>
   </w:abstractNum>
-  <w:abstractNum w:abstractNumId="4" w15:restartNumberingAfterBreak="0">
+  <w:abstractNum w:abstractNumId="7" w15:restartNumberingAfterBreak="0">
     <w:nsid w:val="307B0C09"/>
     <w:multiLevelType w:val="hybridMultilevel"/>
     <w:tmpl w:val="E46EE02E"/>
@@ -19444,7 +20437,7 @@
       </w:rPr>
     </w:lvl>
   </w:abstractNum>
-  <w:abstractNum w:abstractNumId="5" w15:restartNumberingAfterBreak="0">
+  <w:abstractNum w:abstractNumId="8" w15:restartNumberingAfterBreak="0">
     <w:nsid w:val="37807628"/>
     <w:multiLevelType w:val="hybridMultilevel"/>
     <w:tmpl w:val="F7AC2C80"/>
@@ -19536,7 +20529,7 @@
       </w:pPr>
     </w:lvl>
   </w:abstractNum>
-  <w:abstractNum w:abstractNumId="6" w15:restartNumberingAfterBreak="0">
+  <w:abstractNum w:abstractNumId="9" w15:restartNumberingAfterBreak="0">
     <w:nsid w:val="3792081E"/>
     <w:multiLevelType w:val="hybridMultilevel"/>
     <w:tmpl w:val="C930D6DC"/>
@@ -19649,7 +20642,7 @@
       </w:rPr>
     </w:lvl>
   </w:abstractNum>
-  <w:abstractNum w:abstractNumId="7" w15:restartNumberingAfterBreak="0">
+  <w:abstractNum w:abstractNumId="10" w15:restartNumberingAfterBreak="0">
     <w:nsid w:val="37CA7D21"/>
     <w:multiLevelType w:val="hybridMultilevel"/>
     <w:tmpl w:val="279A84F4"/>
@@ -19741,7 +20734,104 @@
       </w:pPr>
     </w:lvl>
   </w:abstractNum>
-  <w:abstractNum w:abstractNumId="8" w15:restartNumberingAfterBreak="0">
+  <w:abstractNum w:abstractNumId="11" w15:restartNumberingAfterBreak="0">
+    <w:nsid w:val="37EA39AA"/>
+    <w:multiLevelType w:val="hybridMultilevel"/>
+    <w:tmpl w:val="E22C69BE"/>
+    <w:lvl w:ilvl="0" w:tplc="FFFFFFFF">
+      <w:start w:val="1"/>
+      <w:numFmt w:val="decimal"/>
+      <w:lvlText w:val="%1."/>
+      <w:lvlJc w:val="left"/>
+      <w:pPr>
+        <w:ind w:left="360" w:hanging="360"/>
+      </w:pPr>
+      <w:rPr>
+        <w:rFonts w:hint="default"/>
+        <w:sz w:val="24"/>
+        <w:szCs w:val="24"/>
+      </w:rPr>
+    </w:lvl>
+    <w:lvl w:ilvl="1" w:tplc="FFFFFFFF">
+      <w:start w:val="1"/>
+      <w:numFmt w:val="bullet"/>
+      <w:lvlText w:val=""/>
+      <w:lvlJc w:val="left"/>
+      <w:pPr>
+        <w:ind w:left="360" w:hanging="360"/>
+      </w:pPr>
+      <w:rPr>
+        <w:rFonts w:ascii="Symbol" w:hAnsi="Symbol" w:hint="default"/>
+      </w:rPr>
+    </w:lvl>
+    <w:lvl w:ilvl="2" w:tplc="40090001">
+      <w:start w:val="1"/>
+      <w:numFmt w:val="bullet"/>
+      <w:lvlText w:val=""/>
+      <w:lvlJc w:val="left"/>
+      <w:pPr>
+        <w:ind w:left="644" w:hanging="360"/>
+      </w:pPr>
+      <w:rPr>
+        <w:rFonts w:ascii="Symbol" w:hAnsi="Symbol" w:hint="default"/>
+      </w:rPr>
+    </w:lvl>
+    <w:lvl w:ilvl="3" w:tplc="FFFFFFFF" w:tentative="1">
+      <w:start w:val="1"/>
+      <w:numFmt w:val="decimal"/>
+      <w:lvlText w:val="%4."/>
+      <w:lvlJc w:val="left"/>
+      <w:pPr>
+        <w:ind w:left="2520" w:hanging="360"/>
+      </w:pPr>
+    </w:lvl>
+    <w:lvl w:ilvl="4" w:tplc="FFFFFFFF" w:tentative="1">
+      <w:start w:val="1"/>
+      <w:numFmt w:val="lowerLetter"/>
+      <w:lvlText w:val="%5."/>
+      <w:lvlJc w:val="left"/>
+      <w:pPr>
+        <w:ind w:left="3240" w:hanging="360"/>
+      </w:pPr>
+    </w:lvl>
+    <w:lvl w:ilvl="5" w:tplc="FFFFFFFF" w:tentative="1">
+      <w:start w:val="1"/>
+      <w:numFmt w:val="lowerRoman"/>
+      <w:lvlText w:val="%6."/>
+      <w:lvlJc w:val="right"/>
+      <w:pPr>
+        <w:ind w:left="3960" w:hanging="180"/>
+      </w:pPr>
+    </w:lvl>
+    <w:lvl w:ilvl="6" w:tplc="FFFFFFFF" w:tentative="1">
+      <w:start w:val="1"/>
+      <w:numFmt w:val="decimal"/>
+      <w:lvlText w:val="%7."/>
+      <w:lvlJc w:val="left"/>
+      <w:pPr>
+        <w:ind w:left="4680" w:hanging="360"/>
+      </w:pPr>
+    </w:lvl>
+    <w:lvl w:ilvl="7" w:tplc="FFFFFFFF" w:tentative="1">
+      <w:start w:val="1"/>
+      <w:numFmt w:val="lowerLetter"/>
+      <w:lvlText w:val="%8."/>
+      <w:lvlJc w:val="left"/>
+      <w:pPr>
+        <w:ind w:left="5400" w:hanging="360"/>
+      </w:pPr>
+    </w:lvl>
+    <w:lvl w:ilvl="8" w:tplc="FFFFFFFF" w:tentative="1">
+      <w:start w:val="1"/>
+      <w:numFmt w:val="lowerRoman"/>
+      <w:lvlText w:val="%9."/>
+      <w:lvlJc w:val="right"/>
+      <w:pPr>
+        <w:ind w:left="6120" w:hanging="180"/>
+      </w:pPr>
+    </w:lvl>
+  </w:abstractNum>
+  <w:abstractNum w:abstractNumId="12" w15:restartNumberingAfterBreak="0">
     <w:nsid w:val="389622C1"/>
     <w:multiLevelType w:val="hybridMultilevel"/>
     <w:tmpl w:val="FCD0508C"/>
@@ -19953,7 +21043,214 @@
       </w:rPr>
     </w:lvl>
   </w:abstractNum>
-  <w:abstractNum w:abstractNumId="9" w15:restartNumberingAfterBreak="0">
+  <w:abstractNum w:abstractNumId="13" w15:restartNumberingAfterBreak="0">
+    <w:nsid w:val="3C873C23"/>
+    <w:multiLevelType w:val="hybridMultilevel"/>
+    <w:tmpl w:val="A1E6A4FA"/>
+    <w:lvl w:ilvl="0" w:tplc="FFFFFFFF">
+      <w:start w:val="1"/>
+      <w:numFmt w:val="decimal"/>
+      <w:lvlText w:val="%1."/>
+      <w:lvlJc w:val="left"/>
+      <w:pPr>
+        <w:ind w:left="360" w:hanging="360"/>
+      </w:pPr>
+      <w:rPr>
+        <w:rFonts w:hint="default"/>
+        <w:sz w:val="24"/>
+        <w:szCs w:val="24"/>
+      </w:rPr>
+    </w:lvl>
+    <w:lvl w:ilvl="1" w:tplc="40090001">
+      <w:start w:val="1"/>
+      <w:numFmt w:val="bullet"/>
+      <w:lvlText w:val=""/>
+      <w:lvlJc w:val="left"/>
+      <w:pPr>
+        <w:ind w:left="720" w:hanging="360"/>
+      </w:pPr>
+      <w:rPr>
+        <w:rFonts w:ascii="Symbol" w:hAnsi="Symbol" w:hint="default"/>
+      </w:rPr>
+    </w:lvl>
+    <w:lvl w:ilvl="2" w:tplc="FFFFFFFF" w:tentative="1">
+      <w:start w:val="1"/>
+      <w:numFmt w:val="lowerRoman"/>
+      <w:lvlText w:val="%3."/>
+      <w:lvlJc w:val="right"/>
+      <w:pPr>
+        <w:ind w:left="1800" w:hanging="180"/>
+      </w:pPr>
+    </w:lvl>
+    <w:lvl w:ilvl="3" w:tplc="FFFFFFFF" w:tentative="1">
+      <w:start w:val="1"/>
+      <w:numFmt w:val="decimal"/>
+      <w:lvlText w:val="%4."/>
+      <w:lvlJc w:val="left"/>
+      <w:pPr>
+        <w:ind w:left="2520" w:hanging="360"/>
+      </w:pPr>
+    </w:lvl>
+    <w:lvl w:ilvl="4" w:tplc="FFFFFFFF" w:tentative="1">
+      <w:start w:val="1"/>
+      <w:numFmt w:val="lowerLetter"/>
+      <w:lvlText w:val="%5."/>
+      <w:lvlJc w:val="left"/>
+      <w:pPr>
+        <w:ind w:left="3240" w:hanging="360"/>
+      </w:pPr>
+    </w:lvl>
+    <w:lvl w:ilvl="5" w:tplc="FFFFFFFF" w:tentative="1">
+      <w:start w:val="1"/>
+      <w:numFmt w:val="lowerRoman"/>
+      <w:lvlText w:val="%6."/>
+      <w:lvlJc w:val="right"/>
+      <w:pPr>
+        <w:ind w:left="3960" w:hanging="180"/>
+      </w:pPr>
+    </w:lvl>
+    <w:lvl w:ilvl="6" w:tplc="FFFFFFFF" w:tentative="1">
+      <w:start w:val="1"/>
+      <w:numFmt w:val="decimal"/>
+      <w:lvlText w:val="%7."/>
+      <w:lvlJc w:val="left"/>
+      <w:pPr>
+        <w:ind w:left="4680" w:hanging="360"/>
+      </w:pPr>
+    </w:lvl>
+    <w:lvl w:ilvl="7" w:tplc="FFFFFFFF" w:tentative="1">
+      <w:start w:val="1"/>
+      <w:numFmt w:val="lowerLetter"/>
+      <w:lvlText w:val="%8."/>
+      <w:lvlJc w:val="left"/>
+      <w:pPr>
+        <w:ind w:left="5400" w:hanging="360"/>
+      </w:pPr>
+    </w:lvl>
+    <w:lvl w:ilvl="8" w:tplc="FFFFFFFF" w:tentative="1">
+      <w:start w:val="1"/>
+      <w:numFmt w:val="lowerRoman"/>
+      <w:lvlText w:val="%9."/>
+      <w:lvlJc w:val="right"/>
+      <w:pPr>
+        <w:ind w:left="6120" w:hanging="180"/>
+      </w:pPr>
+    </w:lvl>
+  </w:abstractNum>
+  <w:abstractNum w:abstractNumId="14" w15:restartNumberingAfterBreak="0">
+    <w:nsid w:val="42601642"/>
+    <w:multiLevelType w:val="hybridMultilevel"/>
+    <w:tmpl w:val="6108D132"/>
+    <w:lvl w:ilvl="0" w:tplc="40090001">
+      <w:start w:val="1"/>
+      <w:numFmt w:val="bullet"/>
+      <w:lvlText w:val=""/>
+      <w:lvlJc w:val="left"/>
+      <w:pPr>
+        <w:ind w:left="720" w:hanging="360"/>
+      </w:pPr>
+      <w:rPr>
+        <w:rFonts w:ascii="Symbol" w:hAnsi="Symbol" w:hint="default"/>
+      </w:rPr>
+    </w:lvl>
+    <w:lvl w:ilvl="1" w:tplc="40090003" w:tentative="1">
+      <w:start w:val="1"/>
+      <w:numFmt w:val="bullet"/>
+      <w:lvlText w:val="o"/>
+      <w:lvlJc w:val="left"/>
+      <w:pPr>
+        <w:ind w:left="1440" w:hanging="360"/>
+      </w:pPr>
+      <w:rPr>
+        <w:rFonts w:ascii="Courier New" w:hAnsi="Courier New" w:cs="Courier New" w:hint="default"/>
+      </w:rPr>
+    </w:lvl>
+    <w:lvl w:ilvl="2" w:tplc="40090005" w:tentative="1">
+      <w:start w:val="1"/>
+      <w:numFmt w:val="bullet"/>
+      <w:lvlText w:val=""/>
+      <w:lvlJc w:val="left"/>
+      <w:pPr>
+        <w:ind w:left="2160" w:hanging="360"/>
+      </w:pPr>
+      <w:rPr>
+        <w:rFonts w:ascii="Wingdings" w:hAnsi="Wingdings" w:hint="default"/>
+      </w:rPr>
+    </w:lvl>
+    <w:lvl w:ilvl="3" w:tplc="40090001" w:tentative="1">
+      <w:start w:val="1"/>
+      <w:numFmt w:val="bullet"/>
+      <w:lvlText w:val=""/>
+      <w:lvlJc w:val="left"/>
+      <w:pPr>
+        <w:ind w:left="2880" w:hanging="360"/>
+      </w:pPr>
+      <w:rPr>
+        <w:rFonts w:ascii="Symbol" w:hAnsi="Symbol" w:hint="default"/>
+      </w:rPr>
+    </w:lvl>
+    <w:lvl w:ilvl="4" w:tplc="40090003" w:tentative="1">
+      <w:start w:val="1"/>
+      <w:numFmt w:val="bullet"/>
+      <w:lvlText w:val="o"/>
+      <w:lvlJc w:val="left"/>
+      <w:pPr>
+        <w:ind w:left="3600" w:hanging="360"/>
+      </w:pPr>
+      <w:rPr>
+        <w:rFonts w:ascii="Courier New" w:hAnsi="Courier New" w:cs="Courier New" w:hint="default"/>
+      </w:rPr>
+    </w:lvl>
+    <w:lvl w:ilvl="5" w:tplc="40090005" w:tentative="1">
+      <w:start w:val="1"/>
+      <w:numFmt w:val="bullet"/>
+      <w:lvlText w:val=""/>
+      <w:lvlJc w:val="left"/>
+      <w:pPr>
+        <w:ind w:left="4320" w:hanging="360"/>
+      </w:pPr>
+      <w:rPr>
+        <w:rFonts w:ascii="Wingdings" w:hAnsi="Wingdings" w:hint="default"/>
+      </w:rPr>
+    </w:lvl>
+    <w:lvl w:ilvl="6" w:tplc="40090001" w:tentative="1">
+      <w:start w:val="1"/>
+      <w:numFmt w:val="bullet"/>
+      <w:lvlText w:val=""/>
+      <w:lvlJc w:val="left"/>
+      <w:pPr>
+        <w:ind w:left="5040" w:hanging="360"/>
+      </w:pPr>
+      <w:rPr>
+        <w:rFonts w:ascii="Symbol" w:hAnsi="Symbol" w:hint="default"/>
+      </w:rPr>
+    </w:lvl>
+    <w:lvl w:ilvl="7" w:tplc="40090003" w:tentative="1">
+      <w:start w:val="1"/>
+      <w:numFmt w:val="bullet"/>
+      <w:lvlText w:val="o"/>
+      <w:lvlJc w:val="left"/>
+      <w:pPr>
+        <w:ind w:left="5760" w:hanging="360"/>
+      </w:pPr>
+      <w:rPr>
+        <w:rFonts w:ascii="Courier New" w:hAnsi="Courier New" w:cs="Courier New" w:hint="default"/>
+      </w:rPr>
+    </w:lvl>
+    <w:lvl w:ilvl="8" w:tplc="40090005" w:tentative="1">
+      <w:start w:val="1"/>
+      <w:numFmt w:val="bullet"/>
+      <w:lvlText w:val=""/>
+      <w:lvlJc w:val="left"/>
+      <w:pPr>
+        <w:ind w:left="6480" w:hanging="360"/>
+      </w:pPr>
+      <w:rPr>
+        <w:rFonts w:ascii="Wingdings" w:hAnsi="Wingdings" w:hint="default"/>
+      </w:rPr>
+    </w:lvl>
+  </w:abstractNum>
+  <w:abstractNum w:abstractNumId="15" w15:restartNumberingAfterBreak="0">
     <w:nsid w:val="44621512"/>
     <w:multiLevelType w:val="hybridMultilevel"/>
     <w:tmpl w:val="20604B52"/>
@@ -20066,7 +21363,7 @@
       </w:rPr>
     </w:lvl>
   </w:abstractNum>
-  <w:abstractNum w:abstractNumId="10" w15:restartNumberingAfterBreak="0">
+  <w:abstractNum w:abstractNumId="16" w15:restartNumberingAfterBreak="0">
     <w:nsid w:val="485355C9"/>
     <w:multiLevelType w:val="hybridMultilevel"/>
     <w:tmpl w:val="6BF03F64"/>
@@ -20179,7 +21476,7 @@
       </w:rPr>
     </w:lvl>
   </w:abstractNum>
-  <w:abstractNum w:abstractNumId="11" w15:restartNumberingAfterBreak="0">
+  <w:abstractNum w:abstractNumId="17" w15:restartNumberingAfterBreak="0">
     <w:nsid w:val="4C202766"/>
     <w:multiLevelType w:val="hybridMultilevel"/>
     <w:tmpl w:val="0FA6CB66"/>
@@ -20271,10 +21568,10 @@
       </w:pPr>
     </w:lvl>
   </w:abstractNum>
-  <w:abstractNum w:abstractNumId="12" w15:restartNumberingAfterBreak="0">
-    <w:nsid w:val="60584836"/>
+  <w:abstractNum w:abstractNumId="18" w15:restartNumberingAfterBreak="0">
+    <w:nsid w:val="4FC862E4"/>
     <w:multiLevelType w:val="hybridMultilevel"/>
-    <w:tmpl w:val="018E1B14"/>
+    <w:tmpl w:val="F118B370"/>
     <w:lvl w:ilvl="0" w:tplc="40090001">
       <w:start w:val="1"/>
       <w:numFmt w:val="bullet"/>
@@ -20384,10 +21681,10 @@
       </w:rPr>
     </w:lvl>
   </w:abstractNum>
-  <w:abstractNum w:abstractNumId="13" w15:restartNumberingAfterBreak="0">
-    <w:nsid w:val="622457A5"/>
+  <w:abstractNum w:abstractNumId="19" w15:restartNumberingAfterBreak="0">
+    <w:nsid w:val="60584836"/>
     <w:multiLevelType w:val="hybridMultilevel"/>
-    <w:tmpl w:val="17706E34"/>
+    <w:tmpl w:val="018E1B14"/>
     <w:lvl w:ilvl="0" w:tplc="40090001">
       <w:start w:val="1"/>
       <w:numFmt w:val="bullet"/>
@@ -20497,10 +21794,10 @@
       </w:rPr>
     </w:lvl>
   </w:abstractNum>
-  <w:abstractNum w:abstractNumId="14" w15:restartNumberingAfterBreak="0">
-    <w:nsid w:val="62AF0D7B"/>
+  <w:abstractNum w:abstractNumId="20" w15:restartNumberingAfterBreak="0">
+    <w:nsid w:val="622457A5"/>
     <w:multiLevelType w:val="hybridMultilevel"/>
-    <w:tmpl w:val="D31A3DA0"/>
+    <w:tmpl w:val="17706E34"/>
     <w:lvl w:ilvl="0" w:tplc="40090001">
       <w:start w:val="1"/>
       <w:numFmt w:val="bullet"/>
@@ -20610,7 +21907,120 @@
       </w:rPr>
     </w:lvl>
   </w:abstractNum>
-  <w:abstractNum w:abstractNumId="15" w15:restartNumberingAfterBreak="0">
+  <w:abstractNum w:abstractNumId="21" w15:restartNumberingAfterBreak="0">
+    <w:nsid w:val="62AF0D7B"/>
+    <w:multiLevelType w:val="hybridMultilevel"/>
+    <w:tmpl w:val="D31A3DA0"/>
+    <w:lvl w:ilvl="0" w:tplc="40090001">
+      <w:start w:val="1"/>
+      <w:numFmt w:val="bullet"/>
+      <w:lvlText w:val=""/>
+      <w:lvlJc w:val="left"/>
+      <w:pPr>
+        <w:ind w:left="816" w:hanging="360"/>
+      </w:pPr>
+      <w:rPr>
+        <w:rFonts w:ascii="Symbol" w:hAnsi="Symbol" w:hint="default"/>
+      </w:rPr>
+    </w:lvl>
+    <w:lvl w:ilvl="1" w:tplc="40090003" w:tentative="1">
+      <w:start w:val="1"/>
+      <w:numFmt w:val="bullet"/>
+      <w:lvlText w:val="o"/>
+      <w:lvlJc w:val="left"/>
+      <w:pPr>
+        <w:ind w:left="1612" w:hanging="360"/>
+      </w:pPr>
+      <w:rPr>
+        <w:rFonts w:ascii="Courier New" w:hAnsi="Courier New" w:cs="Courier New" w:hint="default"/>
+      </w:rPr>
+    </w:lvl>
+    <w:lvl w:ilvl="2" w:tplc="40090005" w:tentative="1">
+      <w:start w:val="1"/>
+      <w:numFmt w:val="bullet"/>
+      <w:lvlText w:val=""/>
+      <w:lvlJc w:val="left"/>
+      <w:pPr>
+        <w:ind w:left="2332" w:hanging="360"/>
+      </w:pPr>
+      <w:rPr>
+        <w:rFonts w:ascii="Wingdings" w:hAnsi="Wingdings" w:hint="default"/>
+      </w:rPr>
+    </w:lvl>
+    <w:lvl w:ilvl="3" w:tplc="40090001" w:tentative="1">
+      <w:start w:val="1"/>
+      <w:numFmt w:val="bullet"/>
+      <w:lvlText w:val=""/>
+      <w:lvlJc w:val="left"/>
+      <w:pPr>
+        <w:ind w:left="3052" w:hanging="360"/>
+      </w:pPr>
+      <w:rPr>
+        <w:rFonts w:ascii="Symbol" w:hAnsi="Symbol" w:hint="default"/>
+      </w:rPr>
+    </w:lvl>
+    <w:lvl w:ilvl="4" w:tplc="40090003" w:tentative="1">
+      <w:start w:val="1"/>
+      <w:numFmt w:val="bullet"/>
+      <w:lvlText w:val="o"/>
+      <w:lvlJc w:val="left"/>
+      <w:pPr>
+        <w:ind w:left="3772" w:hanging="360"/>
+      </w:pPr>
+      <w:rPr>
+        <w:rFonts w:ascii="Courier New" w:hAnsi="Courier New" w:cs="Courier New" w:hint="default"/>
+      </w:rPr>
+    </w:lvl>
+    <w:lvl w:ilvl="5" w:tplc="40090005" w:tentative="1">
+      <w:start w:val="1"/>
+      <w:numFmt w:val="bullet"/>
+      <w:lvlText w:val=""/>
+      <w:lvlJc w:val="left"/>
+      <w:pPr>
+        <w:ind w:left="4492" w:hanging="360"/>
+      </w:pPr>
+      <w:rPr>
+        <w:rFonts w:ascii="Wingdings" w:hAnsi="Wingdings" w:hint="default"/>
+      </w:rPr>
+    </w:lvl>
+    <w:lvl w:ilvl="6" w:tplc="40090001" w:tentative="1">
+      <w:start w:val="1"/>
+      <w:numFmt w:val="bullet"/>
+      <w:lvlText w:val=""/>
+      <w:lvlJc w:val="left"/>
+      <w:pPr>
+        <w:ind w:left="5212" w:hanging="360"/>
+      </w:pPr>
+      <w:rPr>
+        <w:rFonts w:ascii="Symbol" w:hAnsi="Symbol" w:hint="default"/>
+      </w:rPr>
+    </w:lvl>
+    <w:lvl w:ilvl="7" w:tplc="40090003" w:tentative="1">
+      <w:start w:val="1"/>
+      <w:numFmt w:val="bullet"/>
+      <w:lvlText w:val="o"/>
+      <w:lvlJc w:val="left"/>
+      <w:pPr>
+        <w:ind w:left="5932" w:hanging="360"/>
+      </w:pPr>
+      <w:rPr>
+        <w:rFonts w:ascii="Courier New" w:hAnsi="Courier New" w:cs="Courier New" w:hint="default"/>
+      </w:rPr>
+    </w:lvl>
+    <w:lvl w:ilvl="8" w:tplc="40090005" w:tentative="1">
+      <w:start w:val="1"/>
+      <w:numFmt w:val="bullet"/>
+      <w:lvlText w:val=""/>
+      <w:lvlJc w:val="left"/>
+      <w:pPr>
+        <w:ind w:left="6652" w:hanging="360"/>
+      </w:pPr>
+      <w:rPr>
+        <w:rFonts w:ascii="Wingdings" w:hAnsi="Wingdings" w:hint="default"/>
+      </w:rPr>
+    </w:lvl>
+  </w:abstractNum>
+  <w:abstractNum w:abstractNumId="22" w15:restartNumberingAfterBreak="0">
     <w:nsid w:val="6A243CC8"/>
     <w:multiLevelType w:val="hybridMultilevel"/>
     <w:tmpl w:val="93C09958"/>
@@ -20704,7 +22114,7 @@
       </w:pPr>
     </w:lvl>
   </w:abstractNum>
-  <w:abstractNum w:abstractNumId="16" w15:restartNumberingAfterBreak="0">
+  <w:abstractNum w:abstractNumId="23" w15:restartNumberingAfterBreak="0">
     <w:nsid w:val="7D046607"/>
     <w:multiLevelType w:val="hybridMultilevel"/>
     <w:tmpl w:val="9F6EDEAE"/>
@@ -20817,7 +22227,7 @@
       </w:rPr>
     </w:lvl>
   </w:abstractNum>
-  <w:abstractNum w:abstractNumId="17" w15:restartNumberingAfterBreak="0">
+  <w:abstractNum w:abstractNumId="24" w15:restartNumberingAfterBreak="0">
     <w:nsid w:val="7EB7003E"/>
     <w:multiLevelType w:val="hybridMultilevel"/>
     <w:tmpl w:val="08AC3004"/>
@@ -20931,58 +22341,107 @@
     </w:lvl>
   </w:abstractNum>
   <w:num w:numId="1" w16cid:durableId="281499544">
+    <w:abstractNumId w:val="4"/>
+  </w:num>
+  <w:num w:numId="2" w16cid:durableId="1757097135">
+    <w:abstractNumId w:val="23"/>
+  </w:num>
+  <w:num w:numId="3" w16cid:durableId="1571501932">
+    <w:abstractNumId w:val="24"/>
+  </w:num>
+  <w:num w:numId="4" w16cid:durableId="2018195054">
+    <w:abstractNumId w:val="22"/>
+  </w:num>
+  <w:num w:numId="5" w16cid:durableId="1544295697">
     <w:abstractNumId w:val="2"/>
   </w:num>
-  <w:num w:numId="2" w16cid:durableId="1757097135">
+  <w:num w:numId="6" w16cid:durableId="194969601">
+    <w:abstractNumId w:val="19"/>
+  </w:num>
+  <w:num w:numId="7" w16cid:durableId="118887770">
+    <w:abstractNumId w:val="20"/>
+  </w:num>
+  <w:num w:numId="8" w16cid:durableId="1372149854">
     <w:abstractNumId w:val="16"/>
   </w:num>
-  <w:num w:numId="3" w16cid:durableId="1571501932">
+  <w:num w:numId="9" w16cid:durableId="745034567">
+    <w:abstractNumId w:val="1"/>
+  </w:num>
+  <w:num w:numId="10" w16cid:durableId="893465931">
+    <w:abstractNumId w:val="15"/>
+  </w:num>
+  <w:num w:numId="11" w16cid:durableId="545877646">
+    <w:abstractNumId w:val="10"/>
+  </w:num>
+  <w:num w:numId="12" w16cid:durableId="1388142475">
+    <w:abstractNumId w:val="7"/>
+  </w:num>
+  <w:num w:numId="13" w16cid:durableId="190388290">
+    <w:abstractNumId w:val="6"/>
+  </w:num>
+  <w:num w:numId="14" w16cid:durableId="495262781">
     <w:abstractNumId w:val="17"/>
   </w:num>
-  <w:num w:numId="4" w16cid:durableId="2018195054">
-    <w:abstractNumId w:val="15"/>
+  <w:num w:numId="15" w16cid:durableId="933435646">
+    <w:abstractNumId w:val="8"/>
   </w:num>
-  <w:num w:numId="5" w16cid:durableId="1544295697">
-    <w:abstractNumId w:val="1"/>
+  <w:num w:numId="16" w16cid:durableId="1933512954">
+    <w:abstractNumId w:val="21"/>
   </w:num>
-  <w:num w:numId="6" w16cid:durableId="194969601">
+  <w:num w:numId="17" w16cid:durableId="1030106512">
+    <w:abstractNumId w:val="9"/>
+  </w:num>
+  <w:num w:numId="18" w16cid:durableId="364788904">
     <w:abstractNumId w:val="12"/>
   </w:num>
-  <w:num w:numId="7" w16cid:durableId="118887770">
+  <w:num w:numId="19" w16cid:durableId="60713558">
+    <w:abstractNumId w:val="14"/>
+  </w:num>
+  <w:num w:numId="20" w16cid:durableId="596786999">
+    <w:abstractNumId w:val="18"/>
+  </w:num>
+  <w:num w:numId="21" w16cid:durableId="1062947153">
+    <w:abstractNumId w:val="10"/>
+    <w:lvlOverride w:ilvl="0">
+      <w:startOverride w:val="1"/>
+    </w:lvlOverride>
+    <w:lvlOverride w:ilvl="1"/>
+    <w:lvlOverride w:ilvl="2">
+      <w:startOverride w:val="1"/>
+    </w:lvlOverride>
+    <w:lvlOverride w:ilvl="3">
+      <w:startOverride w:val="1"/>
+    </w:lvlOverride>
+    <w:lvlOverride w:ilvl="4">
+      <w:startOverride w:val="1"/>
+    </w:lvlOverride>
+    <w:lvlOverride w:ilvl="5">
+      <w:startOverride w:val="1"/>
+    </w:lvlOverride>
+    <w:lvlOverride w:ilvl="6">
+      <w:startOverride w:val="1"/>
+    </w:lvlOverride>
+    <w:lvlOverride w:ilvl="7">
+      <w:startOverride w:val="1"/>
+    </w:lvlOverride>
+    <w:lvlOverride w:ilvl="8">
+      <w:startOverride w:val="1"/>
+    </w:lvlOverride>
+  </w:num>
+  <w:num w:numId="22" w16cid:durableId="2053453356">
+    <w:abstractNumId w:val="0"/>
+  </w:num>
+  <w:num w:numId="23" w16cid:durableId="1700276313">
+    <w:abstractNumId w:val="5"/>
+  </w:num>
+  <w:num w:numId="24" w16cid:durableId="1516533209">
     <w:abstractNumId w:val="13"/>
   </w:num>
-  <w:num w:numId="8" w16cid:durableId="1372149854">
-    <w:abstractNumId w:val="10"/>
-  </w:num>
-  <w:num w:numId="9" w16cid:durableId="745034567">
-    <w:abstractNumId w:val="0"/>
-  </w:num>
-  <w:num w:numId="10" w16cid:durableId="893465931">
-    <w:abstractNumId w:val="9"/>
-  </w:num>
-  <w:num w:numId="11" w16cid:durableId="545877646">
-    <w:abstractNumId w:val="7"/>
-  </w:num>
-  <w:num w:numId="12" w16cid:durableId="1388142475">
-    <w:abstractNumId w:val="4"/>
-  </w:num>
-  <w:num w:numId="13" w16cid:durableId="190388290">
+  <w:num w:numId="25" w16cid:durableId="709693131">
     <w:abstractNumId w:val="3"/>
   </w:num>
-  <w:num w:numId="14" w16cid:durableId="495262781">
+  <w:num w:numId="26" w16cid:durableId="1725443707">
     <w:abstractNumId w:val="11"/>
-  </w:num>
-  <w:num w:numId="15" w16cid:durableId="933435646">
-    <w:abstractNumId w:val="5"/>
-  </w:num>
-  <w:num w:numId="16" w16cid:durableId="1933512954">
-    <w:abstractNumId w:val="14"/>
-  </w:num>
-  <w:num w:numId="17" w16cid:durableId="1030106512">
-    <w:abstractNumId w:val="6"/>
-  </w:num>
-  <w:num w:numId="18" w16cid:durableId="364788904">
-    <w:abstractNumId w:val="8"/>
   </w:num>
 </w:numbering>
 </file>

</xml_diff>